<commit_message>
Update Word Answersheet borders, margins, and formatting
</commit_message>
<xml_diff>
--- a/OrthoNow_Assignment_Answersheet.docx
+++ b/OrthoNow_Assignment_Answersheet.docx
@@ -5,7 +5,7 @@
     <w:p>
       <w:pPr>
         <w:jc w:val="center"/>
-        <w:divId w:val="1509363935"/>
+        <w:divId w:val="429274215"/>
         <w:rPr>
           <w:rFonts w:ascii="Calibri" w:eastAsia="Times New Roman" w:hAnsi="Calibri" w:cs="Calibri"/>
           <w:b/>
@@ -32,7 +32,7 @@
     <w:p>
       <w:pPr>
         <w:jc w:val="center"/>
-        <w:divId w:val="976034702"/>
+        <w:divId w:val="1754819597"/>
         <w:rPr>
           <w:rFonts w:ascii="Calibri" w:eastAsia="Times New Roman" w:hAnsi="Calibri" w:cs="Calibri"/>
           <w:color w:val="475569"/>
@@ -55,20 +55,20 @@
     <w:p>
       <w:pPr>
         <w:jc w:val="center"/>
-        <w:divId w:val="993408356"/>
-        <w:rPr>
-          <w:rFonts w:ascii="Calibri" w:eastAsia="Times New Roman" w:hAnsi="Calibri" w:cs="Calibri"/>
-          <w:color w:val="333333"/>
-          <w:lang w:val="en"/>
-        </w:rPr>
-      </w:pPr>
-      <w:r>
-        <w:rPr>
-          <w:rFonts w:ascii="Calibri" w:eastAsia="Times New Roman" w:hAnsi="Calibri" w:cs="Calibri"/>
-          <w:color w:val="333333"/>
-          <w:lang w:val="en"/>
-        </w:rPr>
-        <w:pict w14:anchorId="1415E7D5">
+        <w:divId w:val="2050448313"/>
+        <w:rPr>
+          <w:rFonts w:ascii="Calibri" w:eastAsia="Times New Roman" w:hAnsi="Calibri" w:cs="Calibri"/>
+          <w:color w:val="333333"/>
+          <w:lang w:val="en"/>
+        </w:rPr>
+      </w:pPr>
+      <w:r>
+        <w:rPr>
+          <w:rFonts w:ascii="Calibri" w:eastAsia="Times New Roman" w:hAnsi="Calibri" w:cs="Calibri"/>
+          <w:color w:val="333333"/>
+          <w:lang w:val="en"/>
+        </w:rPr>
+        <w:pict w14:anchorId="125E508C">
           <v:rect id="_x0000_i1025" style="width:270.8pt;height:1.5pt" o:hrpct="600" o:hralign="center" o:hrstd="t" o:hr="t" fillcolor="#a0a0a0" stroked="f"/>
         </w:pict>
       </w:r>
@@ -76,8 +76,8 @@
     <w:p>
       <w:pPr>
         <w:pStyle w:val="text-center"/>
-        <w:spacing w:after="150"/>
-        <w:divId w:val="399594651"/>
+        <w:spacing w:after="120"/>
+        <w:divId w:val="1511333265"/>
         <w:rPr>
           <w:rFonts w:ascii="Calibri" w:hAnsi="Calibri" w:cs="Calibri"/>
           <w:color w:val="64748B"/>
@@ -105,8 +105,8 @@
     <w:p>
       <w:pPr>
         <w:pStyle w:val="text-center"/>
-        <w:spacing w:after="150"/>
-        <w:divId w:val="399594651"/>
+        <w:spacing w:after="120"/>
+        <w:divId w:val="1511333265"/>
         <w:rPr>
           <w:rFonts w:ascii="Calibri" w:hAnsi="Calibri" w:cs="Calibri"/>
           <w:color w:val="64748B"/>
@@ -134,8 +134,8 @@
     <w:p>
       <w:pPr>
         <w:pStyle w:val="text-center"/>
-        <w:spacing w:after="150"/>
-        <w:divId w:val="399594651"/>
+        <w:spacing w:after="120"/>
+        <w:divId w:val="1511333265"/>
         <w:rPr>
           <w:rFonts w:ascii="Calibri" w:hAnsi="Calibri" w:cs="Calibri"/>
           <w:color w:val="64748B"/>
@@ -163,7 +163,7 @@
     <w:p>
       <w:pPr>
         <w:pStyle w:val="Heading1"/>
-        <w:divId w:val="993408356"/>
+        <w:divId w:val="2050448313"/>
         <w:rPr>
           <w:rFonts w:ascii="Calibri" w:eastAsia="Times New Roman" w:hAnsi="Calibri" w:cs="Calibri"/>
           <w:lang w:val="en"/>
@@ -180,7 +180,7 @@
     <w:p>
       <w:pPr>
         <w:pStyle w:val="NormalWeb"/>
-        <w:divId w:val="993408356"/>
+        <w:divId w:val="2050448313"/>
         <w:rPr>
           <w:rFonts w:ascii="Calibri" w:hAnsi="Calibri" w:cs="Calibri"/>
           <w:color w:val="333333"/>
@@ -199,7 +199,7 @@
     <w:p>
       <w:pPr>
         <w:pStyle w:val="Heading2"/>
-        <w:divId w:val="993408356"/>
+        <w:divId w:val="2050448313"/>
         <w:rPr>
           <w:rFonts w:ascii="Calibri" w:eastAsia="Times New Roman" w:hAnsi="Calibri" w:cs="Calibri"/>
           <w:lang w:val="en"/>
@@ -216,6 +216,14 @@
     <w:tbl>
       <w:tblPr>
         <w:tblW w:w="5000" w:type="pct"/>
+        <w:tblBorders>
+          <w:top w:val="single" w:sz="4" w:space="0" w:color="CBD5E1"/>
+          <w:left w:val="single" w:sz="4" w:space="0" w:color="CBD5E1"/>
+          <w:bottom w:val="single" w:sz="4" w:space="0" w:color="CBD5E1"/>
+          <w:right w:val="single" w:sz="4" w:space="0" w:color="CBD5E1"/>
+          <w:insideH w:val="single" w:sz="4" w:space="0" w:color="CBD5E1"/>
+          <w:insideV w:val="single" w:sz="4" w:space="0" w:color="CBD5E1"/>
+        </w:tblBorders>
         <w:tblCellMar>
           <w:top w:w="15" w:type="dxa"/>
           <w:left w:w="15" w:type="dxa"/>
@@ -225,46 +233,40 @@
         <w:tblLook w:val="04A0" w:firstRow="1" w:lastRow="0" w:firstColumn="1" w:lastColumn="0" w:noHBand="0" w:noVBand="1"/>
       </w:tblPr>
       <w:tblGrid>
-        <w:gridCol w:w="2308"/>
-        <w:gridCol w:w="923"/>
-        <w:gridCol w:w="1351"/>
-        <w:gridCol w:w="2269"/>
-        <w:gridCol w:w="1354"/>
-        <w:gridCol w:w="1439"/>
+        <w:gridCol w:w="2492"/>
+        <w:gridCol w:w="971"/>
+        <w:gridCol w:w="1496"/>
+        <w:gridCol w:w="2455"/>
+        <w:gridCol w:w="1455"/>
+        <w:gridCol w:w="1587"/>
       </w:tblGrid>
       <w:tr>
         <w:trPr>
-          <w:divId w:val="993408356"/>
+          <w:divId w:val="2050448313"/>
           <w:tblHeader/>
         </w:trPr>
         <w:tc>
           <w:tcPr>
-            <w:tcW w:w="0" w:type="auto"/>
-            <w:tcBorders>
-              <w:top w:val="single" w:sz="6" w:space="0" w:color="CBD5E1"/>
-              <w:left w:val="single" w:sz="6" w:space="0" w:color="CBD5E1"/>
-              <w:bottom w:val="single" w:sz="6" w:space="0" w:color="CBD5E1"/>
-              <w:right w:val="single" w:sz="6" w:space="0" w:color="CBD5E1"/>
-            </w:tcBorders>
+            <w:tcW w:w="1191" w:type="pct"/>
             <w:shd w:val="clear" w:color="auto" w:fill="F1F5F9"/>
             <w:tcMar>
-              <w:top w:w="120" w:type="dxa"/>
-              <w:left w:w="150" w:type="dxa"/>
-              <w:bottom w:w="120" w:type="dxa"/>
-              <w:right w:w="150" w:type="dxa"/>
+              <w:top w:w="90" w:type="dxa"/>
+              <w:left w:w="120" w:type="dxa"/>
+              <w:bottom w:w="90" w:type="dxa"/>
+              <w:right w:w="120" w:type="dxa"/>
             </w:tcMar>
             <w:hideMark/>
           </w:tcPr>
           <w:p>
             <w:pPr>
-              <w:spacing w:before="300" w:after="300"/>
+              <w:spacing w:before="225" w:after="225"/>
               <w:rPr>
                 <w:rFonts w:ascii="Calibri" w:eastAsia="Times New Roman" w:hAnsi="Calibri" w:cs="Calibri"/>
                 <w:b/>
                 <w:bCs/>
                 <w:color w:val="1E3A8A"/>
-                <w:sz w:val="20"/>
-                <w:szCs w:val="20"/>
+                <w:sz w:val="19"/>
+                <w:szCs w:val="19"/>
               </w:rPr>
             </w:pPr>
             <w:r>
@@ -273,8 +275,8 @@
                 <w:b/>
                 <w:bCs/>
                 <w:color w:val="1E3A8A"/>
-                <w:sz w:val="20"/>
-                <w:szCs w:val="20"/>
+                <w:sz w:val="19"/>
+                <w:szCs w:val="19"/>
               </w:rPr>
               <w:lastRenderedPageBreak/>
               <w:t>Event Name</w:t>
@@ -283,32 +285,26 @@
         </w:tc>
         <w:tc>
           <w:tcPr>
-            <w:tcW w:w="0" w:type="auto"/>
-            <w:tcBorders>
-              <w:top w:val="single" w:sz="6" w:space="0" w:color="CBD5E1"/>
-              <w:left w:val="single" w:sz="6" w:space="0" w:color="CBD5E1"/>
-              <w:bottom w:val="single" w:sz="6" w:space="0" w:color="CBD5E1"/>
-              <w:right w:val="single" w:sz="6" w:space="0" w:color="CBD5E1"/>
-            </w:tcBorders>
+            <w:tcW w:w="464" w:type="pct"/>
             <w:shd w:val="clear" w:color="auto" w:fill="F1F5F9"/>
             <w:tcMar>
-              <w:top w:w="120" w:type="dxa"/>
-              <w:left w:w="150" w:type="dxa"/>
-              <w:bottom w:w="120" w:type="dxa"/>
-              <w:right w:w="150" w:type="dxa"/>
+              <w:top w:w="90" w:type="dxa"/>
+              <w:left w:w="120" w:type="dxa"/>
+              <w:bottom w:w="90" w:type="dxa"/>
+              <w:right w:w="120" w:type="dxa"/>
             </w:tcMar>
             <w:hideMark/>
           </w:tcPr>
           <w:p>
             <w:pPr>
-              <w:spacing w:before="300" w:after="300"/>
+              <w:spacing w:before="225" w:after="225"/>
               <w:rPr>
                 <w:rFonts w:ascii="Calibri" w:eastAsia="Times New Roman" w:hAnsi="Calibri" w:cs="Calibri"/>
                 <w:b/>
                 <w:bCs/>
                 <w:color w:val="1E3A8A"/>
-                <w:sz w:val="20"/>
-                <w:szCs w:val="20"/>
+                <w:sz w:val="19"/>
+                <w:szCs w:val="19"/>
               </w:rPr>
             </w:pPr>
             <w:r>
@@ -317,8 +313,8 @@
                 <w:b/>
                 <w:bCs/>
                 <w:color w:val="1E3A8A"/>
-                <w:sz w:val="20"/>
-                <w:szCs w:val="20"/>
+                <w:sz w:val="19"/>
+                <w:szCs w:val="19"/>
               </w:rPr>
               <w:t>Trigger Type</w:t>
             </w:r>
@@ -326,32 +322,26 @@
         </w:tc>
         <w:tc>
           <w:tcPr>
-            <w:tcW w:w="0" w:type="auto"/>
-            <w:tcBorders>
-              <w:top w:val="single" w:sz="6" w:space="0" w:color="CBD5E1"/>
-              <w:left w:val="single" w:sz="6" w:space="0" w:color="CBD5E1"/>
-              <w:bottom w:val="single" w:sz="6" w:space="0" w:color="CBD5E1"/>
-              <w:right w:val="single" w:sz="6" w:space="0" w:color="CBD5E1"/>
-            </w:tcBorders>
+            <w:tcW w:w="715" w:type="pct"/>
             <w:shd w:val="clear" w:color="auto" w:fill="F1F5F9"/>
             <w:tcMar>
-              <w:top w:w="120" w:type="dxa"/>
-              <w:left w:w="150" w:type="dxa"/>
-              <w:bottom w:w="120" w:type="dxa"/>
-              <w:right w:w="150" w:type="dxa"/>
+              <w:top w:w="90" w:type="dxa"/>
+              <w:left w:w="120" w:type="dxa"/>
+              <w:bottom w:w="90" w:type="dxa"/>
+              <w:right w:w="120" w:type="dxa"/>
             </w:tcMar>
             <w:hideMark/>
           </w:tcPr>
           <w:p>
             <w:pPr>
-              <w:spacing w:before="300" w:after="300"/>
+              <w:spacing w:before="225" w:after="225"/>
               <w:rPr>
                 <w:rFonts w:ascii="Calibri" w:eastAsia="Times New Roman" w:hAnsi="Calibri" w:cs="Calibri"/>
                 <w:b/>
                 <w:bCs/>
                 <w:color w:val="1E3A8A"/>
-                <w:sz w:val="20"/>
-                <w:szCs w:val="20"/>
+                <w:sz w:val="19"/>
+                <w:szCs w:val="19"/>
               </w:rPr>
             </w:pPr>
             <w:r>
@@ -360,8 +350,8 @@
                 <w:b/>
                 <w:bCs/>
                 <w:color w:val="1E3A8A"/>
-                <w:sz w:val="20"/>
-                <w:szCs w:val="20"/>
+                <w:sz w:val="19"/>
+                <w:szCs w:val="19"/>
               </w:rPr>
               <w:t>Event Description</w:t>
             </w:r>
@@ -369,32 +359,26 @@
         </w:tc>
         <w:tc>
           <w:tcPr>
-            <w:tcW w:w="0" w:type="auto"/>
-            <w:tcBorders>
-              <w:top w:val="single" w:sz="6" w:space="0" w:color="CBD5E1"/>
-              <w:left w:val="single" w:sz="6" w:space="0" w:color="CBD5E1"/>
-              <w:bottom w:val="single" w:sz="6" w:space="0" w:color="CBD5E1"/>
-              <w:right w:val="single" w:sz="6" w:space="0" w:color="CBD5E1"/>
-            </w:tcBorders>
+            <w:tcW w:w="1174" w:type="pct"/>
             <w:shd w:val="clear" w:color="auto" w:fill="F1F5F9"/>
             <w:tcMar>
-              <w:top w:w="120" w:type="dxa"/>
-              <w:left w:w="150" w:type="dxa"/>
-              <w:bottom w:w="120" w:type="dxa"/>
-              <w:right w:w="150" w:type="dxa"/>
+              <w:top w:w="90" w:type="dxa"/>
+              <w:left w:w="120" w:type="dxa"/>
+              <w:bottom w:w="90" w:type="dxa"/>
+              <w:right w:w="120" w:type="dxa"/>
             </w:tcMar>
             <w:hideMark/>
           </w:tcPr>
           <w:p>
             <w:pPr>
-              <w:spacing w:before="300" w:after="300"/>
+              <w:spacing w:before="225" w:after="225"/>
               <w:rPr>
                 <w:rFonts w:ascii="Calibri" w:eastAsia="Times New Roman" w:hAnsi="Calibri" w:cs="Calibri"/>
                 <w:b/>
                 <w:bCs/>
                 <w:color w:val="1E3A8A"/>
-                <w:sz w:val="20"/>
-                <w:szCs w:val="20"/>
+                <w:sz w:val="19"/>
+                <w:szCs w:val="19"/>
               </w:rPr>
             </w:pPr>
             <w:r>
@@ -403,8 +387,8 @@
                 <w:b/>
                 <w:bCs/>
                 <w:color w:val="1E3A8A"/>
-                <w:sz w:val="20"/>
-                <w:szCs w:val="20"/>
+                <w:sz w:val="19"/>
+                <w:szCs w:val="19"/>
               </w:rPr>
               <w:t>Key Parameters</w:t>
             </w:r>
@@ -412,32 +396,26 @@
         </w:tc>
         <w:tc>
           <w:tcPr>
-            <w:tcW w:w="0" w:type="auto"/>
-            <w:tcBorders>
-              <w:top w:val="single" w:sz="6" w:space="0" w:color="CBD5E1"/>
-              <w:left w:val="single" w:sz="6" w:space="0" w:color="CBD5E1"/>
-              <w:bottom w:val="single" w:sz="6" w:space="0" w:color="CBD5E1"/>
-              <w:right w:val="single" w:sz="6" w:space="0" w:color="CBD5E1"/>
-            </w:tcBorders>
+            <w:tcW w:w="696" w:type="pct"/>
             <w:shd w:val="clear" w:color="auto" w:fill="F1F5F9"/>
             <w:tcMar>
-              <w:top w:w="120" w:type="dxa"/>
-              <w:left w:w="150" w:type="dxa"/>
-              <w:bottom w:w="120" w:type="dxa"/>
-              <w:right w:w="150" w:type="dxa"/>
+              <w:top w:w="90" w:type="dxa"/>
+              <w:left w:w="120" w:type="dxa"/>
+              <w:bottom w:w="90" w:type="dxa"/>
+              <w:right w:w="120" w:type="dxa"/>
             </w:tcMar>
             <w:hideMark/>
           </w:tcPr>
           <w:p>
             <w:pPr>
-              <w:spacing w:before="300" w:after="300"/>
+              <w:spacing w:before="225" w:after="225"/>
               <w:rPr>
                 <w:rFonts w:ascii="Calibri" w:eastAsia="Times New Roman" w:hAnsi="Calibri" w:cs="Calibri"/>
                 <w:b/>
                 <w:bCs/>
                 <w:color w:val="1E3A8A"/>
-                <w:sz w:val="20"/>
-                <w:szCs w:val="20"/>
+                <w:sz w:val="19"/>
+                <w:szCs w:val="19"/>
               </w:rPr>
             </w:pPr>
             <w:r>
@@ -446,8 +424,8 @@
                 <w:b/>
                 <w:bCs/>
                 <w:color w:val="1E3A8A"/>
-                <w:sz w:val="20"/>
-                <w:szCs w:val="20"/>
+                <w:sz w:val="19"/>
+                <w:szCs w:val="19"/>
               </w:rPr>
               <w:t>GA4 Report / Audience</w:t>
             </w:r>
@@ -455,32 +433,26 @@
         </w:tc>
         <w:tc>
           <w:tcPr>
-            <w:tcW w:w="0" w:type="auto"/>
-            <w:tcBorders>
-              <w:top w:val="single" w:sz="6" w:space="0" w:color="CBD5E1"/>
-              <w:left w:val="single" w:sz="6" w:space="0" w:color="CBD5E1"/>
-              <w:bottom w:val="single" w:sz="6" w:space="0" w:color="CBD5E1"/>
-              <w:right w:val="single" w:sz="6" w:space="0" w:color="CBD5E1"/>
-            </w:tcBorders>
+            <w:tcW w:w="759" w:type="pct"/>
             <w:shd w:val="clear" w:color="auto" w:fill="F1F5F9"/>
             <w:tcMar>
-              <w:top w:w="120" w:type="dxa"/>
-              <w:left w:w="150" w:type="dxa"/>
-              <w:bottom w:w="120" w:type="dxa"/>
-              <w:right w:w="150" w:type="dxa"/>
+              <w:top w:w="90" w:type="dxa"/>
+              <w:left w:w="120" w:type="dxa"/>
+              <w:bottom w:w="90" w:type="dxa"/>
+              <w:right w:w="120" w:type="dxa"/>
             </w:tcMar>
             <w:hideMark/>
           </w:tcPr>
           <w:p>
             <w:pPr>
-              <w:spacing w:before="300" w:after="300"/>
+              <w:spacing w:before="225" w:after="225"/>
               <w:rPr>
                 <w:rFonts w:ascii="Calibri" w:eastAsia="Times New Roman" w:hAnsi="Calibri" w:cs="Calibri"/>
                 <w:b/>
                 <w:bCs/>
                 <w:color w:val="1E3A8A"/>
-                <w:sz w:val="20"/>
-                <w:szCs w:val="20"/>
+                <w:sz w:val="19"/>
+                <w:szCs w:val="19"/>
               </w:rPr>
             </w:pPr>
             <w:r>
@@ -489,8 +461,8 @@
                 <w:b/>
                 <w:bCs/>
                 <w:color w:val="1E3A8A"/>
-                <w:sz w:val="20"/>
-                <w:szCs w:val="20"/>
+                <w:sz w:val="19"/>
+                <w:szCs w:val="19"/>
               </w:rPr>
               <w:t>Business Purpose</w:t>
             </w:r>
@@ -499,33 +471,27 @@
       </w:tr>
       <w:tr>
         <w:trPr>
-          <w:divId w:val="993408356"/>
+          <w:divId w:val="2050448313"/>
         </w:trPr>
         <w:tc>
           <w:tcPr>
-            <w:tcW w:w="0" w:type="auto"/>
-            <w:tcBorders>
-              <w:top w:val="single" w:sz="6" w:space="0" w:color="CBD5E1"/>
-              <w:left w:val="single" w:sz="6" w:space="0" w:color="CBD5E1"/>
-              <w:bottom w:val="single" w:sz="6" w:space="0" w:color="CBD5E1"/>
-              <w:right w:val="single" w:sz="6" w:space="0" w:color="CBD5E1"/>
-            </w:tcBorders>
+            <w:tcW w:w="1191" w:type="pct"/>
             <w:tcMar>
-              <w:top w:w="120" w:type="dxa"/>
-              <w:left w:w="150" w:type="dxa"/>
-              <w:bottom w:w="120" w:type="dxa"/>
-              <w:right w:w="150" w:type="dxa"/>
+              <w:top w:w="90" w:type="dxa"/>
+              <w:left w:w="120" w:type="dxa"/>
+              <w:bottom w:w="90" w:type="dxa"/>
+              <w:right w:w="120" w:type="dxa"/>
             </w:tcMar>
             <w:hideMark/>
           </w:tcPr>
           <w:p>
             <w:pPr>
-              <w:spacing w:before="300" w:after="300"/>
-              <w:rPr>
-                <w:rFonts w:ascii="Calibri" w:eastAsia="Times New Roman" w:hAnsi="Calibri" w:cs="Calibri"/>
-                <w:color w:val="333333"/>
-                <w:sz w:val="20"/>
-                <w:szCs w:val="20"/>
+              <w:spacing w:before="225" w:after="225"/>
+              <w:rPr>
+                <w:rFonts w:ascii="Calibri" w:eastAsia="Times New Roman" w:hAnsi="Calibri" w:cs="Calibri"/>
+                <w:color w:val="333333"/>
+                <w:sz w:val="19"/>
+                <w:szCs w:val="19"/>
               </w:rPr>
             </w:pPr>
             <w:r>
@@ -533,8 +499,8 @@
                 <w:rStyle w:val="Strong"/>
                 <w:rFonts w:ascii="Calibri" w:eastAsia="Times New Roman" w:hAnsi="Calibri" w:cs="Calibri"/>
                 <w:color w:val="333333"/>
-                <w:sz w:val="20"/>
-                <w:szCs w:val="20"/>
+                <w:sz w:val="19"/>
+                <w:szCs w:val="19"/>
               </w:rPr>
               <w:t>booking_form_start</w:t>
             </w:r>
@@ -542,37 +508,31 @@
         </w:tc>
         <w:tc>
           <w:tcPr>
-            <w:tcW w:w="0" w:type="auto"/>
-            <w:tcBorders>
-              <w:top w:val="single" w:sz="6" w:space="0" w:color="CBD5E1"/>
-              <w:left w:val="single" w:sz="6" w:space="0" w:color="CBD5E1"/>
-              <w:bottom w:val="single" w:sz="6" w:space="0" w:color="CBD5E1"/>
-              <w:right w:val="single" w:sz="6" w:space="0" w:color="CBD5E1"/>
-            </w:tcBorders>
+            <w:tcW w:w="464" w:type="pct"/>
             <w:tcMar>
-              <w:top w:w="120" w:type="dxa"/>
-              <w:left w:w="150" w:type="dxa"/>
-              <w:bottom w:w="120" w:type="dxa"/>
-              <w:right w:w="150" w:type="dxa"/>
+              <w:top w:w="90" w:type="dxa"/>
+              <w:left w:w="120" w:type="dxa"/>
+              <w:bottom w:w="90" w:type="dxa"/>
+              <w:right w:w="120" w:type="dxa"/>
             </w:tcMar>
             <w:hideMark/>
           </w:tcPr>
           <w:p>
             <w:pPr>
-              <w:spacing w:before="300" w:after="300"/>
-              <w:rPr>
-                <w:rFonts w:ascii="Calibri" w:eastAsia="Times New Roman" w:hAnsi="Calibri" w:cs="Calibri"/>
-                <w:color w:val="333333"/>
-                <w:sz w:val="20"/>
-                <w:szCs w:val="20"/>
+              <w:spacing w:before="225" w:after="225"/>
+              <w:rPr>
+                <w:rFonts w:ascii="Calibri" w:eastAsia="Times New Roman" w:hAnsi="Calibri" w:cs="Calibri"/>
+                <w:color w:val="333333"/>
+                <w:sz w:val="19"/>
+                <w:szCs w:val="19"/>
               </w:rPr>
             </w:pPr>
             <w:r>
               <w:rPr>
                 <w:rFonts w:ascii="Calibri" w:eastAsia="Times New Roman" w:hAnsi="Calibri" w:cs="Calibri"/>
                 <w:color w:val="333333"/>
-                <w:sz w:val="20"/>
-                <w:szCs w:val="20"/>
+                <w:sz w:val="19"/>
+                <w:szCs w:val="19"/>
               </w:rPr>
               <w:t>Custom Event</w:t>
             </w:r>
@@ -580,37 +540,31 @@
         </w:tc>
         <w:tc>
           <w:tcPr>
-            <w:tcW w:w="0" w:type="auto"/>
-            <w:tcBorders>
-              <w:top w:val="single" w:sz="6" w:space="0" w:color="CBD5E1"/>
-              <w:left w:val="single" w:sz="6" w:space="0" w:color="CBD5E1"/>
-              <w:bottom w:val="single" w:sz="6" w:space="0" w:color="CBD5E1"/>
-              <w:right w:val="single" w:sz="6" w:space="0" w:color="CBD5E1"/>
-            </w:tcBorders>
+            <w:tcW w:w="715" w:type="pct"/>
             <w:tcMar>
-              <w:top w:w="120" w:type="dxa"/>
-              <w:left w:w="150" w:type="dxa"/>
-              <w:bottom w:w="120" w:type="dxa"/>
-              <w:right w:w="150" w:type="dxa"/>
+              <w:top w:w="90" w:type="dxa"/>
+              <w:left w:w="120" w:type="dxa"/>
+              <w:bottom w:w="90" w:type="dxa"/>
+              <w:right w:w="120" w:type="dxa"/>
             </w:tcMar>
             <w:hideMark/>
           </w:tcPr>
           <w:p>
             <w:pPr>
-              <w:spacing w:before="300" w:after="300"/>
-              <w:rPr>
-                <w:rFonts w:ascii="Calibri" w:eastAsia="Times New Roman" w:hAnsi="Calibri" w:cs="Calibri"/>
-                <w:color w:val="333333"/>
-                <w:sz w:val="20"/>
-                <w:szCs w:val="20"/>
+              <w:spacing w:before="225" w:after="225"/>
+              <w:rPr>
+                <w:rFonts w:ascii="Calibri" w:eastAsia="Times New Roman" w:hAnsi="Calibri" w:cs="Calibri"/>
+                <w:color w:val="333333"/>
+                <w:sz w:val="19"/>
+                <w:szCs w:val="19"/>
               </w:rPr>
             </w:pPr>
             <w:r>
               <w:rPr>
                 <w:rFonts w:ascii="Calibri" w:eastAsia="Times New Roman" w:hAnsi="Calibri" w:cs="Calibri"/>
                 <w:color w:val="333333"/>
-                <w:sz w:val="20"/>
-                <w:szCs w:val="20"/>
+                <w:sz w:val="19"/>
+                <w:szCs w:val="19"/>
               </w:rPr>
               <w:t>Fires when a user interacts with the first field in the booking form.</w:t>
             </w:r>
@@ -618,37 +572,31 @@
         </w:tc>
         <w:tc>
           <w:tcPr>
-            <w:tcW w:w="0" w:type="auto"/>
-            <w:tcBorders>
-              <w:top w:val="single" w:sz="6" w:space="0" w:color="CBD5E1"/>
-              <w:left w:val="single" w:sz="6" w:space="0" w:color="CBD5E1"/>
-              <w:bottom w:val="single" w:sz="6" w:space="0" w:color="CBD5E1"/>
-              <w:right w:val="single" w:sz="6" w:space="0" w:color="CBD5E1"/>
-            </w:tcBorders>
+            <w:tcW w:w="1174" w:type="pct"/>
             <w:tcMar>
-              <w:top w:w="120" w:type="dxa"/>
-              <w:left w:w="150" w:type="dxa"/>
-              <w:bottom w:w="120" w:type="dxa"/>
-              <w:right w:w="150" w:type="dxa"/>
+              <w:top w:w="90" w:type="dxa"/>
+              <w:left w:w="120" w:type="dxa"/>
+              <w:bottom w:w="90" w:type="dxa"/>
+              <w:right w:w="120" w:type="dxa"/>
             </w:tcMar>
             <w:hideMark/>
           </w:tcPr>
           <w:p>
             <w:pPr>
-              <w:spacing w:before="300" w:after="300"/>
-              <w:rPr>
-                <w:rFonts w:ascii="Calibri" w:eastAsia="Times New Roman" w:hAnsi="Calibri" w:cs="Calibri"/>
-                <w:color w:val="333333"/>
-                <w:sz w:val="20"/>
-                <w:szCs w:val="20"/>
+              <w:spacing w:before="225" w:after="225"/>
+              <w:rPr>
+                <w:rFonts w:ascii="Calibri" w:eastAsia="Times New Roman" w:hAnsi="Calibri" w:cs="Calibri"/>
+                <w:color w:val="333333"/>
+                <w:sz w:val="19"/>
+                <w:szCs w:val="19"/>
               </w:rPr>
             </w:pPr>
             <w:r>
               <w:rPr>
                 <w:rFonts w:ascii="Calibri" w:eastAsia="Times New Roman" w:hAnsi="Calibri" w:cs="Calibri"/>
                 <w:color w:val="333333"/>
-                <w:sz w:val="20"/>
-                <w:szCs w:val="20"/>
+                <w:sz w:val="19"/>
+                <w:szCs w:val="19"/>
               </w:rPr>
               <w:t>form_id (string)</w:t>
             </w:r>
@@ -656,8 +604,8 @@
               <w:rPr>
                 <w:rFonts w:ascii="Calibri" w:eastAsia="Times New Roman" w:hAnsi="Calibri" w:cs="Calibri"/>
                 <w:color w:val="333333"/>
-                <w:sz w:val="20"/>
-                <w:szCs w:val="20"/>
+                <w:sz w:val="19"/>
+                <w:szCs w:val="19"/>
               </w:rPr>
               <w:br/>
               <w:t>form_name (string)</w:t>
@@ -666,8 +614,8 @@
               <w:rPr>
                 <w:rFonts w:ascii="Calibri" w:eastAsia="Times New Roman" w:hAnsi="Calibri" w:cs="Calibri"/>
                 <w:color w:val="333333"/>
-                <w:sz w:val="20"/>
-                <w:szCs w:val="20"/>
+                <w:sz w:val="19"/>
+                <w:szCs w:val="19"/>
               </w:rPr>
               <w:br/>
               <w:t>form_step_number (integer)</w:t>
@@ -676,37 +624,31 @@
         </w:tc>
         <w:tc>
           <w:tcPr>
-            <w:tcW w:w="0" w:type="auto"/>
-            <w:tcBorders>
-              <w:top w:val="single" w:sz="6" w:space="0" w:color="CBD5E1"/>
-              <w:left w:val="single" w:sz="6" w:space="0" w:color="CBD5E1"/>
-              <w:bottom w:val="single" w:sz="6" w:space="0" w:color="CBD5E1"/>
-              <w:right w:val="single" w:sz="6" w:space="0" w:color="CBD5E1"/>
-            </w:tcBorders>
+            <w:tcW w:w="696" w:type="pct"/>
             <w:tcMar>
-              <w:top w:w="120" w:type="dxa"/>
-              <w:left w:w="150" w:type="dxa"/>
-              <w:bottom w:w="120" w:type="dxa"/>
-              <w:right w:w="150" w:type="dxa"/>
+              <w:top w:w="90" w:type="dxa"/>
+              <w:left w:w="120" w:type="dxa"/>
+              <w:bottom w:w="90" w:type="dxa"/>
+              <w:right w:w="120" w:type="dxa"/>
             </w:tcMar>
             <w:hideMark/>
           </w:tcPr>
           <w:p>
             <w:pPr>
-              <w:spacing w:before="300" w:after="300"/>
-              <w:rPr>
-                <w:rFonts w:ascii="Calibri" w:eastAsia="Times New Roman" w:hAnsi="Calibri" w:cs="Calibri"/>
-                <w:color w:val="333333"/>
-                <w:sz w:val="20"/>
-                <w:szCs w:val="20"/>
+              <w:spacing w:before="225" w:after="225"/>
+              <w:rPr>
+                <w:rFonts w:ascii="Calibri" w:eastAsia="Times New Roman" w:hAnsi="Calibri" w:cs="Calibri"/>
+                <w:color w:val="333333"/>
+                <w:sz w:val="19"/>
+                <w:szCs w:val="19"/>
               </w:rPr>
             </w:pPr>
             <w:r>
               <w:rPr>
                 <w:rFonts w:ascii="Calibri" w:eastAsia="Times New Roman" w:hAnsi="Calibri" w:cs="Calibri"/>
                 <w:color w:val="333333"/>
-                <w:sz w:val="20"/>
-                <w:szCs w:val="20"/>
+                <w:sz w:val="19"/>
+                <w:szCs w:val="19"/>
               </w:rPr>
               <w:t>Funnel Exploration</w:t>
             </w:r>
@@ -714,8 +656,8 @@
               <w:rPr>
                 <w:rFonts w:ascii="Calibri" w:eastAsia="Times New Roman" w:hAnsi="Calibri" w:cs="Calibri"/>
                 <w:color w:val="333333"/>
-                <w:sz w:val="20"/>
-                <w:szCs w:val="20"/>
+                <w:sz w:val="19"/>
+                <w:szCs w:val="19"/>
               </w:rPr>
               <w:br/>
             </w:r>
@@ -724,8 +666,8 @@
                 <w:rStyle w:val="Strong"/>
                 <w:rFonts w:ascii="Calibri" w:eastAsia="Times New Roman" w:hAnsi="Calibri" w:cs="Calibri"/>
                 <w:color w:val="333333"/>
-                <w:sz w:val="20"/>
-                <w:szCs w:val="20"/>
+                <w:sz w:val="19"/>
+                <w:szCs w:val="19"/>
               </w:rPr>
               <w:t>Audience:</w:t>
             </w:r>
@@ -733,8 +675,8 @@
               <w:rPr>
                 <w:rFonts w:ascii="Calibri" w:eastAsia="Times New Roman" w:hAnsi="Calibri" w:cs="Calibri"/>
                 <w:color w:val="333333"/>
-                <w:sz w:val="20"/>
-                <w:szCs w:val="20"/>
+                <w:sz w:val="19"/>
+                <w:szCs w:val="19"/>
               </w:rPr>
               <w:t xml:space="preserve"> Active Form Starters</w:t>
             </w:r>
@@ -742,37 +684,31 @@
         </w:tc>
         <w:tc>
           <w:tcPr>
-            <w:tcW w:w="0" w:type="auto"/>
-            <w:tcBorders>
-              <w:top w:val="single" w:sz="6" w:space="0" w:color="CBD5E1"/>
-              <w:left w:val="single" w:sz="6" w:space="0" w:color="CBD5E1"/>
-              <w:bottom w:val="single" w:sz="6" w:space="0" w:color="CBD5E1"/>
-              <w:right w:val="single" w:sz="6" w:space="0" w:color="CBD5E1"/>
-            </w:tcBorders>
+            <w:tcW w:w="759" w:type="pct"/>
             <w:tcMar>
-              <w:top w:w="120" w:type="dxa"/>
-              <w:left w:w="150" w:type="dxa"/>
-              <w:bottom w:w="120" w:type="dxa"/>
-              <w:right w:w="150" w:type="dxa"/>
+              <w:top w:w="90" w:type="dxa"/>
+              <w:left w:w="120" w:type="dxa"/>
+              <w:bottom w:w="90" w:type="dxa"/>
+              <w:right w:w="120" w:type="dxa"/>
             </w:tcMar>
             <w:hideMark/>
           </w:tcPr>
           <w:p>
             <w:pPr>
-              <w:spacing w:before="300" w:after="300"/>
-              <w:rPr>
-                <w:rFonts w:ascii="Calibri" w:eastAsia="Times New Roman" w:hAnsi="Calibri" w:cs="Calibri"/>
-                <w:color w:val="333333"/>
-                <w:sz w:val="20"/>
-                <w:szCs w:val="20"/>
+              <w:spacing w:before="225" w:after="225"/>
+              <w:rPr>
+                <w:rFonts w:ascii="Calibri" w:eastAsia="Times New Roman" w:hAnsi="Calibri" w:cs="Calibri"/>
+                <w:color w:val="333333"/>
+                <w:sz w:val="19"/>
+                <w:szCs w:val="19"/>
               </w:rPr>
             </w:pPr>
             <w:r>
               <w:rPr>
                 <w:rFonts w:ascii="Calibri" w:eastAsia="Times New Roman" w:hAnsi="Calibri" w:cs="Calibri"/>
                 <w:color w:val="333333"/>
-                <w:sz w:val="20"/>
-                <w:szCs w:val="20"/>
+                <w:sz w:val="19"/>
+                <w:szCs w:val="19"/>
               </w:rPr>
               <w:t>Measures top-of-funnel initiation and form interaction engagement.</w:t>
             </w:r>
@@ -781,33 +717,27 @@
       </w:tr>
       <w:tr>
         <w:trPr>
-          <w:divId w:val="993408356"/>
+          <w:divId w:val="2050448313"/>
         </w:trPr>
         <w:tc>
           <w:tcPr>
-            <w:tcW w:w="0" w:type="auto"/>
-            <w:tcBorders>
-              <w:top w:val="single" w:sz="6" w:space="0" w:color="CBD5E1"/>
-              <w:left w:val="single" w:sz="6" w:space="0" w:color="CBD5E1"/>
-              <w:bottom w:val="single" w:sz="6" w:space="0" w:color="CBD5E1"/>
-              <w:right w:val="single" w:sz="6" w:space="0" w:color="CBD5E1"/>
-            </w:tcBorders>
+            <w:tcW w:w="1191" w:type="pct"/>
             <w:tcMar>
-              <w:top w:w="120" w:type="dxa"/>
-              <w:left w:w="150" w:type="dxa"/>
-              <w:bottom w:w="120" w:type="dxa"/>
-              <w:right w:w="150" w:type="dxa"/>
+              <w:top w:w="90" w:type="dxa"/>
+              <w:left w:w="120" w:type="dxa"/>
+              <w:bottom w:w="90" w:type="dxa"/>
+              <w:right w:w="120" w:type="dxa"/>
             </w:tcMar>
             <w:hideMark/>
           </w:tcPr>
           <w:p>
             <w:pPr>
-              <w:spacing w:before="300" w:after="300"/>
-              <w:rPr>
-                <w:rFonts w:ascii="Calibri" w:eastAsia="Times New Roman" w:hAnsi="Calibri" w:cs="Calibri"/>
-                <w:color w:val="333333"/>
-                <w:sz w:val="20"/>
-                <w:szCs w:val="20"/>
+              <w:spacing w:before="225" w:after="225"/>
+              <w:rPr>
+                <w:rFonts w:ascii="Calibri" w:eastAsia="Times New Roman" w:hAnsi="Calibri" w:cs="Calibri"/>
+                <w:color w:val="333333"/>
+                <w:sz w:val="19"/>
+                <w:szCs w:val="19"/>
               </w:rPr>
             </w:pPr>
             <w:r>
@@ -815,8 +745,8 @@
                 <w:rStyle w:val="Strong"/>
                 <w:rFonts w:ascii="Calibri" w:eastAsia="Times New Roman" w:hAnsi="Calibri" w:cs="Calibri"/>
                 <w:color w:val="333333"/>
-                <w:sz w:val="20"/>
-                <w:szCs w:val="20"/>
+                <w:sz w:val="19"/>
+                <w:szCs w:val="19"/>
               </w:rPr>
               <w:t>booking_step_complete</w:t>
             </w:r>
@@ -824,37 +754,31 @@
         </w:tc>
         <w:tc>
           <w:tcPr>
-            <w:tcW w:w="0" w:type="auto"/>
-            <w:tcBorders>
-              <w:top w:val="single" w:sz="6" w:space="0" w:color="CBD5E1"/>
-              <w:left w:val="single" w:sz="6" w:space="0" w:color="CBD5E1"/>
-              <w:bottom w:val="single" w:sz="6" w:space="0" w:color="CBD5E1"/>
-              <w:right w:val="single" w:sz="6" w:space="0" w:color="CBD5E1"/>
-            </w:tcBorders>
+            <w:tcW w:w="464" w:type="pct"/>
             <w:tcMar>
-              <w:top w:w="120" w:type="dxa"/>
-              <w:left w:w="150" w:type="dxa"/>
-              <w:bottom w:w="120" w:type="dxa"/>
-              <w:right w:w="150" w:type="dxa"/>
+              <w:top w:w="90" w:type="dxa"/>
+              <w:left w:w="120" w:type="dxa"/>
+              <w:bottom w:w="90" w:type="dxa"/>
+              <w:right w:w="120" w:type="dxa"/>
             </w:tcMar>
             <w:hideMark/>
           </w:tcPr>
           <w:p>
             <w:pPr>
-              <w:spacing w:before="300" w:after="300"/>
-              <w:rPr>
-                <w:rFonts w:ascii="Calibri" w:eastAsia="Times New Roman" w:hAnsi="Calibri" w:cs="Calibri"/>
-                <w:color w:val="333333"/>
-                <w:sz w:val="20"/>
-                <w:szCs w:val="20"/>
+              <w:spacing w:before="225" w:after="225"/>
+              <w:rPr>
+                <w:rFonts w:ascii="Calibri" w:eastAsia="Times New Roman" w:hAnsi="Calibri" w:cs="Calibri"/>
+                <w:color w:val="333333"/>
+                <w:sz w:val="19"/>
+                <w:szCs w:val="19"/>
               </w:rPr>
             </w:pPr>
             <w:r>
               <w:rPr>
                 <w:rFonts w:ascii="Calibri" w:eastAsia="Times New Roman" w:hAnsi="Calibri" w:cs="Calibri"/>
                 <w:color w:val="333333"/>
-                <w:sz w:val="20"/>
-                <w:szCs w:val="20"/>
+                <w:sz w:val="19"/>
+                <w:szCs w:val="19"/>
               </w:rPr>
               <w:t>Custom Event</w:t>
             </w:r>
@@ -862,37 +786,31 @@
         </w:tc>
         <w:tc>
           <w:tcPr>
-            <w:tcW w:w="0" w:type="auto"/>
-            <w:tcBorders>
-              <w:top w:val="single" w:sz="6" w:space="0" w:color="CBD5E1"/>
-              <w:left w:val="single" w:sz="6" w:space="0" w:color="CBD5E1"/>
-              <w:bottom w:val="single" w:sz="6" w:space="0" w:color="CBD5E1"/>
-              <w:right w:val="single" w:sz="6" w:space="0" w:color="CBD5E1"/>
-            </w:tcBorders>
+            <w:tcW w:w="715" w:type="pct"/>
             <w:tcMar>
-              <w:top w:w="120" w:type="dxa"/>
-              <w:left w:w="150" w:type="dxa"/>
-              <w:bottom w:w="120" w:type="dxa"/>
-              <w:right w:w="150" w:type="dxa"/>
+              <w:top w:w="90" w:type="dxa"/>
+              <w:left w:w="120" w:type="dxa"/>
+              <w:bottom w:w="90" w:type="dxa"/>
+              <w:right w:w="120" w:type="dxa"/>
             </w:tcMar>
             <w:hideMark/>
           </w:tcPr>
           <w:p>
             <w:pPr>
-              <w:spacing w:before="300" w:after="300"/>
-              <w:rPr>
-                <w:rFonts w:ascii="Calibri" w:eastAsia="Times New Roman" w:hAnsi="Calibri" w:cs="Calibri"/>
-                <w:color w:val="333333"/>
-                <w:sz w:val="20"/>
-                <w:szCs w:val="20"/>
+              <w:spacing w:before="225" w:after="225"/>
+              <w:rPr>
+                <w:rFonts w:ascii="Calibri" w:eastAsia="Times New Roman" w:hAnsi="Calibri" w:cs="Calibri"/>
+                <w:color w:val="333333"/>
+                <w:sz w:val="19"/>
+                <w:szCs w:val="19"/>
               </w:rPr>
             </w:pPr>
             <w:r>
               <w:rPr>
                 <w:rFonts w:ascii="Calibri" w:eastAsia="Times New Roman" w:hAnsi="Calibri" w:cs="Calibri"/>
                 <w:color w:val="333333"/>
-                <w:sz w:val="20"/>
-                <w:szCs w:val="20"/>
+                <w:sz w:val="19"/>
+                <w:szCs w:val="19"/>
               </w:rPr>
               <w:t>Fires upon successful validation and submission of steps 1 and 2 in the booking funnel.</w:t>
             </w:r>
@@ -900,37 +818,31 @@
         </w:tc>
         <w:tc>
           <w:tcPr>
-            <w:tcW w:w="0" w:type="auto"/>
-            <w:tcBorders>
-              <w:top w:val="single" w:sz="6" w:space="0" w:color="CBD5E1"/>
-              <w:left w:val="single" w:sz="6" w:space="0" w:color="CBD5E1"/>
-              <w:bottom w:val="single" w:sz="6" w:space="0" w:color="CBD5E1"/>
-              <w:right w:val="single" w:sz="6" w:space="0" w:color="CBD5E1"/>
-            </w:tcBorders>
+            <w:tcW w:w="1174" w:type="pct"/>
             <w:tcMar>
-              <w:top w:w="120" w:type="dxa"/>
-              <w:left w:w="150" w:type="dxa"/>
-              <w:bottom w:w="120" w:type="dxa"/>
-              <w:right w:w="150" w:type="dxa"/>
+              <w:top w:w="90" w:type="dxa"/>
+              <w:left w:w="120" w:type="dxa"/>
+              <w:bottom w:w="90" w:type="dxa"/>
+              <w:right w:w="120" w:type="dxa"/>
             </w:tcMar>
             <w:hideMark/>
           </w:tcPr>
           <w:p>
             <w:pPr>
-              <w:spacing w:before="300" w:after="300"/>
-              <w:rPr>
-                <w:rFonts w:ascii="Calibri" w:eastAsia="Times New Roman" w:hAnsi="Calibri" w:cs="Calibri"/>
-                <w:color w:val="333333"/>
-                <w:sz w:val="20"/>
-                <w:szCs w:val="20"/>
+              <w:spacing w:before="225" w:after="225"/>
+              <w:rPr>
+                <w:rFonts w:ascii="Calibri" w:eastAsia="Times New Roman" w:hAnsi="Calibri" w:cs="Calibri"/>
+                <w:color w:val="333333"/>
+                <w:sz w:val="19"/>
+                <w:szCs w:val="19"/>
               </w:rPr>
             </w:pPr>
             <w:r>
               <w:rPr>
                 <w:rFonts w:ascii="Calibri" w:eastAsia="Times New Roman" w:hAnsi="Calibri" w:cs="Calibri"/>
                 <w:color w:val="333333"/>
-                <w:sz w:val="20"/>
-                <w:szCs w:val="20"/>
+                <w:sz w:val="19"/>
+                <w:szCs w:val="19"/>
               </w:rPr>
               <w:t>form_id (string)</w:t>
             </w:r>
@@ -938,8 +850,8 @@
               <w:rPr>
                 <w:rFonts w:ascii="Calibri" w:eastAsia="Times New Roman" w:hAnsi="Calibri" w:cs="Calibri"/>
                 <w:color w:val="333333"/>
-                <w:sz w:val="20"/>
-                <w:szCs w:val="20"/>
+                <w:sz w:val="19"/>
+                <w:szCs w:val="19"/>
               </w:rPr>
               <w:br/>
               <w:t>step_number (integer)</w:t>
@@ -948,8 +860,8 @@
               <w:rPr>
                 <w:rFonts w:ascii="Calibri" w:eastAsia="Times New Roman" w:hAnsi="Calibri" w:cs="Calibri"/>
                 <w:color w:val="333333"/>
-                <w:sz w:val="20"/>
-                <w:szCs w:val="20"/>
+                <w:sz w:val="19"/>
+                <w:szCs w:val="19"/>
               </w:rPr>
               <w:br/>
               <w:t>step_name (string)</w:t>
@@ -958,8 +870,8 @@
               <w:rPr>
                 <w:rFonts w:ascii="Calibri" w:eastAsia="Times New Roman" w:hAnsi="Calibri" w:cs="Calibri"/>
                 <w:color w:val="333333"/>
-                <w:sz w:val="20"/>
-                <w:szCs w:val="20"/>
+                <w:sz w:val="19"/>
+                <w:szCs w:val="19"/>
               </w:rPr>
               <w:br/>
               <w:t>clinic_location (string)</w:t>
@@ -968,8 +880,8 @@
               <w:rPr>
                 <w:rFonts w:ascii="Calibri" w:eastAsia="Times New Roman" w:hAnsi="Calibri" w:cs="Calibri"/>
                 <w:color w:val="333333"/>
-                <w:sz w:val="20"/>
-                <w:szCs w:val="20"/>
+                <w:sz w:val="19"/>
+                <w:szCs w:val="19"/>
               </w:rPr>
               <w:br/>
               <w:t>specialty (string)</w:t>
@@ -978,37 +890,31 @@
         </w:tc>
         <w:tc>
           <w:tcPr>
-            <w:tcW w:w="0" w:type="auto"/>
-            <w:tcBorders>
-              <w:top w:val="single" w:sz="6" w:space="0" w:color="CBD5E1"/>
-              <w:left w:val="single" w:sz="6" w:space="0" w:color="CBD5E1"/>
-              <w:bottom w:val="single" w:sz="6" w:space="0" w:color="CBD5E1"/>
-              <w:right w:val="single" w:sz="6" w:space="0" w:color="CBD5E1"/>
-            </w:tcBorders>
+            <w:tcW w:w="696" w:type="pct"/>
             <w:tcMar>
-              <w:top w:w="120" w:type="dxa"/>
-              <w:left w:w="150" w:type="dxa"/>
-              <w:bottom w:w="120" w:type="dxa"/>
-              <w:right w:w="150" w:type="dxa"/>
+              <w:top w:w="90" w:type="dxa"/>
+              <w:left w:w="120" w:type="dxa"/>
+              <w:bottom w:w="90" w:type="dxa"/>
+              <w:right w:w="120" w:type="dxa"/>
             </w:tcMar>
             <w:hideMark/>
           </w:tcPr>
           <w:p>
             <w:pPr>
-              <w:spacing w:before="300" w:after="300"/>
-              <w:rPr>
-                <w:rFonts w:ascii="Calibri" w:eastAsia="Times New Roman" w:hAnsi="Calibri" w:cs="Calibri"/>
-                <w:color w:val="333333"/>
-                <w:sz w:val="20"/>
-                <w:szCs w:val="20"/>
+              <w:spacing w:before="225" w:after="225"/>
+              <w:rPr>
+                <w:rFonts w:ascii="Calibri" w:eastAsia="Times New Roman" w:hAnsi="Calibri" w:cs="Calibri"/>
+                <w:color w:val="333333"/>
+                <w:sz w:val="19"/>
+                <w:szCs w:val="19"/>
               </w:rPr>
             </w:pPr>
             <w:r>
               <w:rPr>
                 <w:rFonts w:ascii="Calibri" w:eastAsia="Times New Roman" w:hAnsi="Calibri" w:cs="Calibri"/>
                 <w:color w:val="333333"/>
-                <w:sz w:val="20"/>
-                <w:szCs w:val="20"/>
+                <w:sz w:val="19"/>
+                <w:szCs w:val="19"/>
               </w:rPr>
               <w:t>Funnel Exploration</w:t>
             </w:r>
@@ -1016,8 +922,8 @@
               <w:rPr>
                 <w:rFonts w:ascii="Calibri" w:eastAsia="Times New Roman" w:hAnsi="Calibri" w:cs="Calibri"/>
                 <w:color w:val="333333"/>
-                <w:sz w:val="20"/>
-                <w:szCs w:val="20"/>
+                <w:sz w:val="19"/>
+                <w:szCs w:val="19"/>
               </w:rPr>
               <w:br/>
             </w:r>
@@ -1026,8 +932,8 @@
                 <w:rStyle w:val="Strong"/>
                 <w:rFonts w:ascii="Calibri" w:eastAsia="Times New Roman" w:hAnsi="Calibri" w:cs="Calibri"/>
                 <w:color w:val="333333"/>
-                <w:sz w:val="20"/>
-                <w:szCs w:val="20"/>
+                <w:sz w:val="19"/>
+                <w:szCs w:val="19"/>
               </w:rPr>
               <w:t>Audience:</w:t>
             </w:r>
@@ -1035,8 +941,8 @@
               <w:rPr>
                 <w:rFonts w:ascii="Calibri" w:eastAsia="Times New Roman" w:hAnsi="Calibri" w:cs="Calibri"/>
                 <w:color w:val="333333"/>
-                <w:sz w:val="20"/>
-                <w:szCs w:val="20"/>
+                <w:sz w:val="19"/>
+                <w:szCs w:val="19"/>
               </w:rPr>
               <w:t xml:space="preserve"> Mid-Funnel Leads</w:t>
             </w:r>
@@ -1044,37 +950,31 @@
         </w:tc>
         <w:tc>
           <w:tcPr>
-            <w:tcW w:w="0" w:type="auto"/>
-            <w:tcBorders>
-              <w:top w:val="single" w:sz="6" w:space="0" w:color="CBD5E1"/>
-              <w:left w:val="single" w:sz="6" w:space="0" w:color="CBD5E1"/>
-              <w:bottom w:val="single" w:sz="6" w:space="0" w:color="CBD5E1"/>
-              <w:right w:val="single" w:sz="6" w:space="0" w:color="CBD5E1"/>
-            </w:tcBorders>
+            <w:tcW w:w="759" w:type="pct"/>
             <w:tcMar>
-              <w:top w:w="120" w:type="dxa"/>
-              <w:left w:w="150" w:type="dxa"/>
-              <w:bottom w:w="120" w:type="dxa"/>
-              <w:right w:w="150" w:type="dxa"/>
+              <w:top w:w="90" w:type="dxa"/>
+              <w:left w:w="120" w:type="dxa"/>
+              <w:bottom w:w="90" w:type="dxa"/>
+              <w:right w:w="120" w:type="dxa"/>
             </w:tcMar>
             <w:hideMark/>
           </w:tcPr>
           <w:p>
             <w:pPr>
-              <w:spacing w:before="300" w:after="300"/>
-              <w:rPr>
-                <w:rFonts w:ascii="Calibri" w:eastAsia="Times New Roman" w:hAnsi="Calibri" w:cs="Calibri"/>
-                <w:color w:val="333333"/>
-                <w:sz w:val="20"/>
-                <w:szCs w:val="20"/>
+              <w:spacing w:before="225" w:after="225"/>
+              <w:rPr>
+                <w:rFonts w:ascii="Calibri" w:eastAsia="Times New Roman" w:hAnsi="Calibri" w:cs="Calibri"/>
+                <w:color w:val="333333"/>
+                <w:sz w:val="19"/>
+                <w:szCs w:val="19"/>
               </w:rPr>
             </w:pPr>
             <w:r>
               <w:rPr>
                 <w:rFonts w:ascii="Calibri" w:eastAsia="Times New Roman" w:hAnsi="Calibri" w:cs="Calibri"/>
                 <w:color w:val="333333"/>
-                <w:sz w:val="20"/>
-                <w:szCs w:val="20"/>
+                <w:sz w:val="19"/>
+                <w:szCs w:val="19"/>
               </w:rPr>
               <w:t>Pinpoints drop-off locations within the multi-step booking process.</w:t>
             </w:r>
@@ -1083,33 +983,27 @@
       </w:tr>
       <w:tr>
         <w:trPr>
-          <w:divId w:val="993408356"/>
+          <w:divId w:val="2050448313"/>
         </w:trPr>
         <w:tc>
           <w:tcPr>
-            <w:tcW w:w="0" w:type="auto"/>
-            <w:tcBorders>
-              <w:top w:val="single" w:sz="6" w:space="0" w:color="CBD5E1"/>
-              <w:left w:val="single" w:sz="6" w:space="0" w:color="CBD5E1"/>
-              <w:bottom w:val="single" w:sz="6" w:space="0" w:color="CBD5E1"/>
-              <w:right w:val="single" w:sz="6" w:space="0" w:color="CBD5E1"/>
-            </w:tcBorders>
+            <w:tcW w:w="1191" w:type="pct"/>
             <w:tcMar>
-              <w:top w:w="120" w:type="dxa"/>
-              <w:left w:w="150" w:type="dxa"/>
-              <w:bottom w:w="120" w:type="dxa"/>
-              <w:right w:w="150" w:type="dxa"/>
+              <w:top w:w="90" w:type="dxa"/>
+              <w:left w:w="120" w:type="dxa"/>
+              <w:bottom w:w="90" w:type="dxa"/>
+              <w:right w:w="120" w:type="dxa"/>
             </w:tcMar>
             <w:hideMark/>
           </w:tcPr>
           <w:p>
             <w:pPr>
-              <w:spacing w:before="300" w:after="300"/>
-              <w:rPr>
-                <w:rFonts w:ascii="Calibri" w:eastAsia="Times New Roman" w:hAnsi="Calibri" w:cs="Calibri"/>
-                <w:color w:val="333333"/>
-                <w:sz w:val="20"/>
-                <w:szCs w:val="20"/>
+              <w:spacing w:before="225" w:after="225"/>
+              <w:rPr>
+                <w:rFonts w:ascii="Calibri" w:eastAsia="Times New Roman" w:hAnsi="Calibri" w:cs="Calibri"/>
+                <w:color w:val="333333"/>
+                <w:sz w:val="19"/>
+                <w:szCs w:val="19"/>
               </w:rPr>
             </w:pPr>
             <w:r>
@@ -1117,8 +1011,8 @@
                 <w:rStyle w:val="Strong"/>
                 <w:rFonts w:ascii="Calibri" w:eastAsia="Times New Roman" w:hAnsi="Calibri" w:cs="Calibri"/>
                 <w:color w:val="333333"/>
-                <w:sz w:val="20"/>
-                <w:szCs w:val="20"/>
+                <w:sz w:val="19"/>
+                <w:szCs w:val="19"/>
               </w:rPr>
               <w:t>booking_complete</w:t>
             </w:r>
@@ -1126,37 +1020,31 @@
         </w:tc>
         <w:tc>
           <w:tcPr>
-            <w:tcW w:w="0" w:type="auto"/>
-            <w:tcBorders>
-              <w:top w:val="single" w:sz="6" w:space="0" w:color="CBD5E1"/>
-              <w:left w:val="single" w:sz="6" w:space="0" w:color="CBD5E1"/>
-              <w:bottom w:val="single" w:sz="6" w:space="0" w:color="CBD5E1"/>
-              <w:right w:val="single" w:sz="6" w:space="0" w:color="CBD5E1"/>
-            </w:tcBorders>
+            <w:tcW w:w="464" w:type="pct"/>
             <w:tcMar>
-              <w:top w:w="120" w:type="dxa"/>
-              <w:left w:w="150" w:type="dxa"/>
-              <w:bottom w:w="120" w:type="dxa"/>
-              <w:right w:w="150" w:type="dxa"/>
+              <w:top w:w="90" w:type="dxa"/>
+              <w:left w:w="120" w:type="dxa"/>
+              <w:bottom w:w="90" w:type="dxa"/>
+              <w:right w:w="120" w:type="dxa"/>
             </w:tcMar>
             <w:hideMark/>
           </w:tcPr>
           <w:p>
             <w:pPr>
-              <w:spacing w:before="300" w:after="300"/>
-              <w:rPr>
-                <w:rFonts w:ascii="Calibri" w:eastAsia="Times New Roman" w:hAnsi="Calibri" w:cs="Calibri"/>
-                <w:color w:val="333333"/>
-                <w:sz w:val="20"/>
-                <w:szCs w:val="20"/>
+              <w:spacing w:before="225" w:after="225"/>
+              <w:rPr>
+                <w:rFonts w:ascii="Calibri" w:eastAsia="Times New Roman" w:hAnsi="Calibri" w:cs="Calibri"/>
+                <w:color w:val="333333"/>
+                <w:sz w:val="19"/>
+                <w:szCs w:val="19"/>
               </w:rPr>
             </w:pPr>
             <w:r>
               <w:rPr>
                 <w:rFonts w:ascii="Calibri" w:eastAsia="Times New Roman" w:hAnsi="Calibri" w:cs="Calibri"/>
                 <w:color w:val="333333"/>
-                <w:sz w:val="20"/>
-                <w:szCs w:val="20"/>
+                <w:sz w:val="19"/>
+                <w:szCs w:val="19"/>
               </w:rPr>
               <w:t>Custom Event</w:t>
             </w:r>
@@ -1164,37 +1052,31 @@
         </w:tc>
         <w:tc>
           <w:tcPr>
-            <w:tcW w:w="0" w:type="auto"/>
-            <w:tcBorders>
-              <w:top w:val="single" w:sz="6" w:space="0" w:color="CBD5E1"/>
-              <w:left w:val="single" w:sz="6" w:space="0" w:color="CBD5E1"/>
-              <w:bottom w:val="single" w:sz="6" w:space="0" w:color="CBD5E1"/>
-              <w:right w:val="single" w:sz="6" w:space="0" w:color="CBD5E1"/>
-            </w:tcBorders>
+            <w:tcW w:w="715" w:type="pct"/>
             <w:tcMar>
-              <w:top w:w="120" w:type="dxa"/>
-              <w:left w:w="150" w:type="dxa"/>
-              <w:bottom w:w="120" w:type="dxa"/>
-              <w:right w:w="150" w:type="dxa"/>
+              <w:top w:w="90" w:type="dxa"/>
+              <w:left w:w="120" w:type="dxa"/>
+              <w:bottom w:w="90" w:type="dxa"/>
+              <w:right w:w="120" w:type="dxa"/>
             </w:tcMar>
             <w:hideMark/>
           </w:tcPr>
           <w:p>
             <w:pPr>
-              <w:spacing w:before="300" w:after="300"/>
-              <w:rPr>
-                <w:rFonts w:ascii="Calibri" w:eastAsia="Times New Roman" w:hAnsi="Calibri" w:cs="Calibri"/>
-                <w:color w:val="333333"/>
-                <w:sz w:val="20"/>
-                <w:szCs w:val="20"/>
+              <w:spacing w:before="225" w:after="225"/>
+              <w:rPr>
+                <w:rFonts w:ascii="Calibri" w:eastAsia="Times New Roman" w:hAnsi="Calibri" w:cs="Calibri"/>
+                <w:color w:val="333333"/>
+                <w:sz w:val="19"/>
+                <w:szCs w:val="19"/>
               </w:rPr>
             </w:pPr>
             <w:r>
               <w:rPr>
                 <w:rFonts w:ascii="Calibri" w:eastAsia="Times New Roman" w:hAnsi="Calibri" w:cs="Calibri"/>
                 <w:color w:val="333333"/>
-                <w:sz w:val="20"/>
-                <w:szCs w:val="20"/>
+                <w:sz w:val="19"/>
+                <w:szCs w:val="19"/>
               </w:rPr>
               <w:t>Fires upon final confirmation and generation of a booking confirmation ID.</w:t>
             </w:r>
@@ -1202,37 +1084,31 @@
         </w:tc>
         <w:tc>
           <w:tcPr>
-            <w:tcW w:w="0" w:type="auto"/>
-            <w:tcBorders>
-              <w:top w:val="single" w:sz="6" w:space="0" w:color="CBD5E1"/>
-              <w:left w:val="single" w:sz="6" w:space="0" w:color="CBD5E1"/>
-              <w:bottom w:val="single" w:sz="6" w:space="0" w:color="CBD5E1"/>
-              <w:right w:val="single" w:sz="6" w:space="0" w:color="CBD5E1"/>
-            </w:tcBorders>
+            <w:tcW w:w="1174" w:type="pct"/>
             <w:tcMar>
-              <w:top w:w="120" w:type="dxa"/>
-              <w:left w:w="150" w:type="dxa"/>
-              <w:bottom w:w="120" w:type="dxa"/>
-              <w:right w:w="150" w:type="dxa"/>
+              <w:top w:w="90" w:type="dxa"/>
+              <w:left w:w="120" w:type="dxa"/>
+              <w:bottom w:w="90" w:type="dxa"/>
+              <w:right w:w="120" w:type="dxa"/>
             </w:tcMar>
             <w:hideMark/>
           </w:tcPr>
           <w:p>
             <w:pPr>
-              <w:spacing w:before="300" w:after="300"/>
-              <w:rPr>
-                <w:rFonts w:ascii="Calibri" w:eastAsia="Times New Roman" w:hAnsi="Calibri" w:cs="Calibri"/>
-                <w:color w:val="333333"/>
-                <w:sz w:val="20"/>
-                <w:szCs w:val="20"/>
+              <w:spacing w:before="225" w:after="225"/>
+              <w:rPr>
+                <w:rFonts w:ascii="Calibri" w:eastAsia="Times New Roman" w:hAnsi="Calibri" w:cs="Calibri"/>
+                <w:color w:val="333333"/>
+                <w:sz w:val="19"/>
+                <w:szCs w:val="19"/>
               </w:rPr>
             </w:pPr>
             <w:r>
               <w:rPr>
                 <w:rFonts w:ascii="Calibri" w:eastAsia="Times New Roman" w:hAnsi="Calibri" w:cs="Calibri"/>
                 <w:color w:val="333333"/>
-                <w:sz w:val="20"/>
-                <w:szCs w:val="20"/>
+                <w:sz w:val="19"/>
+                <w:szCs w:val="19"/>
               </w:rPr>
               <w:t>form_id (string)</w:t>
             </w:r>
@@ -1240,8 +1116,8 @@
               <w:rPr>
                 <w:rFonts w:ascii="Calibri" w:eastAsia="Times New Roman" w:hAnsi="Calibri" w:cs="Calibri"/>
                 <w:color w:val="333333"/>
-                <w:sz w:val="20"/>
-                <w:szCs w:val="20"/>
+                <w:sz w:val="19"/>
+                <w:szCs w:val="19"/>
               </w:rPr>
               <w:br/>
               <w:t>booking_id (string)</w:t>
@@ -1250,8 +1126,8 @@
               <w:rPr>
                 <w:rFonts w:ascii="Calibri" w:eastAsia="Times New Roman" w:hAnsi="Calibri" w:cs="Calibri"/>
                 <w:color w:val="333333"/>
-                <w:sz w:val="20"/>
-                <w:szCs w:val="20"/>
+                <w:sz w:val="19"/>
+                <w:szCs w:val="19"/>
               </w:rPr>
               <w:br/>
               <w:t>clinic_location (string)</w:t>
@@ -1260,8 +1136,8 @@
               <w:rPr>
                 <w:rFonts w:ascii="Calibri" w:eastAsia="Times New Roman" w:hAnsi="Calibri" w:cs="Calibri"/>
                 <w:color w:val="333333"/>
-                <w:sz w:val="20"/>
-                <w:szCs w:val="20"/>
+                <w:sz w:val="19"/>
+                <w:szCs w:val="19"/>
               </w:rPr>
               <w:br/>
               <w:t>specialty (string)</w:t>
@@ -1270,8 +1146,8 @@
               <w:rPr>
                 <w:rFonts w:ascii="Calibri" w:eastAsia="Times New Roman" w:hAnsi="Calibri" w:cs="Calibri"/>
                 <w:color w:val="333333"/>
-                <w:sz w:val="20"/>
-                <w:szCs w:val="20"/>
+                <w:sz w:val="19"/>
+                <w:szCs w:val="19"/>
               </w:rPr>
               <w:br/>
             </w:r>
@@ -1279,8 +1155,8 @@
               <w:rPr>
                 <w:rFonts w:ascii="Calibri" w:eastAsia="Times New Roman" w:hAnsi="Calibri" w:cs="Calibri"/>
                 <w:color w:val="333333"/>
-                <w:sz w:val="20"/>
-                <w:szCs w:val="20"/>
+                <w:sz w:val="19"/>
+                <w:szCs w:val="19"/>
               </w:rPr>
               <w:t>appointment_lead_type (string)</w:t>
             </w:r>
@@ -1288,37 +1164,31 @@
         </w:tc>
         <w:tc>
           <w:tcPr>
-            <w:tcW w:w="0" w:type="auto"/>
-            <w:tcBorders>
-              <w:top w:val="single" w:sz="6" w:space="0" w:color="CBD5E1"/>
-              <w:left w:val="single" w:sz="6" w:space="0" w:color="CBD5E1"/>
-              <w:bottom w:val="single" w:sz="6" w:space="0" w:color="CBD5E1"/>
-              <w:right w:val="single" w:sz="6" w:space="0" w:color="CBD5E1"/>
-            </w:tcBorders>
+            <w:tcW w:w="696" w:type="pct"/>
             <w:tcMar>
-              <w:top w:w="120" w:type="dxa"/>
-              <w:left w:w="150" w:type="dxa"/>
-              <w:bottom w:w="120" w:type="dxa"/>
-              <w:right w:w="150" w:type="dxa"/>
+              <w:top w:w="90" w:type="dxa"/>
+              <w:left w:w="120" w:type="dxa"/>
+              <w:bottom w:w="90" w:type="dxa"/>
+              <w:right w:w="120" w:type="dxa"/>
             </w:tcMar>
             <w:hideMark/>
           </w:tcPr>
           <w:p>
             <w:pPr>
-              <w:spacing w:before="300" w:after="300"/>
-              <w:rPr>
-                <w:rFonts w:ascii="Calibri" w:eastAsia="Times New Roman" w:hAnsi="Calibri" w:cs="Calibri"/>
-                <w:color w:val="333333"/>
-                <w:sz w:val="20"/>
-                <w:szCs w:val="20"/>
+              <w:spacing w:before="225" w:after="225"/>
+              <w:rPr>
+                <w:rFonts w:ascii="Calibri" w:eastAsia="Times New Roman" w:hAnsi="Calibri" w:cs="Calibri"/>
+                <w:color w:val="333333"/>
+                <w:sz w:val="19"/>
+                <w:szCs w:val="19"/>
               </w:rPr>
             </w:pPr>
             <w:r>
               <w:rPr>
                 <w:rFonts w:ascii="Calibri" w:eastAsia="Times New Roman" w:hAnsi="Calibri" w:cs="Calibri"/>
                 <w:color w:val="333333"/>
-                <w:sz w:val="20"/>
-                <w:szCs w:val="20"/>
+                <w:sz w:val="19"/>
+                <w:szCs w:val="19"/>
               </w:rPr>
               <w:t>Conversions (Key Events)</w:t>
             </w:r>
@@ -1326,8 +1196,8 @@
               <w:rPr>
                 <w:rFonts w:ascii="Calibri" w:eastAsia="Times New Roman" w:hAnsi="Calibri" w:cs="Calibri"/>
                 <w:color w:val="333333"/>
-                <w:sz w:val="20"/>
-                <w:szCs w:val="20"/>
+                <w:sz w:val="19"/>
+                <w:szCs w:val="19"/>
               </w:rPr>
               <w:br/>
             </w:r>
@@ -1336,8 +1206,8 @@
                 <w:rStyle w:val="Strong"/>
                 <w:rFonts w:ascii="Calibri" w:eastAsia="Times New Roman" w:hAnsi="Calibri" w:cs="Calibri"/>
                 <w:color w:val="333333"/>
-                <w:sz w:val="20"/>
-                <w:szCs w:val="20"/>
+                <w:sz w:val="19"/>
+                <w:szCs w:val="19"/>
               </w:rPr>
               <w:t>Audience:</w:t>
             </w:r>
@@ -1345,8 +1215,8 @@
               <w:rPr>
                 <w:rFonts w:ascii="Calibri" w:eastAsia="Times New Roman" w:hAnsi="Calibri" w:cs="Calibri"/>
                 <w:color w:val="333333"/>
-                <w:sz w:val="20"/>
-                <w:szCs w:val="20"/>
+                <w:sz w:val="19"/>
+                <w:szCs w:val="19"/>
               </w:rPr>
               <w:t xml:space="preserve"> Booked Patients</w:t>
             </w:r>
@@ -1354,37 +1224,31 @@
         </w:tc>
         <w:tc>
           <w:tcPr>
-            <w:tcW w:w="0" w:type="auto"/>
-            <w:tcBorders>
-              <w:top w:val="single" w:sz="6" w:space="0" w:color="CBD5E1"/>
-              <w:left w:val="single" w:sz="6" w:space="0" w:color="CBD5E1"/>
-              <w:bottom w:val="single" w:sz="6" w:space="0" w:color="CBD5E1"/>
-              <w:right w:val="single" w:sz="6" w:space="0" w:color="CBD5E1"/>
-            </w:tcBorders>
+            <w:tcW w:w="759" w:type="pct"/>
             <w:tcMar>
-              <w:top w:w="120" w:type="dxa"/>
-              <w:left w:w="150" w:type="dxa"/>
-              <w:bottom w:w="120" w:type="dxa"/>
-              <w:right w:w="150" w:type="dxa"/>
+              <w:top w:w="90" w:type="dxa"/>
+              <w:left w:w="120" w:type="dxa"/>
+              <w:bottom w:w="90" w:type="dxa"/>
+              <w:right w:w="120" w:type="dxa"/>
             </w:tcMar>
             <w:hideMark/>
           </w:tcPr>
           <w:p>
             <w:pPr>
-              <w:spacing w:before="300" w:after="300"/>
-              <w:rPr>
-                <w:rFonts w:ascii="Calibri" w:eastAsia="Times New Roman" w:hAnsi="Calibri" w:cs="Calibri"/>
-                <w:color w:val="333333"/>
-                <w:sz w:val="20"/>
-                <w:szCs w:val="20"/>
+              <w:spacing w:before="225" w:after="225"/>
+              <w:rPr>
+                <w:rFonts w:ascii="Calibri" w:eastAsia="Times New Roman" w:hAnsi="Calibri" w:cs="Calibri"/>
+                <w:color w:val="333333"/>
+                <w:sz w:val="19"/>
+                <w:szCs w:val="19"/>
               </w:rPr>
             </w:pPr>
             <w:r>
               <w:rPr>
                 <w:rFonts w:ascii="Calibri" w:eastAsia="Times New Roman" w:hAnsi="Calibri" w:cs="Calibri"/>
                 <w:color w:val="333333"/>
-                <w:sz w:val="20"/>
-                <w:szCs w:val="20"/>
+                <w:sz w:val="19"/>
+                <w:szCs w:val="19"/>
               </w:rPr>
               <w:t>Primary conversion event measuring acquired appointments and marketing ROI.</w:t>
             </w:r>
@@ -1393,33 +1257,27 @@
       </w:tr>
       <w:tr>
         <w:trPr>
-          <w:divId w:val="993408356"/>
+          <w:divId w:val="2050448313"/>
         </w:trPr>
         <w:tc>
           <w:tcPr>
-            <w:tcW w:w="0" w:type="auto"/>
-            <w:tcBorders>
-              <w:top w:val="single" w:sz="6" w:space="0" w:color="CBD5E1"/>
-              <w:left w:val="single" w:sz="6" w:space="0" w:color="CBD5E1"/>
-              <w:bottom w:val="single" w:sz="6" w:space="0" w:color="CBD5E1"/>
-              <w:right w:val="single" w:sz="6" w:space="0" w:color="CBD5E1"/>
-            </w:tcBorders>
+            <w:tcW w:w="1191" w:type="pct"/>
             <w:tcMar>
-              <w:top w:w="120" w:type="dxa"/>
-              <w:left w:w="150" w:type="dxa"/>
-              <w:bottom w:w="120" w:type="dxa"/>
-              <w:right w:w="150" w:type="dxa"/>
+              <w:top w:w="90" w:type="dxa"/>
+              <w:left w:w="120" w:type="dxa"/>
+              <w:bottom w:w="90" w:type="dxa"/>
+              <w:right w:w="120" w:type="dxa"/>
             </w:tcMar>
             <w:hideMark/>
           </w:tcPr>
           <w:p>
             <w:pPr>
-              <w:spacing w:before="300" w:after="300"/>
-              <w:rPr>
-                <w:rFonts w:ascii="Calibri" w:eastAsia="Times New Roman" w:hAnsi="Calibri" w:cs="Calibri"/>
-                <w:color w:val="333333"/>
-                <w:sz w:val="20"/>
-                <w:szCs w:val="20"/>
+              <w:spacing w:before="225" w:after="225"/>
+              <w:rPr>
+                <w:rFonts w:ascii="Calibri" w:eastAsia="Times New Roman" w:hAnsi="Calibri" w:cs="Calibri"/>
+                <w:color w:val="333333"/>
+                <w:sz w:val="19"/>
+                <w:szCs w:val="19"/>
               </w:rPr>
             </w:pPr>
             <w:r>
@@ -1427,8 +1285,8 @@
                 <w:rStyle w:val="Strong"/>
                 <w:rFonts w:ascii="Calibri" w:eastAsia="Times New Roman" w:hAnsi="Calibri" w:cs="Calibri"/>
                 <w:color w:val="333333"/>
-                <w:sz w:val="20"/>
-                <w:szCs w:val="20"/>
+                <w:sz w:val="19"/>
+                <w:szCs w:val="19"/>
               </w:rPr>
               <w:t>form_error</w:t>
             </w:r>
@@ -1436,37 +1294,31 @@
         </w:tc>
         <w:tc>
           <w:tcPr>
-            <w:tcW w:w="0" w:type="auto"/>
-            <w:tcBorders>
-              <w:top w:val="single" w:sz="6" w:space="0" w:color="CBD5E1"/>
-              <w:left w:val="single" w:sz="6" w:space="0" w:color="CBD5E1"/>
-              <w:bottom w:val="single" w:sz="6" w:space="0" w:color="CBD5E1"/>
-              <w:right w:val="single" w:sz="6" w:space="0" w:color="CBD5E1"/>
-            </w:tcBorders>
+            <w:tcW w:w="464" w:type="pct"/>
             <w:tcMar>
-              <w:top w:w="120" w:type="dxa"/>
-              <w:left w:w="150" w:type="dxa"/>
-              <w:bottom w:w="120" w:type="dxa"/>
-              <w:right w:w="150" w:type="dxa"/>
+              <w:top w:w="90" w:type="dxa"/>
+              <w:left w:w="120" w:type="dxa"/>
+              <w:bottom w:w="90" w:type="dxa"/>
+              <w:right w:w="120" w:type="dxa"/>
             </w:tcMar>
             <w:hideMark/>
           </w:tcPr>
           <w:p>
             <w:pPr>
-              <w:spacing w:before="300" w:after="300"/>
-              <w:rPr>
-                <w:rFonts w:ascii="Calibri" w:eastAsia="Times New Roman" w:hAnsi="Calibri" w:cs="Calibri"/>
-                <w:color w:val="333333"/>
-                <w:sz w:val="20"/>
-                <w:szCs w:val="20"/>
+              <w:spacing w:before="225" w:after="225"/>
+              <w:rPr>
+                <w:rFonts w:ascii="Calibri" w:eastAsia="Times New Roman" w:hAnsi="Calibri" w:cs="Calibri"/>
+                <w:color w:val="333333"/>
+                <w:sz w:val="19"/>
+                <w:szCs w:val="19"/>
               </w:rPr>
             </w:pPr>
             <w:r>
               <w:rPr>
                 <w:rFonts w:ascii="Calibri" w:eastAsia="Times New Roman" w:hAnsi="Calibri" w:cs="Calibri"/>
                 <w:color w:val="333333"/>
-                <w:sz w:val="20"/>
-                <w:szCs w:val="20"/>
+                <w:sz w:val="19"/>
+                <w:szCs w:val="19"/>
               </w:rPr>
               <w:t>Custom Event</w:t>
             </w:r>
@@ -1474,37 +1326,31 @@
         </w:tc>
         <w:tc>
           <w:tcPr>
-            <w:tcW w:w="0" w:type="auto"/>
-            <w:tcBorders>
-              <w:top w:val="single" w:sz="6" w:space="0" w:color="CBD5E1"/>
-              <w:left w:val="single" w:sz="6" w:space="0" w:color="CBD5E1"/>
-              <w:bottom w:val="single" w:sz="6" w:space="0" w:color="CBD5E1"/>
-              <w:right w:val="single" w:sz="6" w:space="0" w:color="CBD5E1"/>
-            </w:tcBorders>
+            <w:tcW w:w="715" w:type="pct"/>
             <w:tcMar>
-              <w:top w:w="120" w:type="dxa"/>
-              <w:left w:w="150" w:type="dxa"/>
-              <w:bottom w:w="120" w:type="dxa"/>
-              <w:right w:w="150" w:type="dxa"/>
+              <w:top w:w="90" w:type="dxa"/>
+              <w:left w:w="120" w:type="dxa"/>
+              <w:bottom w:w="90" w:type="dxa"/>
+              <w:right w:w="120" w:type="dxa"/>
             </w:tcMar>
             <w:hideMark/>
           </w:tcPr>
           <w:p>
             <w:pPr>
-              <w:spacing w:before="300" w:after="300"/>
-              <w:rPr>
-                <w:rFonts w:ascii="Calibri" w:eastAsia="Times New Roman" w:hAnsi="Calibri" w:cs="Calibri"/>
-                <w:color w:val="333333"/>
-                <w:sz w:val="20"/>
-                <w:szCs w:val="20"/>
+              <w:spacing w:before="225" w:after="225"/>
+              <w:rPr>
+                <w:rFonts w:ascii="Calibri" w:eastAsia="Times New Roman" w:hAnsi="Calibri" w:cs="Calibri"/>
+                <w:color w:val="333333"/>
+                <w:sz w:val="19"/>
+                <w:szCs w:val="19"/>
               </w:rPr>
             </w:pPr>
             <w:r>
               <w:rPr>
                 <w:rFonts w:ascii="Calibri" w:eastAsia="Times New Roman" w:hAnsi="Calibri" w:cs="Calibri"/>
                 <w:color w:val="333333"/>
-                <w:sz w:val="20"/>
-                <w:szCs w:val="20"/>
+                <w:sz w:val="19"/>
+                <w:szCs w:val="19"/>
               </w:rPr>
               <w:t>Fires when form validation fails upon step submission.</w:t>
             </w:r>
@@ -1512,37 +1358,31 @@
         </w:tc>
         <w:tc>
           <w:tcPr>
-            <w:tcW w:w="0" w:type="auto"/>
-            <w:tcBorders>
-              <w:top w:val="single" w:sz="6" w:space="0" w:color="CBD5E1"/>
-              <w:left w:val="single" w:sz="6" w:space="0" w:color="CBD5E1"/>
-              <w:bottom w:val="single" w:sz="6" w:space="0" w:color="CBD5E1"/>
-              <w:right w:val="single" w:sz="6" w:space="0" w:color="CBD5E1"/>
-            </w:tcBorders>
+            <w:tcW w:w="1174" w:type="pct"/>
             <w:tcMar>
-              <w:top w:w="120" w:type="dxa"/>
-              <w:left w:w="150" w:type="dxa"/>
-              <w:bottom w:w="120" w:type="dxa"/>
-              <w:right w:w="150" w:type="dxa"/>
+              <w:top w:w="90" w:type="dxa"/>
+              <w:left w:w="120" w:type="dxa"/>
+              <w:bottom w:w="90" w:type="dxa"/>
+              <w:right w:w="120" w:type="dxa"/>
             </w:tcMar>
             <w:hideMark/>
           </w:tcPr>
           <w:p>
             <w:pPr>
-              <w:spacing w:before="300" w:after="300"/>
-              <w:rPr>
-                <w:rFonts w:ascii="Calibri" w:eastAsia="Times New Roman" w:hAnsi="Calibri" w:cs="Calibri"/>
-                <w:color w:val="333333"/>
-                <w:sz w:val="20"/>
-                <w:szCs w:val="20"/>
+              <w:spacing w:before="225" w:after="225"/>
+              <w:rPr>
+                <w:rFonts w:ascii="Calibri" w:eastAsia="Times New Roman" w:hAnsi="Calibri" w:cs="Calibri"/>
+                <w:color w:val="333333"/>
+                <w:sz w:val="19"/>
+                <w:szCs w:val="19"/>
               </w:rPr>
             </w:pPr>
             <w:r>
               <w:rPr>
                 <w:rFonts w:ascii="Calibri" w:eastAsia="Times New Roman" w:hAnsi="Calibri" w:cs="Calibri"/>
                 <w:color w:val="333333"/>
-                <w:sz w:val="20"/>
-                <w:szCs w:val="20"/>
+                <w:sz w:val="19"/>
+                <w:szCs w:val="19"/>
               </w:rPr>
               <w:t>form_id (string)</w:t>
             </w:r>
@@ -1550,8 +1390,8 @@
               <w:rPr>
                 <w:rFonts w:ascii="Calibri" w:eastAsia="Times New Roman" w:hAnsi="Calibri" w:cs="Calibri"/>
                 <w:color w:val="333333"/>
-                <w:sz w:val="20"/>
-                <w:szCs w:val="20"/>
+                <w:sz w:val="19"/>
+                <w:szCs w:val="19"/>
               </w:rPr>
               <w:br/>
               <w:t>step_number (integer)</w:t>
@@ -1560,8 +1400,8 @@
               <w:rPr>
                 <w:rFonts w:ascii="Calibri" w:eastAsia="Times New Roman" w:hAnsi="Calibri" w:cs="Calibri"/>
                 <w:color w:val="333333"/>
-                <w:sz w:val="20"/>
-                <w:szCs w:val="20"/>
+                <w:sz w:val="19"/>
+                <w:szCs w:val="19"/>
               </w:rPr>
               <w:br/>
               <w:t>error_field (string)</w:t>
@@ -1570,8 +1410,8 @@
               <w:rPr>
                 <w:rFonts w:ascii="Calibri" w:eastAsia="Times New Roman" w:hAnsi="Calibri" w:cs="Calibri"/>
                 <w:color w:val="333333"/>
-                <w:sz w:val="20"/>
-                <w:szCs w:val="20"/>
+                <w:sz w:val="19"/>
+                <w:szCs w:val="19"/>
               </w:rPr>
               <w:br/>
               <w:t>error_message (string)</w:t>
@@ -1580,37 +1420,31 @@
         </w:tc>
         <w:tc>
           <w:tcPr>
-            <w:tcW w:w="0" w:type="auto"/>
-            <w:tcBorders>
-              <w:top w:val="single" w:sz="6" w:space="0" w:color="CBD5E1"/>
-              <w:left w:val="single" w:sz="6" w:space="0" w:color="CBD5E1"/>
-              <w:bottom w:val="single" w:sz="6" w:space="0" w:color="CBD5E1"/>
-              <w:right w:val="single" w:sz="6" w:space="0" w:color="CBD5E1"/>
-            </w:tcBorders>
+            <w:tcW w:w="696" w:type="pct"/>
             <w:tcMar>
-              <w:top w:w="120" w:type="dxa"/>
-              <w:left w:w="150" w:type="dxa"/>
-              <w:bottom w:w="120" w:type="dxa"/>
-              <w:right w:w="150" w:type="dxa"/>
+              <w:top w:w="90" w:type="dxa"/>
+              <w:left w:w="120" w:type="dxa"/>
+              <w:bottom w:w="90" w:type="dxa"/>
+              <w:right w:w="120" w:type="dxa"/>
             </w:tcMar>
             <w:hideMark/>
           </w:tcPr>
           <w:p>
             <w:pPr>
-              <w:spacing w:before="300" w:after="300"/>
-              <w:rPr>
-                <w:rFonts w:ascii="Calibri" w:eastAsia="Times New Roman" w:hAnsi="Calibri" w:cs="Calibri"/>
-                <w:color w:val="333333"/>
-                <w:sz w:val="20"/>
-                <w:szCs w:val="20"/>
+              <w:spacing w:before="225" w:after="225"/>
+              <w:rPr>
+                <w:rFonts w:ascii="Calibri" w:eastAsia="Times New Roman" w:hAnsi="Calibri" w:cs="Calibri"/>
+                <w:color w:val="333333"/>
+                <w:sz w:val="19"/>
+                <w:szCs w:val="19"/>
               </w:rPr>
             </w:pPr>
             <w:r>
               <w:rPr>
                 <w:rFonts w:ascii="Calibri" w:eastAsia="Times New Roman" w:hAnsi="Calibri" w:cs="Calibri"/>
                 <w:color w:val="333333"/>
-                <w:sz w:val="20"/>
-                <w:szCs w:val="20"/>
+                <w:sz w:val="19"/>
+                <w:szCs w:val="19"/>
               </w:rPr>
               <w:t>Event Reports</w:t>
             </w:r>
@@ -1618,8 +1452,8 @@
               <w:rPr>
                 <w:rFonts w:ascii="Calibri" w:eastAsia="Times New Roman" w:hAnsi="Calibri" w:cs="Calibri"/>
                 <w:color w:val="333333"/>
-                <w:sz w:val="20"/>
-                <w:szCs w:val="20"/>
+                <w:sz w:val="19"/>
+                <w:szCs w:val="19"/>
               </w:rPr>
               <w:br/>
             </w:r>
@@ -1628,8 +1462,8 @@
                 <w:rStyle w:val="Strong"/>
                 <w:rFonts w:ascii="Calibri" w:eastAsia="Times New Roman" w:hAnsi="Calibri" w:cs="Calibri"/>
                 <w:color w:val="333333"/>
-                <w:sz w:val="20"/>
-                <w:szCs w:val="20"/>
+                <w:sz w:val="19"/>
+                <w:szCs w:val="19"/>
               </w:rPr>
               <w:t>Audience:</w:t>
             </w:r>
@@ -1637,8 +1471,8 @@
               <w:rPr>
                 <w:rFonts w:ascii="Calibri" w:eastAsia="Times New Roman" w:hAnsi="Calibri" w:cs="Calibri"/>
                 <w:color w:val="333333"/>
-                <w:sz w:val="20"/>
-                <w:szCs w:val="20"/>
+                <w:sz w:val="19"/>
+                <w:szCs w:val="19"/>
               </w:rPr>
               <w:t xml:space="preserve"> High Friction Users</w:t>
             </w:r>
@@ -1646,37 +1480,31 @@
         </w:tc>
         <w:tc>
           <w:tcPr>
-            <w:tcW w:w="0" w:type="auto"/>
-            <w:tcBorders>
-              <w:top w:val="single" w:sz="6" w:space="0" w:color="CBD5E1"/>
-              <w:left w:val="single" w:sz="6" w:space="0" w:color="CBD5E1"/>
-              <w:bottom w:val="single" w:sz="6" w:space="0" w:color="CBD5E1"/>
-              <w:right w:val="single" w:sz="6" w:space="0" w:color="CBD5E1"/>
-            </w:tcBorders>
+            <w:tcW w:w="759" w:type="pct"/>
             <w:tcMar>
-              <w:top w:w="120" w:type="dxa"/>
-              <w:left w:w="150" w:type="dxa"/>
-              <w:bottom w:w="120" w:type="dxa"/>
-              <w:right w:w="150" w:type="dxa"/>
+              <w:top w:w="90" w:type="dxa"/>
+              <w:left w:w="120" w:type="dxa"/>
+              <w:bottom w:w="90" w:type="dxa"/>
+              <w:right w:w="120" w:type="dxa"/>
             </w:tcMar>
             <w:hideMark/>
           </w:tcPr>
           <w:p>
             <w:pPr>
-              <w:spacing w:before="300" w:after="300"/>
-              <w:rPr>
-                <w:rFonts w:ascii="Calibri" w:eastAsia="Times New Roman" w:hAnsi="Calibri" w:cs="Calibri"/>
-                <w:color w:val="333333"/>
-                <w:sz w:val="20"/>
-                <w:szCs w:val="20"/>
+              <w:spacing w:before="225" w:after="225"/>
+              <w:rPr>
+                <w:rFonts w:ascii="Calibri" w:eastAsia="Times New Roman" w:hAnsi="Calibri" w:cs="Calibri"/>
+                <w:color w:val="333333"/>
+                <w:sz w:val="19"/>
+                <w:szCs w:val="19"/>
               </w:rPr>
             </w:pPr>
             <w:r>
               <w:rPr>
                 <w:rFonts w:ascii="Calibri" w:eastAsia="Times New Roman" w:hAnsi="Calibri" w:cs="Calibri"/>
                 <w:color w:val="333333"/>
-                <w:sz w:val="20"/>
-                <w:szCs w:val="20"/>
+                <w:sz w:val="19"/>
+                <w:szCs w:val="19"/>
               </w:rPr>
               <w:t>Identifies user experience (UX) bottlenecks and validation bugs.</w:t>
             </w:r>
@@ -1685,33 +1513,27 @@
       </w:tr>
       <w:tr>
         <w:trPr>
-          <w:divId w:val="993408356"/>
+          <w:divId w:val="2050448313"/>
         </w:trPr>
         <w:tc>
           <w:tcPr>
-            <w:tcW w:w="0" w:type="auto"/>
-            <w:tcBorders>
-              <w:top w:val="single" w:sz="6" w:space="0" w:color="CBD5E1"/>
-              <w:left w:val="single" w:sz="6" w:space="0" w:color="CBD5E1"/>
-              <w:bottom w:val="single" w:sz="6" w:space="0" w:color="CBD5E1"/>
-              <w:right w:val="single" w:sz="6" w:space="0" w:color="CBD5E1"/>
-            </w:tcBorders>
+            <w:tcW w:w="1191" w:type="pct"/>
             <w:tcMar>
-              <w:top w:w="120" w:type="dxa"/>
-              <w:left w:w="150" w:type="dxa"/>
-              <w:bottom w:w="120" w:type="dxa"/>
-              <w:right w:w="150" w:type="dxa"/>
+              <w:top w:w="90" w:type="dxa"/>
+              <w:left w:w="120" w:type="dxa"/>
+              <w:bottom w:w="90" w:type="dxa"/>
+              <w:right w:w="120" w:type="dxa"/>
             </w:tcMar>
             <w:hideMark/>
           </w:tcPr>
           <w:p>
             <w:pPr>
-              <w:spacing w:before="300" w:after="300"/>
-              <w:rPr>
-                <w:rFonts w:ascii="Calibri" w:eastAsia="Times New Roman" w:hAnsi="Calibri" w:cs="Calibri"/>
-                <w:color w:val="333333"/>
-                <w:sz w:val="20"/>
-                <w:szCs w:val="20"/>
+              <w:spacing w:before="225" w:after="225"/>
+              <w:rPr>
+                <w:rFonts w:ascii="Calibri" w:eastAsia="Times New Roman" w:hAnsi="Calibri" w:cs="Calibri"/>
+                <w:color w:val="333333"/>
+                <w:sz w:val="19"/>
+                <w:szCs w:val="19"/>
               </w:rPr>
             </w:pPr>
             <w:r>
@@ -1719,47 +1541,40 @@
                 <w:rStyle w:val="Strong"/>
                 <w:rFonts w:ascii="Calibri" w:eastAsia="Times New Roman" w:hAnsi="Calibri" w:cs="Calibri"/>
                 <w:color w:val="333333"/>
-                <w:sz w:val="20"/>
-                <w:szCs w:val="20"/>
-              </w:rPr>
-              <w:lastRenderedPageBreak/>
+                <w:sz w:val="19"/>
+                <w:szCs w:val="19"/>
+              </w:rPr>
               <w:t>cta_click</w:t>
             </w:r>
           </w:p>
         </w:tc>
         <w:tc>
           <w:tcPr>
-            <w:tcW w:w="0" w:type="auto"/>
-            <w:tcBorders>
-              <w:top w:val="single" w:sz="6" w:space="0" w:color="CBD5E1"/>
-              <w:left w:val="single" w:sz="6" w:space="0" w:color="CBD5E1"/>
-              <w:bottom w:val="single" w:sz="6" w:space="0" w:color="CBD5E1"/>
-              <w:right w:val="single" w:sz="6" w:space="0" w:color="CBD5E1"/>
-            </w:tcBorders>
+            <w:tcW w:w="464" w:type="pct"/>
             <w:tcMar>
-              <w:top w:w="120" w:type="dxa"/>
-              <w:left w:w="150" w:type="dxa"/>
-              <w:bottom w:w="120" w:type="dxa"/>
-              <w:right w:w="150" w:type="dxa"/>
+              <w:top w:w="90" w:type="dxa"/>
+              <w:left w:w="120" w:type="dxa"/>
+              <w:bottom w:w="90" w:type="dxa"/>
+              <w:right w:w="120" w:type="dxa"/>
             </w:tcMar>
             <w:hideMark/>
           </w:tcPr>
           <w:p>
             <w:pPr>
-              <w:spacing w:before="300" w:after="300"/>
-              <w:rPr>
-                <w:rFonts w:ascii="Calibri" w:eastAsia="Times New Roman" w:hAnsi="Calibri" w:cs="Calibri"/>
-                <w:color w:val="333333"/>
-                <w:sz w:val="20"/>
-                <w:szCs w:val="20"/>
+              <w:spacing w:before="225" w:after="225"/>
+              <w:rPr>
+                <w:rFonts w:ascii="Calibri" w:eastAsia="Times New Roman" w:hAnsi="Calibri" w:cs="Calibri"/>
+                <w:color w:val="333333"/>
+                <w:sz w:val="19"/>
+                <w:szCs w:val="19"/>
               </w:rPr>
             </w:pPr>
             <w:r>
               <w:rPr>
                 <w:rFonts w:ascii="Calibri" w:eastAsia="Times New Roman" w:hAnsi="Calibri" w:cs="Calibri"/>
                 <w:color w:val="333333"/>
-                <w:sz w:val="20"/>
-                <w:szCs w:val="20"/>
+                <w:sz w:val="19"/>
+                <w:szCs w:val="19"/>
               </w:rPr>
               <w:t>Link Click</w:t>
             </w:r>
@@ -1767,37 +1582,31 @@
         </w:tc>
         <w:tc>
           <w:tcPr>
-            <w:tcW w:w="0" w:type="auto"/>
-            <w:tcBorders>
-              <w:top w:val="single" w:sz="6" w:space="0" w:color="CBD5E1"/>
-              <w:left w:val="single" w:sz="6" w:space="0" w:color="CBD5E1"/>
-              <w:bottom w:val="single" w:sz="6" w:space="0" w:color="CBD5E1"/>
-              <w:right w:val="single" w:sz="6" w:space="0" w:color="CBD5E1"/>
-            </w:tcBorders>
+            <w:tcW w:w="715" w:type="pct"/>
             <w:tcMar>
-              <w:top w:w="120" w:type="dxa"/>
-              <w:left w:w="150" w:type="dxa"/>
-              <w:bottom w:w="120" w:type="dxa"/>
-              <w:right w:w="150" w:type="dxa"/>
+              <w:top w:w="90" w:type="dxa"/>
+              <w:left w:w="120" w:type="dxa"/>
+              <w:bottom w:w="90" w:type="dxa"/>
+              <w:right w:w="120" w:type="dxa"/>
             </w:tcMar>
             <w:hideMark/>
           </w:tcPr>
           <w:p>
             <w:pPr>
-              <w:spacing w:before="300" w:after="300"/>
-              <w:rPr>
-                <w:rFonts w:ascii="Calibri" w:eastAsia="Times New Roman" w:hAnsi="Calibri" w:cs="Calibri"/>
-                <w:color w:val="333333"/>
-                <w:sz w:val="20"/>
-                <w:szCs w:val="20"/>
+              <w:spacing w:before="225" w:after="225"/>
+              <w:rPr>
+                <w:rFonts w:ascii="Calibri" w:eastAsia="Times New Roman" w:hAnsi="Calibri" w:cs="Calibri"/>
+                <w:color w:val="333333"/>
+                <w:sz w:val="19"/>
+                <w:szCs w:val="19"/>
               </w:rPr>
             </w:pPr>
             <w:r>
               <w:rPr>
                 <w:rFonts w:ascii="Calibri" w:eastAsia="Times New Roman" w:hAnsi="Calibri" w:cs="Calibri"/>
                 <w:color w:val="333333"/>
-                <w:sz w:val="20"/>
-                <w:szCs w:val="20"/>
+                <w:sz w:val="19"/>
+                <w:szCs w:val="19"/>
               </w:rPr>
               <w:t>Fires when a user clicks on "Call Now" buttons or the WhatsApp floating chat widget.</w:t>
             </w:r>
@@ -1805,37 +1614,31 @@
         </w:tc>
         <w:tc>
           <w:tcPr>
-            <w:tcW w:w="0" w:type="auto"/>
-            <w:tcBorders>
-              <w:top w:val="single" w:sz="6" w:space="0" w:color="CBD5E1"/>
-              <w:left w:val="single" w:sz="6" w:space="0" w:color="CBD5E1"/>
-              <w:bottom w:val="single" w:sz="6" w:space="0" w:color="CBD5E1"/>
-              <w:right w:val="single" w:sz="6" w:space="0" w:color="CBD5E1"/>
-            </w:tcBorders>
+            <w:tcW w:w="1174" w:type="pct"/>
             <w:tcMar>
-              <w:top w:w="120" w:type="dxa"/>
-              <w:left w:w="150" w:type="dxa"/>
-              <w:bottom w:w="120" w:type="dxa"/>
-              <w:right w:w="150" w:type="dxa"/>
+              <w:top w:w="90" w:type="dxa"/>
+              <w:left w:w="120" w:type="dxa"/>
+              <w:bottom w:w="90" w:type="dxa"/>
+              <w:right w:w="120" w:type="dxa"/>
             </w:tcMar>
             <w:hideMark/>
           </w:tcPr>
           <w:p>
             <w:pPr>
-              <w:spacing w:before="300" w:after="300"/>
-              <w:rPr>
-                <w:rFonts w:ascii="Calibri" w:eastAsia="Times New Roman" w:hAnsi="Calibri" w:cs="Calibri"/>
-                <w:color w:val="333333"/>
-                <w:sz w:val="20"/>
-                <w:szCs w:val="20"/>
+              <w:spacing w:before="225" w:after="225"/>
+              <w:rPr>
+                <w:rFonts w:ascii="Calibri" w:eastAsia="Times New Roman" w:hAnsi="Calibri" w:cs="Calibri"/>
+                <w:color w:val="333333"/>
+                <w:sz w:val="19"/>
+                <w:szCs w:val="19"/>
               </w:rPr>
             </w:pPr>
             <w:r>
               <w:rPr>
                 <w:rFonts w:ascii="Calibri" w:eastAsia="Times New Roman" w:hAnsi="Calibri" w:cs="Calibri"/>
                 <w:color w:val="333333"/>
-                <w:sz w:val="20"/>
-                <w:szCs w:val="20"/>
+                <w:sz w:val="19"/>
+                <w:szCs w:val="19"/>
               </w:rPr>
               <w:t>cta_type (string)</w:t>
             </w:r>
@@ -1843,8 +1646,8 @@
               <w:rPr>
                 <w:rFonts w:ascii="Calibri" w:eastAsia="Times New Roman" w:hAnsi="Calibri" w:cs="Calibri"/>
                 <w:color w:val="333333"/>
-                <w:sz w:val="20"/>
-                <w:szCs w:val="20"/>
+                <w:sz w:val="19"/>
+                <w:szCs w:val="19"/>
               </w:rPr>
               <w:br/>
               <w:t>click_url (string)</w:t>
@@ -1853,8 +1656,8 @@
               <w:rPr>
                 <w:rFonts w:ascii="Calibri" w:eastAsia="Times New Roman" w:hAnsi="Calibri" w:cs="Calibri"/>
                 <w:color w:val="333333"/>
-                <w:sz w:val="20"/>
-                <w:szCs w:val="20"/>
+                <w:sz w:val="19"/>
+                <w:szCs w:val="19"/>
               </w:rPr>
               <w:br/>
               <w:t>page_path (string)</w:t>
@@ -1863,8 +1666,8 @@
               <w:rPr>
                 <w:rFonts w:ascii="Calibri" w:eastAsia="Times New Roman" w:hAnsi="Calibri" w:cs="Calibri"/>
                 <w:color w:val="333333"/>
-                <w:sz w:val="20"/>
-                <w:szCs w:val="20"/>
+                <w:sz w:val="19"/>
+                <w:szCs w:val="19"/>
               </w:rPr>
               <w:br/>
               <w:t>clinic_location (string)</w:t>
@@ -1873,37 +1676,31 @@
         </w:tc>
         <w:tc>
           <w:tcPr>
-            <w:tcW w:w="0" w:type="auto"/>
-            <w:tcBorders>
-              <w:top w:val="single" w:sz="6" w:space="0" w:color="CBD5E1"/>
-              <w:left w:val="single" w:sz="6" w:space="0" w:color="CBD5E1"/>
-              <w:bottom w:val="single" w:sz="6" w:space="0" w:color="CBD5E1"/>
-              <w:right w:val="single" w:sz="6" w:space="0" w:color="CBD5E1"/>
-            </w:tcBorders>
+            <w:tcW w:w="696" w:type="pct"/>
             <w:tcMar>
-              <w:top w:w="120" w:type="dxa"/>
-              <w:left w:w="150" w:type="dxa"/>
-              <w:bottom w:w="120" w:type="dxa"/>
-              <w:right w:w="150" w:type="dxa"/>
+              <w:top w:w="90" w:type="dxa"/>
+              <w:left w:w="120" w:type="dxa"/>
+              <w:bottom w:w="90" w:type="dxa"/>
+              <w:right w:w="120" w:type="dxa"/>
             </w:tcMar>
             <w:hideMark/>
           </w:tcPr>
           <w:p>
             <w:pPr>
-              <w:spacing w:before="300" w:after="300"/>
-              <w:rPr>
-                <w:rFonts w:ascii="Calibri" w:eastAsia="Times New Roman" w:hAnsi="Calibri" w:cs="Calibri"/>
-                <w:color w:val="333333"/>
-                <w:sz w:val="20"/>
-                <w:szCs w:val="20"/>
+              <w:spacing w:before="225" w:after="225"/>
+              <w:rPr>
+                <w:rFonts w:ascii="Calibri" w:eastAsia="Times New Roman" w:hAnsi="Calibri" w:cs="Calibri"/>
+                <w:color w:val="333333"/>
+                <w:sz w:val="19"/>
+                <w:szCs w:val="19"/>
               </w:rPr>
             </w:pPr>
             <w:r>
               <w:rPr>
                 <w:rFonts w:ascii="Calibri" w:eastAsia="Times New Roman" w:hAnsi="Calibri" w:cs="Calibri"/>
                 <w:color w:val="333333"/>
-                <w:sz w:val="20"/>
-                <w:szCs w:val="20"/>
+                <w:sz w:val="19"/>
+                <w:szCs w:val="19"/>
               </w:rPr>
               <w:t>Engagement Reports</w:t>
             </w:r>
@@ -1911,8 +1708,8 @@
               <w:rPr>
                 <w:rFonts w:ascii="Calibri" w:eastAsia="Times New Roman" w:hAnsi="Calibri" w:cs="Calibri"/>
                 <w:color w:val="333333"/>
-                <w:sz w:val="20"/>
-                <w:szCs w:val="20"/>
+                <w:sz w:val="19"/>
+                <w:szCs w:val="19"/>
               </w:rPr>
               <w:br/>
             </w:r>
@@ -1921,8 +1718,8 @@
                 <w:rStyle w:val="Strong"/>
                 <w:rFonts w:ascii="Calibri" w:eastAsia="Times New Roman" w:hAnsi="Calibri" w:cs="Calibri"/>
                 <w:color w:val="333333"/>
-                <w:sz w:val="20"/>
-                <w:szCs w:val="20"/>
+                <w:sz w:val="19"/>
+                <w:szCs w:val="19"/>
               </w:rPr>
               <w:t>Audience:</w:t>
             </w:r>
@@ -1930,8 +1727,8 @@
               <w:rPr>
                 <w:rFonts w:ascii="Calibri" w:eastAsia="Times New Roman" w:hAnsi="Calibri" w:cs="Calibri"/>
                 <w:color w:val="333333"/>
-                <w:sz w:val="20"/>
-                <w:szCs w:val="20"/>
+                <w:sz w:val="19"/>
+                <w:szCs w:val="19"/>
               </w:rPr>
               <w:t xml:space="preserve"> Direct Contacts</w:t>
             </w:r>
@@ -1939,37 +1736,31 @@
         </w:tc>
         <w:tc>
           <w:tcPr>
-            <w:tcW w:w="0" w:type="auto"/>
-            <w:tcBorders>
-              <w:top w:val="single" w:sz="6" w:space="0" w:color="CBD5E1"/>
-              <w:left w:val="single" w:sz="6" w:space="0" w:color="CBD5E1"/>
-              <w:bottom w:val="single" w:sz="6" w:space="0" w:color="CBD5E1"/>
-              <w:right w:val="single" w:sz="6" w:space="0" w:color="CBD5E1"/>
-            </w:tcBorders>
+            <w:tcW w:w="759" w:type="pct"/>
             <w:tcMar>
-              <w:top w:w="120" w:type="dxa"/>
-              <w:left w:w="150" w:type="dxa"/>
-              <w:bottom w:w="120" w:type="dxa"/>
-              <w:right w:w="150" w:type="dxa"/>
+              <w:top w:w="90" w:type="dxa"/>
+              <w:left w:w="120" w:type="dxa"/>
+              <w:bottom w:w="90" w:type="dxa"/>
+              <w:right w:w="120" w:type="dxa"/>
             </w:tcMar>
             <w:hideMark/>
           </w:tcPr>
           <w:p>
             <w:pPr>
-              <w:spacing w:before="300" w:after="300"/>
-              <w:rPr>
-                <w:rFonts w:ascii="Calibri" w:eastAsia="Times New Roman" w:hAnsi="Calibri" w:cs="Calibri"/>
-                <w:color w:val="333333"/>
-                <w:sz w:val="20"/>
-                <w:szCs w:val="20"/>
+              <w:spacing w:before="225" w:after="225"/>
+              <w:rPr>
+                <w:rFonts w:ascii="Calibri" w:eastAsia="Times New Roman" w:hAnsi="Calibri" w:cs="Calibri"/>
+                <w:color w:val="333333"/>
+                <w:sz w:val="19"/>
+                <w:szCs w:val="19"/>
               </w:rPr>
             </w:pPr>
             <w:r>
               <w:rPr>
                 <w:rFonts w:ascii="Calibri" w:eastAsia="Times New Roman" w:hAnsi="Calibri" w:cs="Calibri"/>
                 <w:color w:val="333333"/>
-                <w:sz w:val="20"/>
-                <w:szCs w:val="20"/>
+                <w:sz w:val="19"/>
+                <w:szCs w:val="19"/>
               </w:rPr>
               <w:t>Measures direct-contact actions that bypass the booking funnel.</w:t>
             </w:r>
@@ -1978,33 +1769,27 @@
       </w:tr>
       <w:tr>
         <w:trPr>
-          <w:divId w:val="993408356"/>
+          <w:divId w:val="2050448313"/>
         </w:trPr>
         <w:tc>
           <w:tcPr>
-            <w:tcW w:w="0" w:type="auto"/>
-            <w:tcBorders>
-              <w:top w:val="single" w:sz="6" w:space="0" w:color="CBD5E1"/>
-              <w:left w:val="single" w:sz="6" w:space="0" w:color="CBD5E1"/>
-              <w:bottom w:val="single" w:sz="6" w:space="0" w:color="CBD5E1"/>
-              <w:right w:val="single" w:sz="6" w:space="0" w:color="CBD5E1"/>
-            </w:tcBorders>
+            <w:tcW w:w="1191" w:type="pct"/>
             <w:tcMar>
-              <w:top w:w="120" w:type="dxa"/>
-              <w:left w:w="150" w:type="dxa"/>
-              <w:bottom w:w="120" w:type="dxa"/>
-              <w:right w:w="150" w:type="dxa"/>
+              <w:top w:w="90" w:type="dxa"/>
+              <w:left w:w="120" w:type="dxa"/>
+              <w:bottom w:w="90" w:type="dxa"/>
+              <w:right w:w="120" w:type="dxa"/>
             </w:tcMar>
             <w:hideMark/>
           </w:tcPr>
           <w:p>
             <w:pPr>
-              <w:spacing w:before="300" w:after="300"/>
-              <w:rPr>
-                <w:rFonts w:ascii="Calibri" w:eastAsia="Times New Roman" w:hAnsi="Calibri" w:cs="Calibri"/>
-                <w:color w:val="333333"/>
-                <w:sz w:val="20"/>
-                <w:szCs w:val="20"/>
+              <w:spacing w:before="225" w:after="225"/>
+              <w:rPr>
+                <w:rFonts w:ascii="Calibri" w:eastAsia="Times New Roman" w:hAnsi="Calibri" w:cs="Calibri"/>
+                <w:color w:val="333333"/>
+                <w:sz w:val="19"/>
+                <w:szCs w:val="19"/>
               </w:rPr>
             </w:pPr>
             <w:r>
@@ -2012,46 +1797,41 @@
                 <w:rStyle w:val="Strong"/>
                 <w:rFonts w:ascii="Calibri" w:eastAsia="Times New Roman" w:hAnsi="Calibri" w:cs="Calibri"/>
                 <w:color w:val="333333"/>
-                <w:sz w:val="20"/>
-                <w:szCs w:val="20"/>
-              </w:rPr>
+                <w:sz w:val="19"/>
+                <w:szCs w:val="19"/>
+              </w:rPr>
+              <w:lastRenderedPageBreak/>
               <w:t>guide_form_submit</w:t>
             </w:r>
           </w:p>
         </w:tc>
         <w:tc>
           <w:tcPr>
-            <w:tcW w:w="0" w:type="auto"/>
-            <w:tcBorders>
-              <w:top w:val="single" w:sz="6" w:space="0" w:color="CBD5E1"/>
-              <w:left w:val="single" w:sz="6" w:space="0" w:color="CBD5E1"/>
-              <w:bottom w:val="single" w:sz="6" w:space="0" w:color="CBD5E1"/>
-              <w:right w:val="single" w:sz="6" w:space="0" w:color="CBD5E1"/>
-            </w:tcBorders>
+            <w:tcW w:w="464" w:type="pct"/>
             <w:tcMar>
-              <w:top w:w="120" w:type="dxa"/>
-              <w:left w:w="150" w:type="dxa"/>
-              <w:bottom w:w="120" w:type="dxa"/>
-              <w:right w:w="150" w:type="dxa"/>
+              <w:top w:w="90" w:type="dxa"/>
+              <w:left w:w="120" w:type="dxa"/>
+              <w:bottom w:w="90" w:type="dxa"/>
+              <w:right w:w="120" w:type="dxa"/>
             </w:tcMar>
             <w:hideMark/>
           </w:tcPr>
           <w:p>
             <w:pPr>
-              <w:spacing w:before="300" w:after="300"/>
-              <w:rPr>
-                <w:rFonts w:ascii="Calibri" w:eastAsia="Times New Roman" w:hAnsi="Calibri" w:cs="Calibri"/>
-                <w:color w:val="333333"/>
-                <w:sz w:val="20"/>
-                <w:szCs w:val="20"/>
+              <w:spacing w:before="225" w:after="225"/>
+              <w:rPr>
+                <w:rFonts w:ascii="Calibri" w:eastAsia="Times New Roman" w:hAnsi="Calibri" w:cs="Calibri"/>
+                <w:color w:val="333333"/>
+                <w:sz w:val="19"/>
+                <w:szCs w:val="19"/>
               </w:rPr>
             </w:pPr>
             <w:r>
               <w:rPr>
                 <w:rFonts w:ascii="Calibri" w:eastAsia="Times New Roman" w:hAnsi="Calibri" w:cs="Calibri"/>
                 <w:color w:val="333333"/>
-                <w:sz w:val="20"/>
-                <w:szCs w:val="20"/>
+                <w:sz w:val="19"/>
+                <w:szCs w:val="19"/>
               </w:rPr>
               <w:t>Custom Event</w:t>
             </w:r>
@@ -2059,37 +1839,31 @@
         </w:tc>
         <w:tc>
           <w:tcPr>
-            <w:tcW w:w="0" w:type="auto"/>
-            <w:tcBorders>
-              <w:top w:val="single" w:sz="6" w:space="0" w:color="CBD5E1"/>
-              <w:left w:val="single" w:sz="6" w:space="0" w:color="CBD5E1"/>
-              <w:bottom w:val="single" w:sz="6" w:space="0" w:color="CBD5E1"/>
-              <w:right w:val="single" w:sz="6" w:space="0" w:color="CBD5E1"/>
-            </w:tcBorders>
+            <w:tcW w:w="715" w:type="pct"/>
             <w:tcMar>
-              <w:top w:w="120" w:type="dxa"/>
-              <w:left w:w="150" w:type="dxa"/>
-              <w:bottom w:w="120" w:type="dxa"/>
-              <w:right w:w="150" w:type="dxa"/>
+              <w:top w:w="90" w:type="dxa"/>
+              <w:left w:w="120" w:type="dxa"/>
+              <w:bottom w:w="90" w:type="dxa"/>
+              <w:right w:w="120" w:type="dxa"/>
             </w:tcMar>
             <w:hideMark/>
           </w:tcPr>
           <w:p>
             <w:pPr>
-              <w:spacing w:before="300" w:after="300"/>
-              <w:rPr>
-                <w:rFonts w:ascii="Calibri" w:eastAsia="Times New Roman" w:hAnsi="Calibri" w:cs="Calibri"/>
-                <w:color w:val="333333"/>
-                <w:sz w:val="20"/>
-                <w:szCs w:val="20"/>
+              <w:spacing w:before="225" w:after="225"/>
+              <w:rPr>
+                <w:rFonts w:ascii="Calibri" w:eastAsia="Times New Roman" w:hAnsi="Calibri" w:cs="Calibri"/>
+                <w:color w:val="333333"/>
+                <w:sz w:val="19"/>
+                <w:szCs w:val="19"/>
               </w:rPr>
             </w:pPr>
             <w:r>
               <w:rPr>
                 <w:rFonts w:ascii="Calibri" w:eastAsia="Times New Roman" w:hAnsi="Calibri" w:cs="Calibri"/>
                 <w:color w:val="333333"/>
-                <w:sz w:val="20"/>
-                <w:szCs w:val="20"/>
+                <w:sz w:val="19"/>
+                <w:szCs w:val="19"/>
               </w:rPr>
               <w:t>Fires when the gated "Download Patient Guide" form is submitted.</w:t>
             </w:r>
@@ -2097,37 +1871,31 @@
         </w:tc>
         <w:tc>
           <w:tcPr>
-            <w:tcW w:w="0" w:type="auto"/>
-            <w:tcBorders>
-              <w:top w:val="single" w:sz="6" w:space="0" w:color="CBD5E1"/>
-              <w:left w:val="single" w:sz="6" w:space="0" w:color="CBD5E1"/>
-              <w:bottom w:val="single" w:sz="6" w:space="0" w:color="CBD5E1"/>
-              <w:right w:val="single" w:sz="6" w:space="0" w:color="CBD5E1"/>
-            </w:tcBorders>
+            <w:tcW w:w="1174" w:type="pct"/>
             <w:tcMar>
-              <w:top w:w="120" w:type="dxa"/>
-              <w:left w:w="150" w:type="dxa"/>
-              <w:bottom w:w="120" w:type="dxa"/>
-              <w:right w:w="150" w:type="dxa"/>
+              <w:top w:w="90" w:type="dxa"/>
+              <w:left w:w="120" w:type="dxa"/>
+              <w:bottom w:w="90" w:type="dxa"/>
+              <w:right w:w="120" w:type="dxa"/>
             </w:tcMar>
             <w:hideMark/>
           </w:tcPr>
           <w:p>
             <w:pPr>
-              <w:spacing w:before="300" w:after="300"/>
-              <w:rPr>
-                <w:rFonts w:ascii="Calibri" w:eastAsia="Times New Roman" w:hAnsi="Calibri" w:cs="Calibri"/>
-                <w:color w:val="333333"/>
-                <w:sz w:val="20"/>
-                <w:szCs w:val="20"/>
+              <w:spacing w:before="225" w:after="225"/>
+              <w:rPr>
+                <w:rFonts w:ascii="Calibri" w:eastAsia="Times New Roman" w:hAnsi="Calibri" w:cs="Calibri"/>
+                <w:color w:val="333333"/>
+                <w:sz w:val="19"/>
+                <w:szCs w:val="19"/>
               </w:rPr>
             </w:pPr>
             <w:r>
               <w:rPr>
                 <w:rFonts w:ascii="Calibri" w:eastAsia="Times New Roman" w:hAnsi="Calibri" w:cs="Calibri"/>
                 <w:color w:val="333333"/>
-                <w:sz w:val="20"/>
-                <w:szCs w:val="20"/>
+                <w:sz w:val="19"/>
+                <w:szCs w:val="19"/>
               </w:rPr>
               <w:t>form_id (string)</w:t>
             </w:r>
@@ -2135,8 +1903,8 @@
               <w:rPr>
                 <w:rFonts w:ascii="Calibri" w:eastAsia="Times New Roman" w:hAnsi="Calibri" w:cs="Calibri"/>
                 <w:color w:val="333333"/>
-                <w:sz w:val="20"/>
-                <w:szCs w:val="20"/>
+                <w:sz w:val="19"/>
+                <w:szCs w:val="19"/>
               </w:rPr>
               <w:br/>
               <w:t>form_name (string)</w:t>
@@ -2145,8 +1913,8 @@
               <w:rPr>
                 <w:rFonts w:ascii="Calibri" w:eastAsia="Times New Roman" w:hAnsi="Calibri" w:cs="Calibri"/>
                 <w:color w:val="333333"/>
-                <w:sz w:val="20"/>
-                <w:szCs w:val="20"/>
+                <w:sz w:val="19"/>
+                <w:szCs w:val="19"/>
               </w:rPr>
               <w:br/>
               <w:t>guide_name (string)</w:t>
@@ -2155,37 +1923,31 @@
         </w:tc>
         <w:tc>
           <w:tcPr>
-            <w:tcW w:w="0" w:type="auto"/>
-            <w:tcBorders>
-              <w:top w:val="single" w:sz="6" w:space="0" w:color="CBD5E1"/>
-              <w:left w:val="single" w:sz="6" w:space="0" w:color="CBD5E1"/>
-              <w:bottom w:val="single" w:sz="6" w:space="0" w:color="CBD5E1"/>
-              <w:right w:val="single" w:sz="6" w:space="0" w:color="CBD5E1"/>
-            </w:tcBorders>
+            <w:tcW w:w="696" w:type="pct"/>
             <w:tcMar>
-              <w:top w:w="120" w:type="dxa"/>
-              <w:left w:w="150" w:type="dxa"/>
-              <w:bottom w:w="120" w:type="dxa"/>
-              <w:right w:w="150" w:type="dxa"/>
+              <w:top w:w="90" w:type="dxa"/>
+              <w:left w:w="120" w:type="dxa"/>
+              <w:bottom w:w="90" w:type="dxa"/>
+              <w:right w:w="120" w:type="dxa"/>
             </w:tcMar>
             <w:hideMark/>
           </w:tcPr>
           <w:p>
             <w:pPr>
-              <w:spacing w:before="300" w:after="300"/>
-              <w:rPr>
-                <w:rFonts w:ascii="Calibri" w:eastAsia="Times New Roman" w:hAnsi="Calibri" w:cs="Calibri"/>
-                <w:color w:val="333333"/>
-                <w:sz w:val="20"/>
-                <w:szCs w:val="20"/>
+              <w:spacing w:before="225" w:after="225"/>
+              <w:rPr>
+                <w:rFonts w:ascii="Calibri" w:eastAsia="Times New Roman" w:hAnsi="Calibri" w:cs="Calibri"/>
+                <w:color w:val="333333"/>
+                <w:sz w:val="19"/>
+                <w:szCs w:val="19"/>
               </w:rPr>
             </w:pPr>
             <w:r>
               <w:rPr>
                 <w:rFonts w:ascii="Calibri" w:eastAsia="Times New Roman" w:hAnsi="Calibri" w:cs="Calibri"/>
                 <w:color w:val="333333"/>
-                <w:sz w:val="20"/>
-                <w:szCs w:val="20"/>
+                <w:sz w:val="19"/>
+                <w:szCs w:val="19"/>
               </w:rPr>
               <w:t>Lead Reports</w:t>
             </w:r>
@@ -2193,8 +1955,8 @@
               <w:rPr>
                 <w:rFonts w:ascii="Calibri" w:eastAsia="Times New Roman" w:hAnsi="Calibri" w:cs="Calibri"/>
                 <w:color w:val="333333"/>
-                <w:sz w:val="20"/>
-                <w:szCs w:val="20"/>
+                <w:sz w:val="19"/>
+                <w:szCs w:val="19"/>
               </w:rPr>
               <w:br/>
             </w:r>
@@ -2203,8 +1965,8 @@
                 <w:rStyle w:val="Strong"/>
                 <w:rFonts w:ascii="Calibri" w:eastAsia="Times New Roman" w:hAnsi="Calibri" w:cs="Calibri"/>
                 <w:color w:val="333333"/>
-                <w:sz w:val="20"/>
-                <w:szCs w:val="20"/>
+                <w:sz w:val="19"/>
+                <w:szCs w:val="19"/>
               </w:rPr>
               <w:t>Audience:</w:t>
             </w:r>
@@ -2212,8 +1974,8 @@
               <w:rPr>
                 <w:rFonts w:ascii="Calibri" w:eastAsia="Times New Roman" w:hAnsi="Calibri" w:cs="Calibri"/>
                 <w:color w:val="333333"/>
-                <w:sz w:val="20"/>
-                <w:szCs w:val="20"/>
+                <w:sz w:val="19"/>
+                <w:szCs w:val="19"/>
               </w:rPr>
               <w:t xml:space="preserve"> Educational Leads</w:t>
             </w:r>
@@ -2221,37 +1983,31 @@
         </w:tc>
         <w:tc>
           <w:tcPr>
-            <w:tcW w:w="0" w:type="auto"/>
-            <w:tcBorders>
-              <w:top w:val="single" w:sz="6" w:space="0" w:color="CBD5E1"/>
-              <w:left w:val="single" w:sz="6" w:space="0" w:color="CBD5E1"/>
-              <w:bottom w:val="single" w:sz="6" w:space="0" w:color="CBD5E1"/>
-              <w:right w:val="single" w:sz="6" w:space="0" w:color="CBD5E1"/>
-            </w:tcBorders>
+            <w:tcW w:w="759" w:type="pct"/>
             <w:tcMar>
-              <w:top w:w="120" w:type="dxa"/>
-              <w:left w:w="150" w:type="dxa"/>
-              <w:bottom w:w="120" w:type="dxa"/>
-              <w:right w:w="150" w:type="dxa"/>
+              <w:top w:w="90" w:type="dxa"/>
+              <w:left w:w="120" w:type="dxa"/>
+              <w:bottom w:w="90" w:type="dxa"/>
+              <w:right w:w="120" w:type="dxa"/>
             </w:tcMar>
             <w:hideMark/>
           </w:tcPr>
           <w:p>
             <w:pPr>
-              <w:spacing w:before="300" w:after="300"/>
-              <w:rPr>
-                <w:rFonts w:ascii="Calibri" w:eastAsia="Times New Roman" w:hAnsi="Calibri" w:cs="Calibri"/>
-                <w:color w:val="333333"/>
-                <w:sz w:val="20"/>
-                <w:szCs w:val="20"/>
+              <w:spacing w:before="225" w:after="225"/>
+              <w:rPr>
+                <w:rFonts w:ascii="Calibri" w:eastAsia="Times New Roman" w:hAnsi="Calibri" w:cs="Calibri"/>
+                <w:color w:val="333333"/>
+                <w:sz w:val="19"/>
+                <w:szCs w:val="19"/>
               </w:rPr>
             </w:pPr>
             <w:r>
               <w:rPr>
                 <w:rFonts w:ascii="Calibri" w:eastAsia="Times New Roman" w:hAnsi="Calibri" w:cs="Calibri"/>
                 <w:color w:val="333333"/>
-                <w:sz w:val="20"/>
-                <w:szCs w:val="20"/>
+                <w:sz w:val="19"/>
+                <w:szCs w:val="19"/>
               </w:rPr>
               <w:t>Evaluates mid-funnel content marketing effectiveness.</w:t>
             </w:r>
@@ -2260,33 +2016,27 @@
       </w:tr>
       <w:tr>
         <w:trPr>
-          <w:divId w:val="993408356"/>
+          <w:divId w:val="2050448313"/>
         </w:trPr>
         <w:tc>
           <w:tcPr>
-            <w:tcW w:w="0" w:type="auto"/>
-            <w:tcBorders>
-              <w:top w:val="single" w:sz="6" w:space="0" w:color="CBD5E1"/>
-              <w:left w:val="single" w:sz="6" w:space="0" w:color="CBD5E1"/>
-              <w:bottom w:val="single" w:sz="6" w:space="0" w:color="CBD5E1"/>
-              <w:right w:val="single" w:sz="6" w:space="0" w:color="CBD5E1"/>
-            </w:tcBorders>
+            <w:tcW w:w="1191" w:type="pct"/>
             <w:tcMar>
-              <w:top w:w="120" w:type="dxa"/>
-              <w:left w:w="150" w:type="dxa"/>
-              <w:bottom w:w="120" w:type="dxa"/>
-              <w:right w:w="150" w:type="dxa"/>
+              <w:top w:w="90" w:type="dxa"/>
+              <w:left w:w="120" w:type="dxa"/>
+              <w:bottom w:w="90" w:type="dxa"/>
+              <w:right w:w="120" w:type="dxa"/>
             </w:tcMar>
             <w:hideMark/>
           </w:tcPr>
           <w:p>
             <w:pPr>
-              <w:spacing w:before="300" w:after="300"/>
-              <w:rPr>
-                <w:rFonts w:ascii="Calibri" w:eastAsia="Times New Roman" w:hAnsi="Calibri" w:cs="Calibri"/>
-                <w:color w:val="333333"/>
-                <w:sz w:val="20"/>
-                <w:szCs w:val="20"/>
+              <w:spacing w:before="225" w:after="225"/>
+              <w:rPr>
+                <w:rFonts w:ascii="Calibri" w:eastAsia="Times New Roman" w:hAnsi="Calibri" w:cs="Calibri"/>
+                <w:color w:val="333333"/>
+                <w:sz w:val="19"/>
+                <w:szCs w:val="19"/>
               </w:rPr>
             </w:pPr>
             <w:r>
@@ -2294,8 +2044,8 @@
                 <w:rStyle w:val="Strong"/>
                 <w:rFonts w:ascii="Calibri" w:eastAsia="Times New Roman" w:hAnsi="Calibri" w:cs="Calibri"/>
                 <w:color w:val="333333"/>
-                <w:sz w:val="20"/>
-                <w:szCs w:val="20"/>
+                <w:sz w:val="19"/>
+                <w:szCs w:val="19"/>
               </w:rPr>
               <w:t>clinic_page_view</w:t>
             </w:r>
@@ -2303,37 +2053,31 @@
         </w:tc>
         <w:tc>
           <w:tcPr>
-            <w:tcW w:w="0" w:type="auto"/>
-            <w:tcBorders>
-              <w:top w:val="single" w:sz="6" w:space="0" w:color="CBD5E1"/>
-              <w:left w:val="single" w:sz="6" w:space="0" w:color="CBD5E1"/>
-              <w:bottom w:val="single" w:sz="6" w:space="0" w:color="CBD5E1"/>
-              <w:right w:val="single" w:sz="6" w:space="0" w:color="CBD5E1"/>
-            </w:tcBorders>
+            <w:tcW w:w="464" w:type="pct"/>
             <w:tcMar>
-              <w:top w:w="120" w:type="dxa"/>
-              <w:left w:w="150" w:type="dxa"/>
-              <w:bottom w:w="120" w:type="dxa"/>
-              <w:right w:w="150" w:type="dxa"/>
+              <w:top w:w="90" w:type="dxa"/>
+              <w:left w:w="120" w:type="dxa"/>
+              <w:bottom w:w="90" w:type="dxa"/>
+              <w:right w:w="120" w:type="dxa"/>
             </w:tcMar>
             <w:hideMark/>
           </w:tcPr>
           <w:p>
             <w:pPr>
-              <w:spacing w:before="300" w:after="300"/>
-              <w:rPr>
-                <w:rFonts w:ascii="Calibri" w:eastAsia="Times New Roman" w:hAnsi="Calibri" w:cs="Calibri"/>
-                <w:color w:val="333333"/>
-                <w:sz w:val="20"/>
-                <w:szCs w:val="20"/>
+              <w:spacing w:before="225" w:after="225"/>
+              <w:rPr>
+                <w:rFonts w:ascii="Calibri" w:eastAsia="Times New Roman" w:hAnsi="Calibri" w:cs="Calibri"/>
+                <w:color w:val="333333"/>
+                <w:sz w:val="19"/>
+                <w:szCs w:val="19"/>
               </w:rPr>
             </w:pPr>
             <w:r>
               <w:rPr>
                 <w:rFonts w:ascii="Calibri" w:eastAsia="Times New Roman" w:hAnsi="Calibri" w:cs="Calibri"/>
                 <w:color w:val="333333"/>
-                <w:sz w:val="20"/>
-                <w:szCs w:val="20"/>
+                <w:sz w:val="19"/>
+                <w:szCs w:val="19"/>
               </w:rPr>
               <w:t>Page View</w:t>
             </w:r>
@@ -2341,37 +2085,31 @@
         </w:tc>
         <w:tc>
           <w:tcPr>
-            <w:tcW w:w="0" w:type="auto"/>
-            <w:tcBorders>
-              <w:top w:val="single" w:sz="6" w:space="0" w:color="CBD5E1"/>
-              <w:left w:val="single" w:sz="6" w:space="0" w:color="CBD5E1"/>
-              <w:bottom w:val="single" w:sz="6" w:space="0" w:color="CBD5E1"/>
-              <w:right w:val="single" w:sz="6" w:space="0" w:color="CBD5E1"/>
-            </w:tcBorders>
+            <w:tcW w:w="715" w:type="pct"/>
             <w:tcMar>
-              <w:top w:w="120" w:type="dxa"/>
-              <w:left w:w="150" w:type="dxa"/>
-              <w:bottom w:w="120" w:type="dxa"/>
-              <w:right w:w="150" w:type="dxa"/>
+              <w:top w:w="90" w:type="dxa"/>
+              <w:left w:w="120" w:type="dxa"/>
+              <w:bottom w:w="90" w:type="dxa"/>
+              <w:right w:w="120" w:type="dxa"/>
             </w:tcMar>
             <w:hideMark/>
           </w:tcPr>
           <w:p>
             <w:pPr>
-              <w:spacing w:before="300" w:after="300"/>
-              <w:rPr>
-                <w:rFonts w:ascii="Calibri" w:eastAsia="Times New Roman" w:hAnsi="Calibri" w:cs="Calibri"/>
-                <w:color w:val="333333"/>
-                <w:sz w:val="20"/>
-                <w:szCs w:val="20"/>
+              <w:spacing w:before="225" w:after="225"/>
+              <w:rPr>
+                <w:rFonts w:ascii="Calibri" w:eastAsia="Times New Roman" w:hAnsi="Calibri" w:cs="Calibri"/>
+                <w:color w:val="333333"/>
+                <w:sz w:val="19"/>
+                <w:szCs w:val="19"/>
               </w:rPr>
             </w:pPr>
             <w:r>
               <w:rPr>
                 <w:rFonts w:ascii="Calibri" w:eastAsia="Times New Roman" w:hAnsi="Calibri" w:cs="Calibri"/>
                 <w:color w:val="333333"/>
-                <w:sz w:val="20"/>
-                <w:szCs w:val="20"/>
+                <w:sz w:val="19"/>
+                <w:szCs w:val="19"/>
               </w:rPr>
               <w:t>Fires when a user loads a clinic-specific location page (9 clinic pages).</w:t>
             </w:r>
@@ -2379,37 +2117,31 @@
         </w:tc>
         <w:tc>
           <w:tcPr>
-            <w:tcW w:w="0" w:type="auto"/>
-            <w:tcBorders>
-              <w:top w:val="single" w:sz="6" w:space="0" w:color="CBD5E1"/>
-              <w:left w:val="single" w:sz="6" w:space="0" w:color="CBD5E1"/>
-              <w:bottom w:val="single" w:sz="6" w:space="0" w:color="CBD5E1"/>
-              <w:right w:val="single" w:sz="6" w:space="0" w:color="CBD5E1"/>
-            </w:tcBorders>
+            <w:tcW w:w="1174" w:type="pct"/>
             <w:tcMar>
-              <w:top w:w="120" w:type="dxa"/>
-              <w:left w:w="150" w:type="dxa"/>
-              <w:bottom w:w="120" w:type="dxa"/>
-              <w:right w:w="150" w:type="dxa"/>
+              <w:top w:w="90" w:type="dxa"/>
+              <w:left w:w="120" w:type="dxa"/>
+              <w:bottom w:w="90" w:type="dxa"/>
+              <w:right w:w="120" w:type="dxa"/>
             </w:tcMar>
             <w:hideMark/>
           </w:tcPr>
           <w:p>
             <w:pPr>
-              <w:spacing w:before="300" w:after="300"/>
-              <w:rPr>
-                <w:rFonts w:ascii="Calibri" w:eastAsia="Times New Roman" w:hAnsi="Calibri" w:cs="Calibri"/>
-                <w:color w:val="333333"/>
-                <w:sz w:val="20"/>
-                <w:szCs w:val="20"/>
+              <w:spacing w:before="225" w:after="225"/>
+              <w:rPr>
+                <w:rFonts w:ascii="Calibri" w:eastAsia="Times New Roman" w:hAnsi="Calibri" w:cs="Calibri"/>
+                <w:color w:val="333333"/>
+                <w:sz w:val="19"/>
+                <w:szCs w:val="19"/>
               </w:rPr>
             </w:pPr>
             <w:r>
               <w:rPr>
                 <w:rFonts w:ascii="Calibri" w:eastAsia="Times New Roman" w:hAnsi="Calibri" w:cs="Calibri"/>
                 <w:color w:val="333333"/>
-                <w:sz w:val="20"/>
-                <w:szCs w:val="20"/>
+                <w:sz w:val="19"/>
+                <w:szCs w:val="19"/>
               </w:rPr>
               <w:t>clinic_name (string)</w:t>
             </w:r>
@@ -2417,8 +2149,8 @@
               <w:rPr>
                 <w:rFonts w:ascii="Calibri" w:eastAsia="Times New Roman" w:hAnsi="Calibri" w:cs="Calibri"/>
                 <w:color w:val="333333"/>
-                <w:sz w:val="20"/>
-                <w:szCs w:val="20"/>
+                <w:sz w:val="19"/>
+                <w:szCs w:val="19"/>
               </w:rPr>
               <w:br/>
               <w:t>clinic_city (string)</w:t>
@@ -2427,8 +2159,8 @@
               <w:rPr>
                 <w:rFonts w:ascii="Calibri" w:eastAsia="Times New Roman" w:hAnsi="Calibri" w:cs="Calibri"/>
                 <w:color w:val="333333"/>
-                <w:sz w:val="20"/>
-                <w:szCs w:val="20"/>
+                <w:sz w:val="19"/>
+                <w:szCs w:val="19"/>
               </w:rPr>
               <w:br/>
               <w:t>page_path (string)</w:t>
@@ -2437,37 +2169,31 @@
         </w:tc>
         <w:tc>
           <w:tcPr>
-            <w:tcW w:w="0" w:type="auto"/>
-            <w:tcBorders>
-              <w:top w:val="single" w:sz="6" w:space="0" w:color="CBD5E1"/>
-              <w:left w:val="single" w:sz="6" w:space="0" w:color="CBD5E1"/>
-              <w:bottom w:val="single" w:sz="6" w:space="0" w:color="CBD5E1"/>
-              <w:right w:val="single" w:sz="6" w:space="0" w:color="CBD5E1"/>
-            </w:tcBorders>
+            <w:tcW w:w="696" w:type="pct"/>
             <w:tcMar>
-              <w:top w:w="120" w:type="dxa"/>
-              <w:left w:w="150" w:type="dxa"/>
-              <w:bottom w:w="120" w:type="dxa"/>
-              <w:right w:w="150" w:type="dxa"/>
+              <w:top w:w="90" w:type="dxa"/>
+              <w:left w:w="120" w:type="dxa"/>
+              <w:bottom w:w="90" w:type="dxa"/>
+              <w:right w:w="120" w:type="dxa"/>
             </w:tcMar>
             <w:hideMark/>
           </w:tcPr>
           <w:p>
             <w:pPr>
-              <w:spacing w:before="300" w:after="300"/>
-              <w:rPr>
-                <w:rFonts w:ascii="Calibri" w:eastAsia="Times New Roman" w:hAnsi="Calibri" w:cs="Calibri"/>
-                <w:color w:val="333333"/>
-                <w:sz w:val="20"/>
-                <w:szCs w:val="20"/>
+              <w:spacing w:before="225" w:after="225"/>
+              <w:rPr>
+                <w:rFonts w:ascii="Calibri" w:eastAsia="Times New Roman" w:hAnsi="Calibri" w:cs="Calibri"/>
+                <w:color w:val="333333"/>
+                <w:sz w:val="19"/>
+                <w:szCs w:val="19"/>
               </w:rPr>
             </w:pPr>
             <w:r>
               <w:rPr>
                 <w:rFonts w:ascii="Calibri" w:eastAsia="Times New Roman" w:hAnsi="Calibri" w:cs="Calibri"/>
                 <w:color w:val="333333"/>
-                <w:sz w:val="20"/>
-                <w:szCs w:val="20"/>
+                <w:sz w:val="19"/>
+                <w:szCs w:val="19"/>
               </w:rPr>
               <w:t>Custom Regional Performance</w:t>
             </w:r>
@@ -2475,8 +2201,8 @@
               <w:rPr>
                 <w:rFonts w:ascii="Calibri" w:eastAsia="Times New Roman" w:hAnsi="Calibri" w:cs="Calibri"/>
                 <w:color w:val="333333"/>
-                <w:sz w:val="20"/>
-                <w:szCs w:val="20"/>
+                <w:sz w:val="19"/>
+                <w:szCs w:val="19"/>
               </w:rPr>
               <w:br/>
             </w:r>
@@ -2485,8 +2211,8 @@
                 <w:rStyle w:val="Strong"/>
                 <w:rFonts w:ascii="Calibri" w:eastAsia="Times New Roman" w:hAnsi="Calibri" w:cs="Calibri"/>
                 <w:color w:val="333333"/>
-                <w:sz w:val="20"/>
-                <w:szCs w:val="20"/>
+                <w:sz w:val="19"/>
+                <w:szCs w:val="19"/>
               </w:rPr>
               <w:t>Audience:</w:t>
             </w:r>
@@ -2494,8 +2220,8 @@
               <w:rPr>
                 <w:rFonts w:ascii="Calibri" w:eastAsia="Times New Roman" w:hAnsi="Calibri" w:cs="Calibri"/>
                 <w:color w:val="333333"/>
-                <w:sz w:val="20"/>
-                <w:szCs w:val="20"/>
+                <w:sz w:val="19"/>
+                <w:szCs w:val="19"/>
               </w:rPr>
               <w:t xml:space="preserve"> Clinic Page Viewers</w:t>
             </w:r>
@@ -2503,37 +2229,31 @@
         </w:tc>
         <w:tc>
           <w:tcPr>
-            <w:tcW w:w="0" w:type="auto"/>
-            <w:tcBorders>
-              <w:top w:val="single" w:sz="6" w:space="0" w:color="CBD5E1"/>
-              <w:left w:val="single" w:sz="6" w:space="0" w:color="CBD5E1"/>
-              <w:bottom w:val="single" w:sz="6" w:space="0" w:color="CBD5E1"/>
-              <w:right w:val="single" w:sz="6" w:space="0" w:color="CBD5E1"/>
-            </w:tcBorders>
+            <w:tcW w:w="759" w:type="pct"/>
             <w:tcMar>
-              <w:top w:w="120" w:type="dxa"/>
-              <w:left w:w="150" w:type="dxa"/>
-              <w:bottom w:w="120" w:type="dxa"/>
-              <w:right w:w="150" w:type="dxa"/>
+              <w:top w:w="90" w:type="dxa"/>
+              <w:left w:w="120" w:type="dxa"/>
+              <w:bottom w:w="90" w:type="dxa"/>
+              <w:right w:w="120" w:type="dxa"/>
             </w:tcMar>
             <w:hideMark/>
           </w:tcPr>
           <w:p>
             <w:pPr>
-              <w:spacing w:before="300" w:after="300"/>
-              <w:rPr>
-                <w:rFonts w:ascii="Calibri" w:eastAsia="Times New Roman" w:hAnsi="Calibri" w:cs="Calibri"/>
-                <w:color w:val="333333"/>
-                <w:sz w:val="20"/>
-                <w:szCs w:val="20"/>
+              <w:spacing w:before="225" w:after="225"/>
+              <w:rPr>
+                <w:rFonts w:ascii="Calibri" w:eastAsia="Times New Roman" w:hAnsi="Calibri" w:cs="Calibri"/>
+                <w:color w:val="333333"/>
+                <w:sz w:val="19"/>
+                <w:szCs w:val="19"/>
               </w:rPr>
             </w:pPr>
             <w:r>
               <w:rPr>
                 <w:rFonts w:ascii="Calibri" w:eastAsia="Times New Roman" w:hAnsi="Calibri" w:cs="Calibri"/>
                 <w:color w:val="333333"/>
-                <w:sz w:val="20"/>
-                <w:szCs w:val="20"/>
+                <w:sz w:val="19"/>
+                <w:szCs w:val="19"/>
               </w:rPr>
               <w:t>Tracks interest and search traffic distribution across clinic locations.</w:t>
             </w:r>
@@ -2542,33 +2262,27 @@
       </w:tr>
       <w:tr>
         <w:trPr>
-          <w:divId w:val="993408356"/>
+          <w:divId w:val="2050448313"/>
         </w:trPr>
         <w:tc>
           <w:tcPr>
-            <w:tcW w:w="0" w:type="auto"/>
-            <w:tcBorders>
-              <w:top w:val="single" w:sz="6" w:space="0" w:color="CBD5E1"/>
-              <w:left w:val="single" w:sz="6" w:space="0" w:color="CBD5E1"/>
-              <w:bottom w:val="single" w:sz="6" w:space="0" w:color="CBD5E1"/>
-              <w:right w:val="single" w:sz="6" w:space="0" w:color="CBD5E1"/>
-            </w:tcBorders>
+            <w:tcW w:w="1191" w:type="pct"/>
             <w:tcMar>
-              <w:top w:w="120" w:type="dxa"/>
-              <w:left w:w="150" w:type="dxa"/>
-              <w:bottom w:w="120" w:type="dxa"/>
-              <w:right w:w="150" w:type="dxa"/>
+              <w:top w:w="90" w:type="dxa"/>
+              <w:left w:w="120" w:type="dxa"/>
+              <w:bottom w:w="90" w:type="dxa"/>
+              <w:right w:w="120" w:type="dxa"/>
             </w:tcMar>
             <w:hideMark/>
           </w:tcPr>
           <w:p>
             <w:pPr>
-              <w:spacing w:before="300" w:after="300"/>
-              <w:rPr>
-                <w:rFonts w:ascii="Calibri" w:eastAsia="Times New Roman" w:hAnsi="Calibri" w:cs="Calibri"/>
-                <w:color w:val="333333"/>
-                <w:sz w:val="20"/>
-                <w:szCs w:val="20"/>
+              <w:spacing w:before="225" w:after="225"/>
+              <w:rPr>
+                <w:rFonts w:ascii="Calibri" w:eastAsia="Times New Roman" w:hAnsi="Calibri" w:cs="Calibri"/>
+                <w:color w:val="333333"/>
+                <w:sz w:val="19"/>
+                <w:szCs w:val="19"/>
               </w:rPr>
             </w:pPr>
             <w:r>
@@ -2576,8 +2290,8 @@
                 <w:rStyle w:val="Strong"/>
                 <w:rFonts w:ascii="Calibri" w:eastAsia="Times New Roman" w:hAnsi="Calibri" w:cs="Calibri"/>
                 <w:color w:val="333333"/>
-                <w:sz w:val="20"/>
-                <w:szCs w:val="20"/>
+                <w:sz w:val="19"/>
+                <w:szCs w:val="19"/>
               </w:rPr>
               <w:t>blog_scroll_depth</w:t>
             </w:r>
@@ -2585,37 +2299,31 @@
         </w:tc>
         <w:tc>
           <w:tcPr>
-            <w:tcW w:w="0" w:type="auto"/>
-            <w:tcBorders>
-              <w:top w:val="single" w:sz="6" w:space="0" w:color="CBD5E1"/>
-              <w:left w:val="single" w:sz="6" w:space="0" w:color="CBD5E1"/>
-              <w:bottom w:val="single" w:sz="6" w:space="0" w:color="CBD5E1"/>
-              <w:right w:val="single" w:sz="6" w:space="0" w:color="CBD5E1"/>
-            </w:tcBorders>
+            <w:tcW w:w="464" w:type="pct"/>
             <w:tcMar>
-              <w:top w:w="120" w:type="dxa"/>
-              <w:left w:w="150" w:type="dxa"/>
-              <w:bottom w:w="120" w:type="dxa"/>
-              <w:right w:w="150" w:type="dxa"/>
+              <w:top w:w="90" w:type="dxa"/>
+              <w:left w:w="120" w:type="dxa"/>
+              <w:bottom w:w="90" w:type="dxa"/>
+              <w:right w:w="120" w:type="dxa"/>
             </w:tcMar>
             <w:hideMark/>
           </w:tcPr>
           <w:p>
             <w:pPr>
-              <w:spacing w:before="300" w:after="300"/>
-              <w:rPr>
-                <w:rFonts w:ascii="Calibri" w:eastAsia="Times New Roman" w:hAnsi="Calibri" w:cs="Calibri"/>
-                <w:color w:val="333333"/>
-                <w:sz w:val="20"/>
-                <w:szCs w:val="20"/>
+              <w:spacing w:before="225" w:after="225"/>
+              <w:rPr>
+                <w:rFonts w:ascii="Calibri" w:eastAsia="Times New Roman" w:hAnsi="Calibri" w:cs="Calibri"/>
+                <w:color w:val="333333"/>
+                <w:sz w:val="19"/>
+                <w:szCs w:val="19"/>
               </w:rPr>
             </w:pPr>
             <w:r>
               <w:rPr>
                 <w:rFonts w:ascii="Calibri" w:eastAsia="Times New Roman" w:hAnsi="Calibri" w:cs="Calibri"/>
                 <w:color w:val="333333"/>
-                <w:sz w:val="20"/>
-                <w:szCs w:val="20"/>
+                <w:sz w:val="19"/>
+                <w:szCs w:val="19"/>
               </w:rPr>
               <w:t>Scroll Depth</w:t>
             </w:r>
@@ -2623,37 +2331,31 @@
         </w:tc>
         <w:tc>
           <w:tcPr>
-            <w:tcW w:w="0" w:type="auto"/>
-            <w:tcBorders>
-              <w:top w:val="single" w:sz="6" w:space="0" w:color="CBD5E1"/>
-              <w:left w:val="single" w:sz="6" w:space="0" w:color="CBD5E1"/>
-              <w:bottom w:val="single" w:sz="6" w:space="0" w:color="CBD5E1"/>
-              <w:right w:val="single" w:sz="6" w:space="0" w:color="CBD5E1"/>
-            </w:tcBorders>
+            <w:tcW w:w="715" w:type="pct"/>
             <w:tcMar>
-              <w:top w:w="120" w:type="dxa"/>
-              <w:left w:w="150" w:type="dxa"/>
-              <w:bottom w:w="120" w:type="dxa"/>
-              <w:right w:w="150" w:type="dxa"/>
+              <w:top w:w="90" w:type="dxa"/>
+              <w:left w:w="120" w:type="dxa"/>
+              <w:bottom w:w="90" w:type="dxa"/>
+              <w:right w:w="120" w:type="dxa"/>
             </w:tcMar>
             <w:hideMark/>
           </w:tcPr>
           <w:p>
             <w:pPr>
-              <w:spacing w:before="300" w:after="300"/>
-              <w:rPr>
-                <w:rFonts w:ascii="Calibri" w:eastAsia="Times New Roman" w:hAnsi="Calibri" w:cs="Calibri"/>
-                <w:color w:val="333333"/>
-                <w:sz w:val="20"/>
-                <w:szCs w:val="20"/>
+              <w:spacing w:before="225" w:after="225"/>
+              <w:rPr>
+                <w:rFonts w:ascii="Calibri" w:eastAsia="Times New Roman" w:hAnsi="Calibri" w:cs="Calibri"/>
+                <w:color w:val="333333"/>
+                <w:sz w:val="19"/>
+                <w:szCs w:val="19"/>
               </w:rPr>
             </w:pPr>
             <w:r>
               <w:rPr>
                 <w:rFonts w:ascii="Calibri" w:eastAsia="Times New Roman" w:hAnsi="Calibri" w:cs="Calibri"/>
                 <w:color w:val="333333"/>
-                <w:sz w:val="20"/>
-                <w:szCs w:val="20"/>
+                <w:sz w:val="19"/>
+                <w:szCs w:val="19"/>
               </w:rPr>
               <w:t>Fires when a user scrolls to 50%, 75%, or 90% vertical depth on blog posts.</w:t>
             </w:r>
@@ -2661,37 +2363,31 @@
         </w:tc>
         <w:tc>
           <w:tcPr>
-            <w:tcW w:w="0" w:type="auto"/>
-            <w:tcBorders>
-              <w:top w:val="single" w:sz="6" w:space="0" w:color="CBD5E1"/>
-              <w:left w:val="single" w:sz="6" w:space="0" w:color="CBD5E1"/>
-              <w:bottom w:val="single" w:sz="6" w:space="0" w:color="CBD5E1"/>
-              <w:right w:val="single" w:sz="6" w:space="0" w:color="CBD5E1"/>
-            </w:tcBorders>
+            <w:tcW w:w="1174" w:type="pct"/>
             <w:tcMar>
-              <w:top w:w="120" w:type="dxa"/>
-              <w:left w:w="150" w:type="dxa"/>
-              <w:bottom w:w="120" w:type="dxa"/>
-              <w:right w:w="150" w:type="dxa"/>
+              <w:top w:w="90" w:type="dxa"/>
+              <w:left w:w="120" w:type="dxa"/>
+              <w:bottom w:w="90" w:type="dxa"/>
+              <w:right w:w="120" w:type="dxa"/>
             </w:tcMar>
             <w:hideMark/>
           </w:tcPr>
           <w:p>
             <w:pPr>
-              <w:spacing w:before="300" w:after="300"/>
-              <w:rPr>
-                <w:rFonts w:ascii="Calibri" w:eastAsia="Times New Roman" w:hAnsi="Calibri" w:cs="Calibri"/>
-                <w:color w:val="333333"/>
-                <w:sz w:val="20"/>
-                <w:szCs w:val="20"/>
+              <w:spacing w:before="225" w:after="225"/>
+              <w:rPr>
+                <w:rFonts w:ascii="Calibri" w:eastAsia="Times New Roman" w:hAnsi="Calibri" w:cs="Calibri"/>
+                <w:color w:val="333333"/>
+                <w:sz w:val="19"/>
+                <w:szCs w:val="19"/>
               </w:rPr>
             </w:pPr>
             <w:r>
               <w:rPr>
                 <w:rFonts w:ascii="Calibri" w:eastAsia="Times New Roman" w:hAnsi="Calibri" w:cs="Calibri"/>
                 <w:color w:val="333333"/>
-                <w:sz w:val="20"/>
-                <w:szCs w:val="20"/>
+                <w:sz w:val="19"/>
+                <w:szCs w:val="19"/>
               </w:rPr>
               <w:t>article_title (string)</w:t>
             </w:r>
@@ -2699,8 +2395,8 @@
               <w:rPr>
                 <w:rFonts w:ascii="Calibri" w:eastAsia="Times New Roman" w:hAnsi="Calibri" w:cs="Calibri"/>
                 <w:color w:val="333333"/>
-                <w:sz w:val="20"/>
-                <w:szCs w:val="20"/>
+                <w:sz w:val="19"/>
+                <w:szCs w:val="19"/>
               </w:rPr>
               <w:br/>
             </w:r>
@@ -2708,8 +2404,8 @@
               <w:rPr>
                 <w:rFonts w:ascii="Calibri" w:eastAsia="Times New Roman" w:hAnsi="Calibri" w:cs="Calibri"/>
                 <w:color w:val="333333"/>
-                <w:sz w:val="20"/>
-                <w:szCs w:val="20"/>
+                <w:sz w:val="19"/>
+                <w:szCs w:val="19"/>
               </w:rPr>
               <w:t>article_category (string)</w:t>
             </w:r>
@@ -2717,8 +2413,8 @@
               <w:rPr>
                 <w:rFonts w:ascii="Calibri" w:eastAsia="Times New Roman" w:hAnsi="Calibri" w:cs="Calibri"/>
                 <w:color w:val="333333"/>
-                <w:sz w:val="20"/>
-                <w:szCs w:val="20"/>
+                <w:sz w:val="19"/>
+                <w:szCs w:val="19"/>
               </w:rPr>
               <w:br/>
               <w:t>percent_scrolled (integer)</w:t>
@@ -2727,8 +2423,8 @@
               <w:rPr>
                 <w:rFonts w:ascii="Calibri" w:eastAsia="Times New Roman" w:hAnsi="Calibri" w:cs="Calibri"/>
                 <w:color w:val="333333"/>
-                <w:sz w:val="20"/>
-                <w:szCs w:val="20"/>
+                <w:sz w:val="19"/>
+                <w:szCs w:val="19"/>
               </w:rPr>
               <w:br/>
               <w:t>time_on_page (integer)</w:t>
@@ -2737,37 +2433,31 @@
         </w:tc>
         <w:tc>
           <w:tcPr>
-            <w:tcW w:w="0" w:type="auto"/>
-            <w:tcBorders>
-              <w:top w:val="single" w:sz="6" w:space="0" w:color="CBD5E1"/>
-              <w:left w:val="single" w:sz="6" w:space="0" w:color="CBD5E1"/>
-              <w:bottom w:val="single" w:sz="6" w:space="0" w:color="CBD5E1"/>
-              <w:right w:val="single" w:sz="6" w:space="0" w:color="CBD5E1"/>
-            </w:tcBorders>
+            <w:tcW w:w="696" w:type="pct"/>
             <w:tcMar>
-              <w:top w:w="120" w:type="dxa"/>
-              <w:left w:w="150" w:type="dxa"/>
-              <w:bottom w:w="120" w:type="dxa"/>
-              <w:right w:w="150" w:type="dxa"/>
+              <w:top w:w="90" w:type="dxa"/>
+              <w:left w:w="120" w:type="dxa"/>
+              <w:bottom w:w="90" w:type="dxa"/>
+              <w:right w:w="120" w:type="dxa"/>
             </w:tcMar>
             <w:hideMark/>
           </w:tcPr>
           <w:p>
             <w:pPr>
-              <w:spacing w:before="300" w:after="300"/>
-              <w:rPr>
-                <w:rFonts w:ascii="Calibri" w:eastAsia="Times New Roman" w:hAnsi="Calibri" w:cs="Calibri"/>
-                <w:color w:val="333333"/>
-                <w:sz w:val="20"/>
-                <w:szCs w:val="20"/>
+              <w:spacing w:before="225" w:after="225"/>
+              <w:rPr>
+                <w:rFonts w:ascii="Calibri" w:eastAsia="Times New Roman" w:hAnsi="Calibri" w:cs="Calibri"/>
+                <w:color w:val="333333"/>
+                <w:sz w:val="19"/>
+                <w:szCs w:val="19"/>
               </w:rPr>
             </w:pPr>
             <w:r>
               <w:rPr>
                 <w:rFonts w:ascii="Calibri" w:eastAsia="Times New Roman" w:hAnsi="Calibri" w:cs="Calibri"/>
                 <w:color w:val="333333"/>
-                <w:sz w:val="20"/>
-                <w:szCs w:val="20"/>
+                <w:sz w:val="19"/>
+                <w:szCs w:val="19"/>
               </w:rPr>
               <w:t>Engagement / Pages and Screens</w:t>
             </w:r>
@@ -2775,8 +2465,8 @@
               <w:rPr>
                 <w:rFonts w:ascii="Calibri" w:eastAsia="Times New Roman" w:hAnsi="Calibri" w:cs="Calibri"/>
                 <w:color w:val="333333"/>
-                <w:sz w:val="20"/>
-                <w:szCs w:val="20"/>
+                <w:sz w:val="19"/>
+                <w:szCs w:val="19"/>
               </w:rPr>
               <w:br/>
             </w:r>
@@ -2785,8 +2475,8 @@
                 <w:rStyle w:val="Strong"/>
                 <w:rFonts w:ascii="Calibri" w:eastAsia="Times New Roman" w:hAnsi="Calibri" w:cs="Calibri"/>
                 <w:color w:val="333333"/>
-                <w:sz w:val="20"/>
-                <w:szCs w:val="20"/>
+                <w:sz w:val="19"/>
+                <w:szCs w:val="19"/>
               </w:rPr>
               <w:t>Audience:</w:t>
             </w:r>
@@ -2794,8 +2484,8 @@
               <w:rPr>
                 <w:rFonts w:ascii="Calibri" w:eastAsia="Times New Roman" w:hAnsi="Calibri" w:cs="Calibri"/>
                 <w:color w:val="333333"/>
-                <w:sz w:val="20"/>
-                <w:szCs w:val="20"/>
+                <w:sz w:val="19"/>
+                <w:szCs w:val="19"/>
               </w:rPr>
               <w:t xml:space="preserve"> Engaged Readers</w:t>
             </w:r>
@@ -2803,37 +2493,31 @@
         </w:tc>
         <w:tc>
           <w:tcPr>
-            <w:tcW w:w="0" w:type="auto"/>
-            <w:tcBorders>
-              <w:top w:val="single" w:sz="6" w:space="0" w:color="CBD5E1"/>
-              <w:left w:val="single" w:sz="6" w:space="0" w:color="CBD5E1"/>
-              <w:bottom w:val="single" w:sz="6" w:space="0" w:color="CBD5E1"/>
-              <w:right w:val="single" w:sz="6" w:space="0" w:color="CBD5E1"/>
-            </w:tcBorders>
+            <w:tcW w:w="759" w:type="pct"/>
             <w:tcMar>
-              <w:top w:w="120" w:type="dxa"/>
-              <w:left w:w="150" w:type="dxa"/>
-              <w:bottom w:w="120" w:type="dxa"/>
-              <w:right w:w="150" w:type="dxa"/>
+              <w:top w:w="90" w:type="dxa"/>
+              <w:left w:w="120" w:type="dxa"/>
+              <w:bottom w:w="90" w:type="dxa"/>
+              <w:right w:w="120" w:type="dxa"/>
             </w:tcMar>
             <w:hideMark/>
           </w:tcPr>
           <w:p>
             <w:pPr>
-              <w:spacing w:before="300" w:after="300"/>
-              <w:rPr>
-                <w:rFonts w:ascii="Calibri" w:eastAsia="Times New Roman" w:hAnsi="Calibri" w:cs="Calibri"/>
-                <w:color w:val="333333"/>
-                <w:sz w:val="20"/>
-                <w:szCs w:val="20"/>
+              <w:spacing w:before="225" w:after="225"/>
+              <w:rPr>
+                <w:rFonts w:ascii="Calibri" w:eastAsia="Times New Roman" w:hAnsi="Calibri" w:cs="Calibri"/>
+                <w:color w:val="333333"/>
+                <w:sz w:val="19"/>
+                <w:szCs w:val="19"/>
               </w:rPr>
             </w:pPr>
             <w:r>
               <w:rPr>
                 <w:rFonts w:ascii="Calibri" w:eastAsia="Times New Roman" w:hAnsi="Calibri" w:cs="Calibri"/>
                 <w:color w:val="333333"/>
-                <w:sz w:val="20"/>
-                <w:szCs w:val="20"/>
+                <w:sz w:val="19"/>
+                <w:szCs w:val="19"/>
               </w:rPr>
               <w:t>Measures reading depth and content quality of educational blog articles.</w:t>
             </w:r>
@@ -2844,7 +2528,7 @@
     <w:p>
       <w:pPr>
         <w:pStyle w:val="Heading2"/>
-        <w:divId w:val="993408356"/>
+        <w:divId w:val="2050448313"/>
         <w:rPr>
           <w:rFonts w:ascii="Calibri" w:eastAsia="Times New Roman" w:hAnsi="Calibri" w:cs="Calibri"/>
           <w:lang w:val="en"/>
@@ -2861,7 +2545,7 @@
     <w:p>
       <w:pPr>
         <w:pStyle w:val="Heading3"/>
-        <w:divId w:val="993408356"/>
+        <w:divId w:val="2050448313"/>
         <w:rPr>
           <w:rFonts w:ascii="Calibri" w:eastAsia="Times New Roman" w:hAnsi="Calibri" w:cs="Calibri"/>
           <w:lang w:val="en"/>
@@ -2878,7 +2562,7 @@
     <w:p>
       <w:pPr>
         <w:pStyle w:val="NormalWeb"/>
-        <w:divId w:val="993408356"/>
+        <w:divId w:val="2050448313"/>
         <w:rPr>
           <w:rFonts w:ascii="Calibri" w:hAnsi="Calibri" w:cs="Calibri"/>
           <w:color w:val="333333"/>
@@ -2922,7 +2606,7 @@
     <w:p>
       <w:pPr>
         <w:pStyle w:val="NormalWeb"/>
-        <w:divId w:val="993408356"/>
+        <w:divId w:val="2050448313"/>
         <w:rPr>
           <w:rFonts w:ascii="Calibri" w:hAnsi="Calibri" w:cs="Calibri"/>
           <w:color w:val="333333"/>
@@ -2977,7 +2661,7 @@
     <w:p>
       <w:pPr>
         <w:pStyle w:val="Heading3"/>
-        <w:divId w:val="993408356"/>
+        <w:divId w:val="2050448313"/>
         <w:rPr>
           <w:rFonts w:ascii="Calibri" w:eastAsia="Times New Roman" w:hAnsi="Calibri" w:cs="Calibri"/>
           <w:lang w:val="en"/>
@@ -2997,8 +2681,8 @@
           <w:ilvl w:val="0"/>
           <w:numId w:val="1"/>
         </w:numPr>
-        <w:spacing w:before="100" w:beforeAutospacing="1" w:after="75"/>
-        <w:divId w:val="993408356"/>
+        <w:spacing w:before="100" w:beforeAutospacing="1" w:after="60"/>
+        <w:divId w:val="2050448313"/>
         <w:rPr>
           <w:rFonts w:ascii="Calibri" w:eastAsia="Times New Roman" w:hAnsi="Calibri" w:cs="Calibri"/>
           <w:color w:val="333333"/>
@@ -3046,8 +2730,8 @@
           <w:ilvl w:val="1"/>
           <w:numId w:val="1"/>
         </w:numPr>
-        <w:spacing w:before="100" w:beforeAutospacing="1" w:after="75"/>
-        <w:divId w:val="993408356"/>
+        <w:spacing w:before="100" w:beforeAutospacing="1" w:after="60"/>
+        <w:divId w:val="2050448313"/>
         <w:rPr>
           <w:rFonts w:ascii="Calibri" w:eastAsia="Times New Roman" w:hAnsi="Calibri" w:cs="Calibri"/>
           <w:color w:val="333333"/>
@@ -3084,8 +2768,8 @@
           <w:ilvl w:val="1"/>
           <w:numId w:val="1"/>
         </w:numPr>
-        <w:spacing w:before="100" w:beforeAutospacing="1" w:after="75"/>
-        <w:divId w:val="993408356"/>
+        <w:spacing w:before="100" w:beforeAutospacing="1" w:after="60"/>
+        <w:divId w:val="2050448313"/>
         <w:rPr>
           <w:rFonts w:ascii="Calibri" w:eastAsia="Times New Roman" w:hAnsi="Calibri" w:cs="Calibri"/>
           <w:color w:val="333333"/>
@@ -3139,25 +2823,7 @@
           <w:color w:val="333333"/>
           <w:lang w:val="en"/>
         </w:rPr>
-        <w:t>step_number</w:t>
-      </w:r>
-      <w:r>
-        <w:rPr>
-          <w:rFonts w:ascii="Calibri" w:eastAsia="Times New Roman" w:hAnsi="Calibri" w:cs="Calibri"/>
-          <w:color w:val="333333"/>
-          <w:sz w:val="22"/>
-          <w:szCs w:val="22"/>
-          <w:lang w:val="en"/>
-        </w:rPr>
-        <w:t xml:space="preserve"> equals </w:t>
-      </w:r>
-      <w:r>
-        <w:rPr>
-          <w:rStyle w:val="HTMLCode"/>
-          <w:color w:val="333333"/>
-          <w:lang w:val="en"/>
-        </w:rPr>
-        <w:t>1</w:t>
+        <w:t>step_number = 1</w:t>
       </w:r>
       <w:r>
         <w:rPr>
@@ -3176,8 +2842,8 @@
           <w:ilvl w:val="1"/>
           <w:numId w:val="1"/>
         </w:numPr>
-        <w:spacing w:before="100" w:beforeAutospacing="1" w:after="75"/>
-        <w:divId w:val="993408356"/>
+        <w:spacing w:before="100" w:beforeAutospacing="1" w:after="60"/>
+        <w:divId w:val="2050448313"/>
         <w:rPr>
           <w:rFonts w:ascii="Calibri" w:eastAsia="Times New Roman" w:hAnsi="Calibri" w:cs="Calibri"/>
           <w:color w:val="333333"/>
@@ -3232,8 +2898,8 @@
           <w:ilvl w:val="1"/>
           <w:numId w:val="1"/>
         </w:numPr>
-        <w:spacing w:before="100" w:beforeAutospacing="1" w:after="75"/>
-        <w:divId w:val="993408356"/>
+        <w:spacing w:before="100" w:beforeAutospacing="1" w:after="60"/>
+        <w:divId w:val="2050448313"/>
         <w:rPr>
           <w:rFonts w:ascii="Calibri" w:eastAsia="Times New Roman" w:hAnsi="Calibri" w:cs="Calibri"/>
           <w:color w:val="333333"/>
@@ -3351,7 +3017,7 @@
           <w:szCs w:val="22"/>
           <w:lang w:val="en"/>
         </w:rPr>
-        <w:t xml:space="preserve"> as custom parameters.</w:t>
+        <w:t>.</w:t>
       </w:r>
     </w:p>
     <w:p>
@@ -3360,8 +3026,8 @@
           <w:ilvl w:val="0"/>
           <w:numId w:val="1"/>
         </w:numPr>
-        <w:spacing w:before="100" w:beforeAutospacing="1" w:after="75"/>
-        <w:divId w:val="993408356"/>
+        <w:spacing w:before="100" w:beforeAutospacing="1" w:after="60"/>
+        <w:divId w:val="2050448313"/>
         <w:rPr>
           <w:rFonts w:ascii="Calibri" w:eastAsia="Times New Roman" w:hAnsi="Calibri" w:cs="Calibri"/>
           <w:color w:val="333333"/>
@@ -3398,8 +3064,8 @@
           <w:ilvl w:val="1"/>
           <w:numId w:val="1"/>
         </w:numPr>
-        <w:spacing w:before="100" w:beforeAutospacing="1" w:after="75"/>
-        <w:divId w:val="993408356"/>
+        <w:spacing w:before="100" w:beforeAutospacing="1" w:after="60"/>
+        <w:divId w:val="2050448313"/>
         <w:rPr>
           <w:rFonts w:ascii="Calibri" w:eastAsia="Times New Roman" w:hAnsi="Calibri" w:cs="Calibri"/>
           <w:color w:val="333333"/>
@@ -3436,8 +3102,8 @@
           <w:ilvl w:val="1"/>
           <w:numId w:val="1"/>
         </w:numPr>
-        <w:spacing w:before="100" w:beforeAutospacing="1" w:after="75"/>
-        <w:divId w:val="993408356"/>
+        <w:spacing w:before="100" w:beforeAutospacing="1" w:after="60"/>
+        <w:divId w:val="2050448313"/>
         <w:rPr>
           <w:rFonts w:ascii="Calibri" w:eastAsia="Times New Roman" w:hAnsi="Calibri" w:cs="Calibri"/>
           <w:color w:val="333333"/>
@@ -3491,25 +3157,7 @@
           <w:color w:val="333333"/>
           <w:lang w:val="en"/>
         </w:rPr>
-        <w:t>step_number</w:t>
-      </w:r>
-      <w:r>
-        <w:rPr>
-          <w:rFonts w:ascii="Calibri" w:eastAsia="Times New Roman" w:hAnsi="Calibri" w:cs="Calibri"/>
-          <w:color w:val="333333"/>
-          <w:sz w:val="22"/>
-          <w:szCs w:val="22"/>
-          <w:lang w:val="en"/>
-        </w:rPr>
-        <w:t xml:space="preserve"> equals </w:t>
-      </w:r>
-      <w:r>
-        <w:rPr>
-          <w:rStyle w:val="HTMLCode"/>
-          <w:color w:val="333333"/>
-          <w:lang w:val="en"/>
-        </w:rPr>
-        <w:t>2</w:t>
+        <w:t>step_number = 2</w:t>
       </w:r>
       <w:r>
         <w:rPr>
@@ -3528,8 +3176,8 @@
           <w:ilvl w:val="1"/>
           <w:numId w:val="1"/>
         </w:numPr>
-        <w:spacing w:before="100" w:beforeAutospacing="1" w:after="75"/>
-        <w:divId w:val="993408356"/>
+        <w:spacing w:before="100" w:beforeAutospacing="1" w:after="60"/>
+        <w:divId w:val="2050448313"/>
         <w:rPr>
           <w:rFonts w:ascii="Calibri" w:eastAsia="Times New Roman" w:hAnsi="Calibri" w:cs="Calibri"/>
           <w:color w:val="333333"/>
@@ -3584,8 +3232,8 @@
           <w:ilvl w:val="1"/>
           <w:numId w:val="1"/>
         </w:numPr>
-        <w:spacing w:before="100" w:beforeAutospacing="1" w:after="75"/>
-        <w:divId w:val="993408356"/>
+        <w:spacing w:before="100" w:beforeAutospacing="1" w:after="60"/>
+        <w:divId w:val="2050448313"/>
         <w:rPr>
           <w:rFonts w:ascii="Calibri" w:eastAsia="Times New Roman" w:hAnsi="Calibri" w:cs="Calibri"/>
           <w:color w:val="333333"/>
@@ -3730,8 +3378,8 @@
           <w:ilvl w:val="0"/>
           <w:numId w:val="1"/>
         </w:numPr>
-        <w:spacing w:before="100" w:beforeAutospacing="1" w:after="75"/>
-        <w:divId w:val="993408356"/>
+        <w:spacing w:before="100" w:beforeAutospacing="1" w:after="60"/>
+        <w:divId w:val="2050448313"/>
         <w:rPr>
           <w:rFonts w:ascii="Calibri" w:eastAsia="Times New Roman" w:hAnsi="Calibri" w:cs="Calibri"/>
           <w:color w:val="333333"/>
@@ -3768,8 +3416,8 @@
           <w:ilvl w:val="1"/>
           <w:numId w:val="1"/>
         </w:numPr>
-        <w:spacing w:before="100" w:beforeAutospacing="1" w:after="75"/>
-        <w:divId w:val="993408356"/>
+        <w:spacing w:before="100" w:beforeAutospacing="1" w:after="60"/>
+        <w:divId w:val="2050448313"/>
         <w:rPr>
           <w:rFonts w:ascii="Calibri" w:eastAsia="Times New Roman" w:hAnsi="Calibri" w:cs="Calibri"/>
           <w:color w:val="333333"/>
@@ -3797,7 +3445,7 @@
           <w:szCs w:val="22"/>
           <w:lang w:val="en"/>
         </w:rPr>
-        <w:t xml:space="preserve"> When the back-end returns a successful response confirming the appointment, and the site displays the "Thank You" checkmark or screen.</w:t>
+        <w:t xml:space="preserve"> When the back-end returns a successful response confirming the appointment, and the site displays the "Thank You" screen.</w:t>
       </w:r>
     </w:p>
     <w:p>
@@ -3806,8 +3454,8 @@
           <w:ilvl w:val="1"/>
           <w:numId w:val="1"/>
         </w:numPr>
-        <w:spacing w:before="100" w:beforeAutospacing="1" w:after="75"/>
-        <w:divId w:val="993408356"/>
+        <w:spacing w:before="100" w:beforeAutospacing="1" w:after="60"/>
+        <w:divId w:val="2050448313"/>
         <w:rPr>
           <w:rFonts w:ascii="Calibri" w:eastAsia="Times New Roman" w:hAnsi="Calibri" w:cs="Calibri"/>
           <w:color w:val="333333"/>
@@ -3862,8 +3510,8 @@
           <w:ilvl w:val="1"/>
           <w:numId w:val="1"/>
         </w:numPr>
-        <w:spacing w:before="100" w:beforeAutospacing="1" w:after="75"/>
-        <w:divId w:val="993408356"/>
+        <w:spacing w:before="100" w:beforeAutospacing="1" w:after="60"/>
+        <w:divId w:val="2050448313"/>
         <w:rPr>
           <w:rFonts w:ascii="Calibri" w:eastAsia="Times New Roman" w:hAnsi="Calibri" w:cs="Calibri"/>
           <w:color w:val="333333"/>
@@ -3918,8 +3566,8 @@
           <w:ilvl w:val="1"/>
           <w:numId w:val="1"/>
         </w:numPr>
-        <w:spacing w:before="100" w:beforeAutospacing="1" w:after="75"/>
-        <w:divId w:val="993408356"/>
+        <w:spacing w:before="100" w:beforeAutospacing="1" w:after="60"/>
+        <w:divId w:val="2050448313"/>
         <w:rPr>
           <w:rFonts w:ascii="Calibri" w:eastAsia="Times New Roman" w:hAnsi="Calibri" w:cs="Calibri"/>
           <w:color w:val="333333"/>
@@ -4043,7 +3691,7 @@
     <w:p>
       <w:pPr>
         <w:pStyle w:val="Heading2"/>
-        <w:divId w:val="993408356"/>
+        <w:divId w:val="2050448313"/>
         <w:rPr>
           <w:rFonts w:ascii="Calibri" w:eastAsia="Times New Roman" w:hAnsi="Calibri" w:cs="Calibri"/>
           <w:lang w:val="en"/>
@@ -4060,7 +3708,7 @@
     <w:p>
       <w:pPr>
         <w:pStyle w:val="Heading3"/>
-        <w:divId w:val="993408356"/>
+        <w:divId w:val="2050448313"/>
         <w:rPr>
           <w:rFonts w:ascii="Calibri" w:eastAsia="Times New Roman" w:hAnsi="Calibri" w:cs="Calibri"/>
           <w:lang w:val="en"/>
@@ -4077,7 +3725,7 @@
     <w:p>
       <w:pPr>
         <w:pStyle w:val="HTMLPreformatted"/>
-        <w:divId w:val="993408356"/>
+        <w:divId w:val="2050448313"/>
         <w:rPr>
           <w:color w:val="333333"/>
           <w:lang w:val="en"/>
@@ -4094,7 +3742,7 @@
     <w:p>
       <w:pPr>
         <w:pStyle w:val="HTMLPreformatted"/>
-        <w:divId w:val="993408356"/>
+        <w:divId w:val="2050448313"/>
         <w:rPr>
           <w:color w:val="333333"/>
           <w:lang w:val="en"/>
@@ -4111,7 +3759,7 @@
     <w:p>
       <w:pPr>
         <w:pStyle w:val="HTMLPreformatted"/>
-        <w:divId w:val="993408356"/>
+        <w:divId w:val="2050448313"/>
         <w:rPr>
           <w:color w:val="333333"/>
           <w:lang w:val="en"/>
@@ -4128,7 +3776,7 @@
     <w:p>
       <w:pPr>
         <w:pStyle w:val="HTMLPreformatted"/>
-        <w:divId w:val="993408356"/>
+        <w:divId w:val="2050448313"/>
         <w:rPr>
           <w:color w:val="333333"/>
           <w:lang w:val="en"/>
@@ -4145,7 +3793,7 @@
     <w:p>
       <w:pPr>
         <w:pStyle w:val="HTMLPreformatted"/>
-        <w:divId w:val="993408356"/>
+        <w:divId w:val="2050448313"/>
         <w:rPr>
           <w:color w:val="333333"/>
           <w:lang w:val="en"/>
@@ -4162,7 +3810,7 @@
     <w:p>
       <w:pPr>
         <w:pStyle w:val="HTMLPreformatted"/>
-        <w:divId w:val="993408356"/>
+        <w:divId w:val="2050448313"/>
         <w:rPr>
           <w:color w:val="333333"/>
           <w:lang w:val="en"/>
@@ -4179,7 +3827,7 @@
     <w:p>
       <w:pPr>
         <w:pStyle w:val="HTMLPreformatted"/>
-        <w:divId w:val="993408356"/>
+        <w:divId w:val="2050448313"/>
         <w:rPr>
           <w:color w:val="333333"/>
           <w:lang w:val="en"/>
@@ -4196,7 +3844,7 @@
     <w:p>
       <w:pPr>
         <w:pStyle w:val="HTMLPreformatted"/>
-        <w:divId w:val="993408356"/>
+        <w:divId w:val="2050448313"/>
         <w:rPr>
           <w:color w:val="333333"/>
           <w:lang w:val="en"/>
@@ -4213,7 +3861,7 @@
     <w:p>
       <w:pPr>
         <w:pStyle w:val="HTMLPreformatted"/>
-        <w:divId w:val="993408356"/>
+        <w:divId w:val="2050448313"/>
         <w:rPr>
           <w:color w:val="333333"/>
           <w:lang w:val="en"/>
@@ -4230,7 +3878,7 @@
     <w:p>
       <w:pPr>
         <w:pStyle w:val="HTMLPreformatted"/>
-        <w:divId w:val="993408356"/>
+        <w:divId w:val="2050448313"/>
         <w:rPr>
           <w:color w:val="333333"/>
           <w:lang w:val="en"/>
@@ -4247,24 +3895,31 @@
     <w:p>
       <w:pPr>
         <w:pStyle w:val="Heading3"/>
-        <w:divId w:val="993408356"/>
-        <w:rPr>
-          <w:rFonts w:ascii="Calibri" w:eastAsia="Times New Roman" w:hAnsi="Calibri" w:cs="Calibri"/>
-          <w:lang w:val="en"/>
-        </w:rPr>
-      </w:pPr>
-      <w:r>
-        <w:rPr>
-          <w:rFonts w:ascii="Calibri" w:eastAsia="Times New Roman" w:hAnsi="Calibri" w:cs="Calibri"/>
-          <w:lang w:val="en"/>
-        </w:rPr>
-        <w:t>Step 2 Complete (Contact Info &amp; Preferred Date Entered)</w:t>
+        <w:divId w:val="2050448313"/>
+        <w:rPr>
+          <w:rFonts w:ascii="Calibri" w:eastAsia="Times New Roman" w:hAnsi="Calibri" w:cs="Calibri"/>
+          <w:lang w:val="en"/>
+        </w:rPr>
+      </w:pPr>
+      <w:r>
+        <w:rPr>
+          <w:rFonts w:ascii="Calibri" w:eastAsia="Times New Roman" w:hAnsi="Calibri" w:cs="Calibri"/>
+          <w:lang w:val="en"/>
+        </w:rPr>
+        <w:t xml:space="preserve">Step 2 Complete (Contact Info &amp; </w:t>
+      </w:r>
+      <w:r>
+        <w:rPr>
+          <w:rFonts w:ascii="Calibri" w:eastAsia="Times New Roman" w:hAnsi="Calibri" w:cs="Calibri"/>
+          <w:lang w:val="en"/>
+        </w:rPr>
+        <w:t>Preferred Date Entered)</w:t>
       </w:r>
     </w:p>
     <w:p>
       <w:pPr>
         <w:pStyle w:val="HTMLPreformatted"/>
-        <w:divId w:val="993408356"/>
+        <w:divId w:val="2050448313"/>
         <w:rPr>
           <w:color w:val="333333"/>
           <w:lang w:val="en"/>
@@ -4281,7 +3936,7 @@
     <w:p>
       <w:pPr>
         <w:pStyle w:val="HTMLPreformatted"/>
-        <w:divId w:val="993408356"/>
+        <w:divId w:val="2050448313"/>
         <w:rPr>
           <w:color w:val="333333"/>
           <w:lang w:val="en"/>
@@ -4298,7 +3953,7 @@
     <w:p>
       <w:pPr>
         <w:pStyle w:val="HTMLPreformatted"/>
-        <w:divId w:val="993408356"/>
+        <w:divId w:val="2050448313"/>
         <w:rPr>
           <w:color w:val="333333"/>
           <w:lang w:val="en"/>
@@ -4315,7 +3970,7 @@
     <w:p>
       <w:pPr>
         <w:pStyle w:val="HTMLPreformatted"/>
-        <w:divId w:val="993408356"/>
+        <w:divId w:val="2050448313"/>
         <w:rPr>
           <w:color w:val="333333"/>
           <w:lang w:val="en"/>
@@ -4332,7 +3987,7 @@
     <w:p>
       <w:pPr>
         <w:pStyle w:val="HTMLPreformatted"/>
-        <w:divId w:val="993408356"/>
+        <w:divId w:val="2050448313"/>
         <w:rPr>
           <w:color w:val="333333"/>
           <w:lang w:val="en"/>
@@ -4349,7 +4004,7 @@
     <w:p>
       <w:pPr>
         <w:pStyle w:val="HTMLPreformatted"/>
-        <w:divId w:val="993408356"/>
+        <w:divId w:val="2050448313"/>
         <w:rPr>
           <w:color w:val="333333"/>
           <w:lang w:val="en"/>
@@ -4366,7 +4021,7 @@
     <w:p>
       <w:pPr>
         <w:pStyle w:val="HTMLPreformatted"/>
-        <w:divId w:val="993408356"/>
+        <w:divId w:val="2050448313"/>
         <w:rPr>
           <w:color w:val="333333"/>
           <w:lang w:val="en"/>
@@ -4383,7 +4038,7 @@
     <w:p>
       <w:pPr>
         <w:pStyle w:val="HTMLPreformatted"/>
-        <w:divId w:val="993408356"/>
+        <w:divId w:val="2050448313"/>
         <w:rPr>
           <w:color w:val="333333"/>
           <w:lang w:val="en"/>
@@ -4400,7 +4055,7 @@
     <w:p>
       <w:pPr>
         <w:pStyle w:val="HTMLPreformatted"/>
-        <w:divId w:val="993408356"/>
+        <w:divId w:val="2050448313"/>
         <w:rPr>
           <w:color w:val="333333"/>
           <w:lang w:val="en"/>
@@ -4417,7 +4072,7 @@
     <w:p>
       <w:pPr>
         <w:pStyle w:val="HTMLPreformatted"/>
-        <w:divId w:val="993408356"/>
+        <w:divId w:val="2050448313"/>
         <w:rPr>
           <w:color w:val="333333"/>
           <w:lang w:val="en"/>
@@ -4434,7 +4089,7 @@
     <w:p>
       <w:pPr>
         <w:pStyle w:val="HTMLPreformatted"/>
-        <w:divId w:val="993408356"/>
+        <w:divId w:val="2050448313"/>
         <w:rPr>
           <w:color w:val="333333"/>
           <w:lang w:val="en"/>
@@ -4451,7 +4106,7 @@
     <w:p>
       <w:pPr>
         <w:pStyle w:val="HTMLPreformatted"/>
-        <w:divId w:val="993408356"/>
+        <w:divId w:val="2050448313"/>
         <w:rPr>
           <w:color w:val="333333"/>
           <w:lang w:val="en"/>
@@ -4468,7 +4123,7 @@
     <w:p>
       <w:pPr>
         <w:pStyle w:val="HTMLPreformatted"/>
-        <w:divId w:val="993408356"/>
+        <w:divId w:val="2050448313"/>
         <w:rPr>
           <w:color w:val="333333"/>
           <w:lang w:val="en"/>
@@ -4492,7 +4147,7 @@
     <w:p>
       <w:pPr>
         <w:pStyle w:val="HTMLPreformatted"/>
-        <w:divId w:val="993408356"/>
+        <w:divId w:val="2050448313"/>
         <w:rPr>
           <w:color w:val="333333"/>
           <w:lang w:val="en"/>
@@ -4509,7 +4164,7 @@
     <w:p>
       <w:pPr>
         <w:pStyle w:val="HTMLPreformatted"/>
-        <w:divId w:val="993408356"/>
+        <w:divId w:val="2050448313"/>
         <w:rPr>
           <w:color w:val="333333"/>
           <w:lang w:val="en"/>
@@ -4526,7 +4181,7 @@
     <w:p>
       <w:pPr>
         <w:pStyle w:val="Heading3"/>
-        <w:divId w:val="993408356"/>
+        <w:divId w:val="2050448313"/>
         <w:rPr>
           <w:rFonts w:ascii="Calibri" w:eastAsia="Times New Roman" w:hAnsi="Calibri" w:cs="Calibri"/>
           <w:lang w:val="en"/>
@@ -4543,7 +4198,7 @@
     <w:p>
       <w:pPr>
         <w:pStyle w:val="HTMLPreformatted"/>
-        <w:divId w:val="993408356"/>
+        <w:divId w:val="2050448313"/>
         <w:rPr>
           <w:color w:val="333333"/>
           <w:lang w:val="en"/>
@@ -4560,7 +4215,7 @@
     <w:p>
       <w:pPr>
         <w:pStyle w:val="HTMLPreformatted"/>
-        <w:divId w:val="993408356"/>
+        <w:divId w:val="2050448313"/>
         <w:rPr>
           <w:color w:val="333333"/>
           <w:lang w:val="en"/>
@@ -4577,7 +4232,7 @@
     <w:p>
       <w:pPr>
         <w:pStyle w:val="HTMLPreformatted"/>
-        <w:divId w:val="993408356"/>
+        <w:divId w:val="2050448313"/>
         <w:rPr>
           <w:color w:val="333333"/>
           <w:lang w:val="en"/>
@@ -4594,7 +4249,7 @@
     <w:p>
       <w:pPr>
         <w:pStyle w:val="HTMLPreformatted"/>
-        <w:divId w:val="993408356"/>
+        <w:divId w:val="2050448313"/>
         <w:rPr>
           <w:color w:val="333333"/>
           <w:lang w:val="en"/>
@@ -4611,7 +4266,7 @@
     <w:p>
       <w:pPr>
         <w:pStyle w:val="HTMLPreformatted"/>
-        <w:divId w:val="993408356"/>
+        <w:divId w:val="2050448313"/>
         <w:rPr>
           <w:color w:val="333333"/>
           <w:lang w:val="en"/>
@@ -4628,7 +4283,7 @@
     <w:p>
       <w:pPr>
         <w:pStyle w:val="HTMLPreformatted"/>
-        <w:divId w:val="993408356"/>
+        <w:divId w:val="2050448313"/>
         <w:rPr>
           <w:color w:val="333333"/>
           <w:lang w:val="en"/>
@@ -4645,7 +4300,7 @@
     <w:p>
       <w:pPr>
         <w:pStyle w:val="HTMLPreformatted"/>
-        <w:divId w:val="993408356"/>
+        <w:divId w:val="2050448313"/>
         <w:rPr>
           <w:color w:val="333333"/>
           <w:lang w:val="en"/>
@@ -4662,7 +4317,7 @@
     <w:p>
       <w:pPr>
         <w:pStyle w:val="HTMLPreformatted"/>
-        <w:divId w:val="993408356"/>
+        <w:divId w:val="2050448313"/>
         <w:rPr>
           <w:color w:val="333333"/>
           <w:lang w:val="en"/>
@@ -4679,7 +4334,7 @@
     <w:p>
       <w:pPr>
         <w:pStyle w:val="HTMLPreformatted"/>
-        <w:divId w:val="993408356"/>
+        <w:divId w:val="2050448313"/>
         <w:rPr>
           <w:color w:val="333333"/>
           <w:lang w:val="en"/>
@@ -4696,7 +4351,7 @@
     <w:p>
       <w:pPr>
         <w:pStyle w:val="HTMLPreformatted"/>
-        <w:divId w:val="993408356"/>
+        <w:divId w:val="2050448313"/>
         <w:rPr>
           <w:color w:val="333333"/>
           <w:lang w:val="en"/>
@@ -4720,7 +4375,7 @@
     <w:p>
       <w:pPr>
         <w:pStyle w:val="HTMLPreformatted"/>
-        <w:divId w:val="993408356"/>
+        <w:divId w:val="2050448313"/>
         <w:rPr>
           <w:color w:val="333333"/>
           <w:lang w:val="en"/>
@@ -4737,7 +4392,7 @@
     <w:p>
       <w:pPr>
         <w:pStyle w:val="HTMLPreformatted"/>
-        <w:divId w:val="993408356"/>
+        <w:divId w:val="2050448313"/>
         <w:rPr>
           <w:color w:val="333333"/>
           <w:lang w:val="en"/>
@@ -4754,7 +4409,7 @@
     <w:p>
       <w:pPr>
         <w:pStyle w:val="HTMLPreformatted"/>
-        <w:divId w:val="993408356"/>
+        <w:divId w:val="2050448313"/>
         <w:rPr>
           <w:color w:val="333333"/>
           <w:lang w:val="en"/>
@@ -4771,7 +4426,7 @@
     <w:p>
       <w:pPr>
         <w:pStyle w:val="Heading2"/>
-        <w:divId w:val="993408356"/>
+        <w:divId w:val="2050448313"/>
         <w:rPr>
           <w:rFonts w:ascii="Calibri" w:eastAsia="Times New Roman" w:hAnsi="Calibri" w:cs="Calibri"/>
           <w:lang w:val="en"/>
@@ -4788,7 +4443,7 @@
     <w:p>
       <w:pPr>
         <w:pStyle w:val="NormalWeb"/>
-        <w:divId w:val="993408356"/>
+        <w:divId w:val="2050448313"/>
         <w:rPr>
           <w:rFonts w:ascii="Calibri" w:hAnsi="Calibri" w:cs="Calibri"/>
           <w:color w:val="333333"/>
@@ -4810,8 +4465,8 @@
           <w:ilvl w:val="0"/>
           <w:numId w:val="2"/>
         </w:numPr>
-        <w:spacing w:before="100" w:beforeAutospacing="1" w:after="75"/>
-        <w:divId w:val="993408356"/>
+        <w:spacing w:before="100" w:beforeAutospacing="1" w:after="60"/>
+        <w:divId w:val="2050448313"/>
         <w:rPr>
           <w:rFonts w:ascii="Calibri" w:eastAsia="Times New Roman" w:hAnsi="Calibri" w:cs="Calibri"/>
           <w:color w:val="333333"/>
@@ -5028,8 +4683,8 @@
           <w:ilvl w:val="0"/>
           <w:numId w:val="2"/>
         </w:numPr>
-        <w:spacing w:before="100" w:beforeAutospacing="1" w:after="75"/>
-        <w:divId w:val="993408356"/>
+        <w:spacing w:before="100" w:beforeAutospacing="1" w:after="60"/>
+        <w:divId w:val="2050448313"/>
         <w:rPr>
           <w:rFonts w:ascii="Calibri" w:eastAsia="Times New Roman" w:hAnsi="Calibri" w:cs="Calibri"/>
           <w:color w:val="333333"/>
@@ -5120,8 +4775,8 @@
           <w:ilvl w:val="0"/>
           <w:numId w:val="2"/>
         </w:numPr>
-        <w:spacing w:before="100" w:beforeAutospacing="1" w:after="75"/>
-        <w:divId w:val="993408356"/>
+        <w:spacing w:before="100" w:beforeAutospacing="1" w:after="60"/>
+        <w:divId w:val="2050448313"/>
         <w:rPr>
           <w:rFonts w:ascii="Calibri" w:eastAsia="Times New Roman" w:hAnsi="Calibri" w:cs="Calibri"/>
           <w:color w:val="333333"/>
@@ -5158,8 +4813,8 @@
           <w:ilvl w:val="1"/>
           <w:numId w:val="2"/>
         </w:numPr>
-        <w:spacing w:before="100" w:beforeAutospacing="1" w:after="75"/>
-        <w:divId w:val="993408356"/>
+        <w:spacing w:before="100" w:beforeAutospacing="1" w:after="60"/>
+        <w:divId w:val="2050448313"/>
         <w:rPr>
           <w:rFonts w:ascii="Calibri" w:eastAsia="Times New Roman" w:hAnsi="Calibri" w:cs="Calibri"/>
           <w:color w:val="333333"/>
@@ -5196,8 +4851,8 @@
           <w:ilvl w:val="1"/>
           <w:numId w:val="2"/>
         </w:numPr>
-        <w:spacing w:before="100" w:beforeAutospacing="1" w:after="75"/>
-        <w:divId w:val="993408356"/>
+        <w:spacing w:before="100" w:beforeAutospacing="1" w:after="60"/>
+        <w:divId w:val="2050448313"/>
         <w:rPr>
           <w:rFonts w:ascii="Calibri" w:eastAsia="Times New Roman" w:hAnsi="Calibri" w:cs="Calibri"/>
           <w:color w:val="333333"/>
@@ -5270,8 +4925,8 @@
           <w:ilvl w:val="1"/>
           <w:numId w:val="2"/>
         </w:numPr>
-        <w:spacing w:before="100" w:beforeAutospacing="1" w:after="75"/>
-        <w:divId w:val="993408356"/>
+        <w:spacing w:before="100" w:beforeAutospacing="1" w:after="60"/>
+        <w:divId w:val="2050448313"/>
         <w:rPr>
           <w:rFonts w:ascii="Calibri" w:eastAsia="Times New Roman" w:hAnsi="Calibri" w:cs="Calibri"/>
           <w:color w:val="333333"/>
@@ -5344,8 +4999,8 @@
           <w:ilvl w:val="1"/>
           <w:numId w:val="2"/>
         </w:numPr>
-        <w:spacing w:before="100" w:beforeAutospacing="1" w:after="75"/>
-        <w:divId w:val="993408356"/>
+        <w:spacing w:before="100" w:beforeAutospacing="1" w:after="60"/>
+        <w:divId w:val="2050448313"/>
         <w:rPr>
           <w:rFonts w:ascii="Calibri" w:eastAsia="Times New Roman" w:hAnsi="Calibri" w:cs="Calibri"/>
           <w:color w:val="333333"/>
@@ -5418,8 +5073,8 @@
           <w:ilvl w:val="0"/>
           <w:numId w:val="2"/>
         </w:numPr>
-        <w:spacing w:before="100" w:beforeAutospacing="1" w:after="75"/>
-        <w:divId w:val="993408356"/>
+        <w:spacing w:before="100" w:beforeAutospacing="1" w:after="60"/>
+        <w:divId w:val="2050448313"/>
         <w:rPr>
           <w:rFonts w:ascii="Calibri" w:eastAsia="Times New Roman" w:hAnsi="Calibri" w:cs="Calibri"/>
           <w:color w:val="333333"/>
@@ -5471,7 +5126,7 @@
     <w:p>
       <w:pPr>
         <w:pStyle w:val="Heading2"/>
-        <w:divId w:val="993408356"/>
+        <w:divId w:val="2050448313"/>
         <w:rPr>
           <w:rFonts w:ascii="Calibri" w:eastAsia="Times New Roman" w:hAnsi="Calibri" w:cs="Calibri"/>
           <w:lang w:val="en"/>
@@ -5488,7 +5143,7 @@
     <w:p>
       <w:pPr>
         <w:pStyle w:val="NormalWeb"/>
-        <w:divId w:val="993408356"/>
+        <w:divId w:val="2050448313"/>
         <w:rPr>
           <w:rFonts w:ascii="Calibri" w:hAnsi="Calibri" w:cs="Calibri"/>
           <w:color w:val="333333"/>
@@ -5527,8 +5182,8 @@
           <w:ilvl w:val="0"/>
           <w:numId w:val="3"/>
         </w:numPr>
-        <w:spacing w:before="100" w:beforeAutospacing="1" w:after="75"/>
-        <w:divId w:val="993408356"/>
+        <w:spacing w:before="100" w:beforeAutospacing="1" w:after="60"/>
+        <w:divId w:val="2050448313"/>
         <w:rPr>
           <w:rFonts w:ascii="Calibri" w:eastAsia="Times New Roman" w:hAnsi="Calibri" w:cs="Calibri"/>
           <w:color w:val="333333"/>
@@ -5583,8 +5238,8 @@
           <w:ilvl w:val="0"/>
           <w:numId w:val="3"/>
         </w:numPr>
-        <w:spacing w:before="100" w:beforeAutospacing="1" w:after="75"/>
-        <w:divId w:val="993408356"/>
+        <w:spacing w:before="100" w:beforeAutospacing="1" w:after="60"/>
+        <w:divId w:val="2050448313"/>
         <w:rPr>
           <w:rFonts w:ascii="Calibri" w:eastAsia="Times New Roman" w:hAnsi="Calibri" w:cs="Calibri"/>
           <w:color w:val="333333"/>
@@ -5639,8 +5294,8 @@
           <w:ilvl w:val="0"/>
           <w:numId w:val="3"/>
         </w:numPr>
-        <w:spacing w:before="100" w:beforeAutospacing="1" w:after="75"/>
-        <w:divId w:val="993408356"/>
+        <w:spacing w:before="100" w:beforeAutospacing="1" w:after="60"/>
+        <w:divId w:val="2050448313"/>
         <w:rPr>
           <w:rFonts w:ascii="Calibri" w:eastAsia="Times New Roman" w:hAnsi="Calibri" w:cs="Calibri"/>
           <w:color w:val="333333"/>
@@ -5713,8 +5368,8 @@
           <w:ilvl w:val="0"/>
           <w:numId w:val="3"/>
         </w:numPr>
-        <w:spacing w:before="100" w:beforeAutospacing="1" w:after="75"/>
-        <w:divId w:val="993408356"/>
+        <w:spacing w:before="100" w:beforeAutospacing="1" w:after="60"/>
+        <w:divId w:val="2050448313"/>
         <w:rPr>
           <w:rFonts w:ascii="Calibri" w:eastAsia="Times New Roman" w:hAnsi="Calibri" w:cs="Calibri"/>
           <w:color w:val="333333"/>
@@ -5787,8 +5442,8 @@
           <w:ilvl w:val="0"/>
           <w:numId w:val="3"/>
         </w:numPr>
-        <w:spacing w:before="100" w:beforeAutospacing="1" w:after="75"/>
-        <w:divId w:val="993408356"/>
+        <w:spacing w:before="100" w:beforeAutospacing="1" w:after="60"/>
+        <w:divId w:val="2050448313"/>
         <w:rPr>
           <w:rFonts w:ascii="Calibri" w:eastAsia="Times New Roman" w:hAnsi="Calibri" w:cs="Calibri"/>
           <w:color w:val="333333"/>
@@ -5840,7 +5495,7 @@
     <w:p>
       <w:pPr>
         <w:pStyle w:val="NormalWeb"/>
-        <w:divId w:val="993408356"/>
+        <w:divId w:val="2050448313"/>
         <w:rPr>
           <w:rFonts w:ascii="Calibri" w:hAnsi="Calibri" w:cs="Calibri"/>
           <w:color w:val="333333"/>
@@ -5876,7 +5531,7 @@
     <w:p>
       <w:pPr>
         <w:pStyle w:val="Heading2"/>
-        <w:divId w:val="993408356"/>
+        <w:divId w:val="2050448313"/>
         <w:rPr>
           <w:rFonts w:ascii="Calibri" w:eastAsia="Times New Roman" w:hAnsi="Calibri" w:cs="Calibri"/>
           <w:lang w:val="en"/>
@@ -5893,7 +5548,7 @@
     <w:p>
       <w:pPr>
         <w:pStyle w:val="NormalWeb"/>
-        <w:divId w:val="993408356"/>
+        <w:divId w:val="2050448313"/>
         <w:rPr>
           <w:rFonts w:ascii="Calibri" w:hAnsi="Calibri" w:cs="Calibri"/>
           <w:color w:val="333333"/>
@@ -5987,7 +5642,7 @@
       <w:pPr>
         <w:pStyle w:val="Heading1"/>
         <w:pageBreakBefore/>
-        <w:divId w:val="993408356"/>
+        <w:divId w:val="2050448313"/>
         <w:rPr>
           <w:rFonts w:ascii="Calibri" w:eastAsia="Times New Roman" w:hAnsi="Calibri" w:cs="Calibri"/>
           <w:lang w:val="en"/>
@@ -6004,7 +5659,7 @@
     <w:p>
       <w:pPr>
         <w:pStyle w:val="NormalWeb"/>
-        <w:divId w:val="993408356"/>
+        <w:divId w:val="2050448313"/>
         <w:rPr>
           <w:rFonts w:ascii="Calibri" w:hAnsi="Calibri" w:cs="Calibri"/>
           <w:color w:val="333333"/>
@@ -6023,7 +5678,7 @@
     <w:p>
       <w:pPr>
         <w:pStyle w:val="Heading2"/>
-        <w:divId w:val="993408356"/>
+        <w:divId w:val="2050448313"/>
         <w:rPr>
           <w:rFonts w:ascii="Calibri" w:eastAsia="Times New Roman" w:hAnsi="Calibri" w:cs="Calibri"/>
           <w:lang w:val="en"/>
@@ -6040,7 +5695,7 @@
     <w:p>
       <w:pPr>
         <w:pStyle w:val="NormalWeb"/>
-        <w:divId w:val="993408356"/>
+        <w:divId w:val="2050448313"/>
         <w:rPr>
           <w:rFonts w:ascii="Calibri" w:hAnsi="Calibri" w:cs="Calibri"/>
           <w:color w:val="333333"/>
@@ -6059,7 +5714,7 @@
     <w:p>
       <w:pPr>
         <w:pStyle w:val="NormalWeb"/>
-        <w:divId w:val="993408356"/>
+        <w:divId w:val="2050448313"/>
         <w:rPr>
           <w:rFonts w:ascii="Calibri" w:hAnsi="Calibri" w:cs="Calibri"/>
           <w:color w:val="333333"/>
@@ -6082,8 +5737,8 @@
           <w:ilvl w:val="0"/>
           <w:numId w:val="4"/>
         </w:numPr>
-        <w:spacing w:before="100" w:beforeAutospacing="1" w:after="75"/>
-        <w:divId w:val="993408356"/>
+        <w:spacing w:before="100" w:beforeAutospacing="1" w:after="60"/>
+        <w:divId w:val="2050448313"/>
         <w:rPr>
           <w:rFonts w:ascii="Calibri" w:eastAsia="Times New Roman" w:hAnsi="Calibri" w:cs="Calibri"/>
           <w:color w:val="333333"/>
@@ -6109,8 +5764,8 @@
           <w:ilvl w:val="0"/>
           <w:numId w:val="4"/>
         </w:numPr>
-        <w:spacing w:before="100" w:beforeAutospacing="1" w:after="75"/>
-        <w:divId w:val="993408356"/>
+        <w:spacing w:before="100" w:beforeAutospacing="1" w:after="60"/>
+        <w:divId w:val="2050448313"/>
         <w:rPr>
           <w:rFonts w:ascii="Calibri" w:eastAsia="Times New Roman" w:hAnsi="Calibri" w:cs="Calibri"/>
           <w:color w:val="333333"/>
@@ -6165,8 +5820,8 @@
           <w:ilvl w:val="0"/>
           <w:numId w:val="4"/>
         </w:numPr>
-        <w:spacing w:before="100" w:beforeAutospacing="1" w:after="75"/>
-        <w:divId w:val="993408356"/>
+        <w:spacing w:before="100" w:beforeAutospacing="1" w:after="60"/>
+        <w:divId w:val="2050448313"/>
         <w:rPr>
           <w:rFonts w:ascii="Calibri" w:eastAsia="Times New Roman" w:hAnsi="Calibri" w:cs="Calibri"/>
           <w:color w:val="333333"/>
@@ -6228,8 +5883,8 @@
           <w:ilvl w:val="0"/>
           <w:numId w:val="4"/>
         </w:numPr>
-        <w:spacing w:before="100" w:beforeAutospacing="1" w:after="75"/>
-        <w:divId w:val="993408356"/>
+        <w:spacing w:before="100" w:beforeAutospacing="1" w:after="60"/>
+        <w:divId w:val="2050448313"/>
         <w:rPr>
           <w:rFonts w:ascii="Calibri" w:eastAsia="Times New Roman" w:hAnsi="Calibri" w:cs="Calibri"/>
           <w:color w:val="333333"/>
@@ -6270,7 +5925,7 @@
     <w:p>
       <w:pPr>
         <w:pStyle w:val="Heading2"/>
-        <w:divId w:val="993408356"/>
+        <w:divId w:val="2050448313"/>
         <w:rPr>
           <w:rFonts w:ascii="Calibri" w:eastAsia="Times New Roman" w:hAnsi="Calibri" w:cs="Calibri"/>
           <w:lang w:val="en"/>
@@ -6287,7 +5942,7 @@
     <w:p>
       <w:pPr>
         <w:pStyle w:val="NormalWeb"/>
-        <w:divId w:val="993408356"/>
+        <w:divId w:val="2050448313"/>
         <w:rPr>
           <w:rFonts w:ascii="Calibri" w:hAnsi="Calibri" w:cs="Calibri"/>
           <w:color w:val="333333"/>
@@ -6306,7 +5961,7 @@
     <w:p>
       <w:pPr>
         <w:pStyle w:val="NormalWeb"/>
-        <w:divId w:val="993408356"/>
+        <w:divId w:val="2050448313"/>
         <w:rPr>
           <w:rFonts w:ascii="Calibri" w:hAnsi="Calibri" w:cs="Calibri"/>
           <w:color w:val="333333"/>
@@ -6342,7 +5997,7 @@
     <w:p>
       <w:pPr>
         <w:pStyle w:val="Heading2"/>
-        <w:divId w:val="993408356"/>
+        <w:divId w:val="2050448313"/>
         <w:rPr>
           <w:rFonts w:ascii="Calibri" w:eastAsia="Times New Roman" w:hAnsi="Calibri" w:cs="Calibri"/>
           <w:lang w:val="en"/>
@@ -6359,7 +6014,7 @@
     <w:p>
       <w:pPr>
         <w:pStyle w:val="NormalWeb"/>
-        <w:divId w:val="993408356"/>
+        <w:divId w:val="2050448313"/>
         <w:rPr>
           <w:rFonts w:ascii="Calibri" w:hAnsi="Calibri" w:cs="Calibri"/>
           <w:color w:val="333333"/>
@@ -6387,7 +6042,7 @@
     <w:p>
       <w:pPr>
         <w:pStyle w:val="NormalWeb"/>
-        <w:divId w:val="993408356"/>
+        <w:divId w:val="2050448313"/>
         <w:rPr>
           <w:rFonts w:ascii="Calibri" w:hAnsi="Calibri" w:cs="Calibri"/>
           <w:color w:val="333333"/>
@@ -6462,7 +6117,7 @@
     </w:p>
     <w:sectPr>
       <w:pgSz w:w="11906" w:h="16838"/>
-      <w:pgMar w:top="1440" w:right="1440" w:bottom="1440" w:left="1440" w:header="708" w:footer="708" w:gutter="0"/>
+      <w:pgMar w:top="720" w:right="720" w:bottom="720" w:left="720" w:header="708" w:footer="708" w:gutter="0"/>
       <w:cols w:space="708"/>
       <w:docGrid w:linePitch="360"/>
     </w:sectPr>
@@ -6473,9 +6128,9 @@
 <file path=word/numbering.xml><?xml version="1.0" encoding="utf-8"?>
 <w:numbering xmlns:wpc="http://schemas.microsoft.com/office/word/2010/wordprocessingCanvas" xmlns:cx="http://schemas.microsoft.com/office/drawing/2014/chartex" xmlns:cx1="http://schemas.microsoft.com/office/drawing/2015/9/8/chartex" xmlns:cx2="http://schemas.microsoft.com/office/drawing/2015/10/21/chartex" xmlns:cx3="http://schemas.microsoft.com/office/drawing/2016/5/9/chartex" xmlns:cx4="http://schemas.microsoft.com/office/drawing/2016/5/10/chartex" xmlns:cx5="http://schemas.microsoft.com/office/drawing/2016/5/11/chartex" xmlns:cx6="http://schemas.microsoft.com/office/drawing/2016/5/12/chartex" xmlns:cx7="http://schemas.microsoft.com/office/drawing/2016/5/13/chartex" xmlns:cx8="http://schemas.microsoft.com/office/drawing/2016/5/14/chartex" xmlns:mc="http://schemas.openxmlformats.org/markup-compatibility/2006" xmlns:aink="http://schemas.microsoft.com/office/drawing/2016/ink" xmlns:am3d="http://schemas.microsoft.com/office/drawing/2017/model3d" xmlns:o="urn:schemas-microsoft-com:office:office" xmlns:oel="http://schemas.microsoft.com/office/2019/extlst" xmlns:r="http://schemas.openxmlformats.org/officeDocument/2006/relationships" xmlns:m="http://schemas.openxmlformats.org/officeDocument/2006/math" xmlns:v="urn:schemas-microsoft-com:vml" xmlns:wp14="http://schemas.microsoft.com/office/word/2010/wordprocessingDrawing" xmlns:wp="http://schemas.openxmlformats.org/drawingml/2006/wordprocessingDrawing" xmlns:w10="urn:schemas-microsoft-com:office:word" xmlns:w="http://schemas.openxmlformats.org/wordprocessingml/2006/main" xmlns:w14="http://schemas.microsoft.com/office/word/2010/wordml" xmlns:w15="http://schemas.microsoft.com/office/word/2012/wordml" xmlns:w16cex="http://schemas.microsoft.com/office/word/2018/wordml/cex" xmlns:w16cid="http://schemas.microsoft.com/office/word/2016/wordml/cid" xmlns:w16="http://schemas.microsoft.com/office/word/2018/wordml" xmlns:w16du="http://schemas.microsoft.com/office/word/2023/wordml/word16du" xmlns:w16sdtdh="http://schemas.microsoft.com/office/word/2020/wordml/sdtdatahash" xmlns:w16sdtfl="http://schemas.microsoft.com/office/word/2024/wordml/sdtformatlock" xmlns:w16se="http://schemas.microsoft.com/office/word/2015/wordml/symex" xmlns:wpg="http://schemas.microsoft.com/office/word/2010/wordprocessingGroup" xmlns:wpi="http://schemas.microsoft.com/office/word/2010/wordprocessingInk" xmlns:wne="http://schemas.microsoft.com/office/word/2006/wordml" xmlns:wps="http://schemas.microsoft.com/office/word/2010/wordprocessingShape" mc:Ignorable="w14 w15 w16se w16cid w16 w16cex w16sdtdh w16sdtfl w16du wp14">
   <w:abstractNum w:abstractNumId="0" w15:restartNumberingAfterBreak="0">
-    <w:nsid w:val="01177799"/>
+    <w:nsid w:val="14EC457A"/>
     <w:multiLevelType w:val="multilevel"/>
-    <w:tmpl w:val="9A3A0850"/>
+    <w:tmpl w:val="160E6A42"/>
     <w:lvl w:ilvl="0">
       <w:start w:val="1"/>
       <w:numFmt w:val="bullet"/>
@@ -6622,9 +6277,9 @@
     </w:lvl>
   </w:abstractNum>
   <w:abstractNum w:abstractNumId="1" w15:restartNumberingAfterBreak="0">
-    <w:nsid w:val="043E66DC"/>
+    <w:nsid w:val="400C4BDA"/>
     <w:multiLevelType w:val="multilevel"/>
-    <w:tmpl w:val="92B004A4"/>
+    <w:tmpl w:val="8412082E"/>
     <w:lvl w:ilvl="0">
       <w:start w:val="1"/>
       <w:numFmt w:val="decimal"/>
@@ -6735,122 +6390,9 @@
     </w:lvl>
   </w:abstractNum>
   <w:abstractNum w:abstractNumId="2" w15:restartNumberingAfterBreak="0">
-    <w:nsid w:val="32AE0D1F"/>
+    <w:nsid w:val="4A5B4AB1"/>
     <w:multiLevelType w:val="multilevel"/>
-    <w:tmpl w:val="42A65E94"/>
-    <w:lvl w:ilvl="0">
-      <w:start w:val="1"/>
-      <w:numFmt w:val="decimal"/>
-      <w:lvlText w:val="%1."/>
-      <w:lvlJc w:val="left"/>
-      <w:pPr>
-        <w:tabs>
-          <w:tab w:val="num" w:pos="720"/>
-        </w:tabs>
-        <w:ind w:left="720" w:hanging="360"/>
-      </w:pPr>
-    </w:lvl>
-    <w:lvl w:ilvl="1" w:tentative="1">
-      <w:start w:val="1"/>
-      <w:numFmt w:val="decimal"/>
-      <w:lvlText w:val="%2."/>
-      <w:lvlJc w:val="left"/>
-      <w:pPr>
-        <w:tabs>
-          <w:tab w:val="num" w:pos="1440"/>
-        </w:tabs>
-        <w:ind w:left="1440" w:hanging="360"/>
-      </w:pPr>
-    </w:lvl>
-    <w:lvl w:ilvl="2" w:tentative="1">
-      <w:start w:val="1"/>
-      <w:numFmt w:val="decimal"/>
-      <w:lvlText w:val="%3."/>
-      <w:lvlJc w:val="left"/>
-      <w:pPr>
-        <w:tabs>
-          <w:tab w:val="num" w:pos="2160"/>
-        </w:tabs>
-        <w:ind w:left="2160" w:hanging="360"/>
-      </w:pPr>
-    </w:lvl>
-    <w:lvl w:ilvl="3" w:tentative="1">
-      <w:start w:val="1"/>
-      <w:numFmt w:val="decimal"/>
-      <w:lvlText w:val="%4."/>
-      <w:lvlJc w:val="left"/>
-      <w:pPr>
-        <w:tabs>
-          <w:tab w:val="num" w:pos="2880"/>
-        </w:tabs>
-        <w:ind w:left="2880" w:hanging="360"/>
-      </w:pPr>
-    </w:lvl>
-    <w:lvl w:ilvl="4" w:tentative="1">
-      <w:start w:val="1"/>
-      <w:numFmt w:val="decimal"/>
-      <w:lvlText w:val="%5."/>
-      <w:lvlJc w:val="left"/>
-      <w:pPr>
-        <w:tabs>
-          <w:tab w:val="num" w:pos="3600"/>
-        </w:tabs>
-        <w:ind w:left="3600" w:hanging="360"/>
-      </w:pPr>
-    </w:lvl>
-    <w:lvl w:ilvl="5" w:tentative="1">
-      <w:start w:val="1"/>
-      <w:numFmt w:val="decimal"/>
-      <w:lvlText w:val="%6."/>
-      <w:lvlJc w:val="left"/>
-      <w:pPr>
-        <w:tabs>
-          <w:tab w:val="num" w:pos="4320"/>
-        </w:tabs>
-        <w:ind w:left="4320" w:hanging="360"/>
-      </w:pPr>
-    </w:lvl>
-    <w:lvl w:ilvl="6" w:tentative="1">
-      <w:start w:val="1"/>
-      <w:numFmt w:val="decimal"/>
-      <w:lvlText w:val="%7."/>
-      <w:lvlJc w:val="left"/>
-      <w:pPr>
-        <w:tabs>
-          <w:tab w:val="num" w:pos="5040"/>
-        </w:tabs>
-        <w:ind w:left="5040" w:hanging="360"/>
-      </w:pPr>
-    </w:lvl>
-    <w:lvl w:ilvl="7" w:tentative="1">
-      <w:start w:val="1"/>
-      <w:numFmt w:val="decimal"/>
-      <w:lvlText w:val="%8."/>
-      <w:lvlJc w:val="left"/>
-      <w:pPr>
-        <w:tabs>
-          <w:tab w:val="num" w:pos="5760"/>
-        </w:tabs>
-        <w:ind w:left="5760" w:hanging="360"/>
-      </w:pPr>
-    </w:lvl>
-    <w:lvl w:ilvl="8" w:tentative="1">
-      <w:start w:val="1"/>
-      <w:numFmt w:val="decimal"/>
-      <w:lvlText w:val="%9."/>
-      <w:lvlJc w:val="left"/>
-      <w:pPr>
-        <w:tabs>
-          <w:tab w:val="num" w:pos="6480"/>
-        </w:tabs>
-        <w:ind w:left="6480" w:hanging="360"/>
-      </w:pPr>
-    </w:lvl>
-  </w:abstractNum>
-  <w:abstractNum w:abstractNumId="3" w15:restartNumberingAfterBreak="0">
-    <w:nsid w:val="49EE6323"/>
-    <w:multiLevelType w:val="multilevel"/>
-    <w:tmpl w:val="05EA25EE"/>
+    <w:tmpl w:val="5CEA0C1C"/>
     <w:lvl w:ilvl="0">
       <w:start w:val="1"/>
       <w:numFmt w:val="bullet"/>
@@ -6996,16 +6538,129 @@
       </w:rPr>
     </w:lvl>
   </w:abstractNum>
-  <w:num w:numId="1" w16cid:durableId="331106417">
+  <w:abstractNum w:abstractNumId="3" w15:restartNumberingAfterBreak="0">
+    <w:nsid w:val="651E6D6C"/>
+    <w:multiLevelType w:val="multilevel"/>
+    <w:tmpl w:val="308256BA"/>
+    <w:lvl w:ilvl="0">
+      <w:start w:val="1"/>
+      <w:numFmt w:val="decimal"/>
+      <w:lvlText w:val="%1."/>
+      <w:lvlJc w:val="left"/>
+      <w:pPr>
+        <w:tabs>
+          <w:tab w:val="num" w:pos="720"/>
+        </w:tabs>
+        <w:ind w:left="720" w:hanging="360"/>
+      </w:pPr>
+    </w:lvl>
+    <w:lvl w:ilvl="1" w:tentative="1">
+      <w:start w:val="1"/>
+      <w:numFmt w:val="decimal"/>
+      <w:lvlText w:val="%2."/>
+      <w:lvlJc w:val="left"/>
+      <w:pPr>
+        <w:tabs>
+          <w:tab w:val="num" w:pos="1440"/>
+        </w:tabs>
+        <w:ind w:left="1440" w:hanging="360"/>
+      </w:pPr>
+    </w:lvl>
+    <w:lvl w:ilvl="2" w:tentative="1">
+      <w:start w:val="1"/>
+      <w:numFmt w:val="decimal"/>
+      <w:lvlText w:val="%3."/>
+      <w:lvlJc w:val="left"/>
+      <w:pPr>
+        <w:tabs>
+          <w:tab w:val="num" w:pos="2160"/>
+        </w:tabs>
+        <w:ind w:left="2160" w:hanging="360"/>
+      </w:pPr>
+    </w:lvl>
+    <w:lvl w:ilvl="3" w:tentative="1">
+      <w:start w:val="1"/>
+      <w:numFmt w:val="decimal"/>
+      <w:lvlText w:val="%4."/>
+      <w:lvlJc w:val="left"/>
+      <w:pPr>
+        <w:tabs>
+          <w:tab w:val="num" w:pos="2880"/>
+        </w:tabs>
+        <w:ind w:left="2880" w:hanging="360"/>
+      </w:pPr>
+    </w:lvl>
+    <w:lvl w:ilvl="4" w:tentative="1">
+      <w:start w:val="1"/>
+      <w:numFmt w:val="decimal"/>
+      <w:lvlText w:val="%5."/>
+      <w:lvlJc w:val="left"/>
+      <w:pPr>
+        <w:tabs>
+          <w:tab w:val="num" w:pos="3600"/>
+        </w:tabs>
+        <w:ind w:left="3600" w:hanging="360"/>
+      </w:pPr>
+    </w:lvl>
+    <w:lvl w:ilvl="5" w:tentative="1">
+      <w:start w:val="1"/>
+      <w:numFmt w:val="decimal"/>
+      <w:lvlText w:val="%6."/>
+      <w:lvlJc w:val="left"/>
+      <w:pPr>
+        <w:tabs>
+          <w:tab w:val="num" w:pos="4320"/>
+        </w:tabs>
+        <w:ind w:left="4320" w:hanging="360"/>
+      </w:pPr>
+    </w:lvl>
+    <w:lvl w:ilvl="6" w:tentative="1">
+      <w:start w:val="1"/>
+      <w:numFmt w:val="decimal"/>
+      <w:lvlText w:val="%7."/>
+      <w:lvlJc w:val="left"/>
+      <w:pPr>
+        <w:tabs>
+          <w:tab w:val="num" w:pos="5040"/>
+        </w:tabs>
+        <w:ind w:left="5040" w:hanging="360"/>
+      </w:pPr>
+    </w:lvl>
+    <w:lvl w:ilvl="7" w:tentative="1">
+      <w:start w:val="1"/>
+      <w:numFmt w:val="decimal"/>
+      <w:lvlText w:val="%8."/>
+      <w:lvlJc w:val="left"/>
+      <w:pPr>
+        <w:tabs>
+          <w:tab w:val="num" w:pos="5760"/>
+        </w:tabs>
+        <w:ind w:left="5760" w:hanging="360"/>
+      </w:pPr>
+    </w:lvl>
+    <w:lvl w:ilvl="8" w:tentative="1">
+      <w:start w:val="1"/>
+      <w:numFmt w:val="decimal"/>
+      <w:lvlText w:val="%9."/>
+      <w:lvlJc w:val="left"/>
+      <w:pPr>
+        <w:tabs>
+          <w:tab w:val="num" w:pos="6480"/>
+        </w:tabs>
+        <w:ind w:left="6480" w:hanging="360"/>
+      </w:pPr>
+    </w:lvl>
+  </w:abstractNum>
+  <w:num w:numId="1" w16cid:durableId="2052613213">
+    <w:abstractNumId w:val="2"/>
+  </w:num>
+  <w:num w:numId="2" w16cid:durableId="1589849093">
     <w:abstractNumId w:val="0"/>
   </w:num>
-  <w:num w:numId="2" w16cid:durableId="1400513419">
+  <w:num w:numId="3" w16cid:durableId="969240871">
     <w:abstractNumId w:val="3"/>
   </w:num>
-  <w:num w:numId="3" w16cid:durableId="1789860094">
-    <w:abstractNumId w:val="2"/>
-  </w:num>
-  <w:num w:numId="4" w16cid:durableId="1121144728">
+  <w:num w:numId="4" w16cid:durableId="550844602">
     <w:abstractNumId w:val="1"/>
   </w:num>
 </w:numbering>
@@ -7417,9 +7072,9 @@
     <w:qFormat/>
     <w:pPr>
       <w:pBdr>
-        <w:bottom w:val="single" w:sz="12" w:space="8" w:color="1E3A8A"/>
+        <w:bottom w:val="single" w:sz="12" w:space="6" w:color="1E3A8A"/>
       </w:pBdr>
-      <w:spacing w:before="450" w:after="100" w:afterAutospacing="1"/>
+      <w:spacing w:before="375" w:after="100" w:afterAutospacing="1"/>
       <w:outlineLvl w:val="0"/>
     </w:pPr>
     <w:rPr>
@@ -7427,8 +7082,8 @@
       <w:bCs/>
       <w:color w:val="1E3A8A"/>
       <w:kern w:val="36"/>
-      <w:sz w:val="48"/>
-      <w:szCs w:val="48"/>
+      <w:sz w:val="44"/>
+      <w:szCs w:val="44"/>
     </w:rPr>
   </w:style>
   <w:style w:type="paragraph" w:styleId="Heading2">
@@ -7439,17 +7094,17 @@
     <w:qFormat/>
     <w:pPr>
       <w:pBdr>
-        <w:bottom w:val="single" w:sz="6" w:space="4" w:color="E2E8F0"/>
+        <w:bottom w:val="single" w:sz="6" w:space="3" w:color="E2E8F0"/>
       </w:pBdr>
-      <w:spacing w:before="300" w:after="100" w:afterAutospacing="1"/>
+      <w:spacing w:before="270" w:after="100" w:afterAutospacing="1"/>
       <w:outlineLvl w:val="1"/>
     </w:pPr>
     <w:rPr>
       <w:b/>
       <w:bCs/>
       <w:color w:val="2563EB"/>
-      <w:sz w:val="32"/>
-      <w:szCs w:val="32"/>
+      <w:sz w:val="30"/>
+      <w:szCs w:val="30"/>
     </w:rPr>
   </w:style>
   <w:style w:type="paragraph" w:styleId="Heading3">
@@ -7459,15 +7114,13 @@
     <w:uiPriority w:val="9"/>
     <w:qFormat/>
     <w:pPr>
-      <w:spacing w:before="225" w:after="100" w:afterAutospacing="1"/>
+      <w:spacing w:before="180" w:after="100" w:afterAutospacing="1"/>
       <w:outlineLvl w:val="2"/>
     </w:pPr>
     <w:rPr>
       <w:b/>
       <w:bCs/>
       <w:color w:val="0F172A"/>
-      <w:sz w:val="26"/>
-      <w:szCs w:val="26"/>
     </w:rPr>
   </w:style>
   <w:style w:type="character" w:default="1" w:styleId="DefaultParagraphFont">
@@ -7544,10 +7197,10 @@
     <w:unhideWhenUsed/>
     <w:pPr>
       <w:pBdr>
-        <w:top w:val="single" w:sz="6" w:space="8" w:color="E2E8F0"/>
-        <w:left w:val="single" w:sz="6" w:space="8" w:color="E2E8F0"/>
-        <w:bottom w:val="single" w:sz="6" w:space="8" w:color="E2E8F0"/>
-        <w:right w:val="single" w:sz="6" w:space="8" w:color="E2E8F0"/>
+        <w:top w:val="single" w:sz="6" w:space="6" w:color="E2E8F0"/>
+        <w:left w:val="single" w:sz="6" w:space="6" w:color="E2E8F0"/>
+        <w:bottom w:val="single" w:sz="6" w:space="6" w:color="E2E8F0"/>
+        <w:right w:val="single" w:sz="6" w:space="6" w:color="E2E8F0"/>
       </w:pBdr>
       <w:shd w:val="clear" w:color="auto" w:fill="F8FAFC"/>
       <w:tabs>
@@ -7568,12 +7221,12 @@
         <w:tab w:val="left" w:pos="13740"/>
         <w:tab w:val="left" w:pos="14656"/>
       </w:tabs>
-      <w:spacing w:before="225" w:after="225"/>
+      <w:spacing w:before="180" w:after="180"/>
     </w:pPr>
     <w:rPr>
       <w:rFonts w:ascii="Courier New" w:hAnsi="Courier New" w:cs="Courier New"/>
-      <w:sz w:val="19"/>
-      <w:szCs w:val="19"/>
+      <w:sz w:val="18"/>
+      <w:szCs w:val="18"/>
     </w:rPr>
   </w:style>
   <w:style w:type="character" w:customStyle="1" w:styleId="HTMLPreformattedChar">
@@ -7590,7 +7243,7 @@
     <w:name w:val="msonormal"/>
     <w:basedOn w:val="Normal"/>
     <w:pPr>
-      <w:spacing w:before="100" w:beforeAutospacing="1" w:after="150"/>
+      <w:spacing w:before="100" w:beforeAutospacing="1" w:after="120"/>
       <w:jc w:val="both"/>
     </w:pPr>
     <w:rPr>
@@ -7605,7 +7258,7 @@
     <w:semiHidden/>
     <w:unhideWhenUsed/>
     <w:pPr>
-      <w:spacing w:before="100" w:beforeAutospacing="1" w:after="150"/>
+      <w:spacing w:before="100" w:beforeAutospacing="1" w:after="120"/>
       <w:jc w:val="both"/>
     </w:pPr>
     <w:rPr>
@@ -7617,7 +7270,7 @@
     <w:name w:val="text-center"/>
     <w:basedOn w:val="Normal"/>
     <w:pPr>
-      <w:spacing w:before="100" w:beforeAutospacing="1" w:after="75"/>
+      <w:spacing w:before="100" w:beforeAutospacing="1" w:after="60"/>
       <w:jc w:val="center"/>
     </w:pPr>
     <w:rPr>
@@ -7629,7 +7282,7 @@
     <w:name w:val="cover-title"/>
     <w:basedOn w:val="Normal"/>
     <w:pPr>
-      <w:spacing w:before="1500" w:after="75"/>
+      <w:spacing w:before="1800" w:after="60"/>
     </w:pPr>
     <w:rPr>
       <w:b/>
@@ -7643,7 +7296,7 @@
     <w:name w:val="cover-subtitle"/>
     <w:basedOn w:val="Normal"/>
     <w:pPr>
-      <w:spacing w:before="225" w:after="2250"/>
+      <w:spacing w:before="225" w:after="1800"/>
     </w:pPr>
     <w:rPr>
       <w:color w:val="475569"/>
@@ -7655,10 +7308,12 @@
     <w:name w:val="cover-details"/>
     <w:basedOn w:val="Normal"/>
     <w:pPr>
-      <w:spacing w:before="1500" w:after="75"/>
+      <w:spacing w:before="1500" w:after="60"/>
     </w:pPr>
     <w:rPr>
       <w:color w:val="64748B"/>
+      <w:sz w:val="22"/>
+      <w:szCs w:val="22"/>
     </w:rPr>
   </w:style>
   <w:style w:type="character" w:styleId="Strong">

</xml_diff>